<commit_message>
Add LoRA, MLflow and POC-to-production bullets to GMU role
Co-Authored-By: Claude Opus 5.5 <noreply@anthropic.com>
Claude-Session: https://claude.ai/code/session_013uu8YLK93nR2ygpNvDWsMr
</commit_message>
<xml_diff>
--- a/resume/Ritesh_Somashekar_AI_ML_Engineer_GMU_Carelon.docx
+++ b/resume/Ritesh_Somashekar_AI_ML_Engineer_GMU_Carelon.docx
@@ -1502,7 +1502,7 @@
           <w:i w:val="0"/>
           <w:sz w:val="22"/>
         </w:rPr>
-        <w:t xml:space="preserve"> models using </w:t>
+        <w:t xml:space="preserve"> and transformer models using </w:t>
       </w:r>
       <w:r>
         <w:rPr>
@@ -1510,7 +1510,7 @@
           <w:i w:val="0"/>
           <w:sz w:val="22"/>
         </w:rPr>
-        <w:t>LoRA</w:t>
+        <w:t>LoRA/PEFT</w:t>
       </w:r>
       <w:r>
         <w:rPr>
@@ -1550,7 +1550,7 @@
           <w:i w:val="0"/>
           <w:sz w:val="22"/>
         </w:rPr>
-        <w:t xml:space="preserve"> within </w:t>
+        <w:t xml:space="preserve"> while keeping accuracy within </w:t>
       </w:r>
       <w:r>
         <w:rPr>
@@ -1566,7 +1566,32 @@
           <w:i w:val="0"/>
           <w:sz w:val="22"/>
         </w:rPr>
-        <w:t xml:space="preserve"> of full-precision accuracy, with experiments tracked in </w:t>
+        <w:t xml:space="preserve"> of full-precision benchmarks.</w:t>
+      </w:r>
+    </w:p>
+    <w:p>
+      <w:pPr>
+        <w:tabs>
+          <w:tab w:pos="475" w:val="left"/>
+        </w:tabs>
+        <w:spacing w:after="20"/>
+        <w:ind w:left="475" w:hanging="331"/>
+        <w:jc w:val="both"/>
+      </w:pPr>
+      <w:r>
+        <w:rPr>
+          <w:sz w:val="22"/>
+        </w:rPr>
+        <w:t>•</w:t>
+        <w:tab/>
+      </w:r>
+      <w:r>
+        <w:rPr>
+          <w:b w:val="0"/>
+          <w:i w:val="0"/>
+          <w:sz w:val="22"/>
+        </w:rPr>
+        <w:t xml:space="preserve">Established </w:t>
       </w:r>
       <w:r>
         <w:rPr>
@@ -1582,7 +1607,32 @@
           <w:i w:val="0"/>
           <w:sz w:val="22"/>
         </w:rPr>
-        <w:t xml:space="preserve"> and models served via </w:t>
+        <w:t xml:space="preserve"> experiment tracking and model registry for LLM and RAG experiments, logging parameters, prompts, and evaluation metrics to make every run reproducible and comparable across model versions.</w:t>
+      </w:r>
+    </w:p>
+    <w:p>
+      <w:pPr>
+        <w:tabs>
+          <w:tab w:pos="475" w:val="left"/>
+        </w:tabs>
+        <w:spacing w:after="20"/>
+        <w:ind w:left="475" w:hanging="331"/>
+        <w:jc w:val="both"/>
+      </w:pPr>
+      <w:r>
+        <w:rPr>
+          <w:sz w:val="22"/>
+        </w:rPr>
+        <w:t>•</w:t>
+        <w:tab/>
+      </w:r>
+      <w:r>
+        <w:rPr>
+          <w:b w:val="0"/>
+          <w:i w:val="0"/>
+          <w:sz w:val="22"/>
+        </w:rPr>
+        <w:t xml:space="preserve">Took models from </w:t>
       </w:r>
       <w:r>
         <w:rPr>
@@ -1590,7 +1640,7 @@
           <w:i w:val="0"/>
           <w:sz w:val="22"/>
         </w:rPr>
-        <w:t>FastAPI</w:t>
+        <w:t>proof of concept to production</w:t>
       </w:r>
       <w:r>
         <w:rPr>
@@ -1598,7 +1648,7 @@
           <w:i w:val="0"/>
           <w:sz w:val="22"/>
         </w:rPr>
-        <w:t xml:space="preserve"> and </w:t>
+        <w:t xml:space="preserve"> by serving them through </w:t>
       </w:r>
       <w:r>
         <w:rPr>
@@ -1606,7 +1656,7 @@
           <w:i w:val="0"/>
           <w:sz w:val="22"/>
         </w:rPr>
-        <w:t>Docker</w:t>
+        <w:t>FastAPI</w:t>
       </w:r>
       <w:r>
         <w:rPr>
@@ -1614,7 +1664,71 @@
           <w:i w:val="0"/>
           <w:sz w:val="22"/>
         </w:rPr>
-        <w:t>.</w:t>
+        <w:t xml:space="preserve"> and </w:t>
+      </w:r>
+      <w:r>
+        <w:rPr>
+          <w:b/>
+          <w:i w:val="0"/>
+          <w:sz w:val="22"/>
+        </w:rPr>
+        <w:t>Docker</w:t>
+      </w:r>
+      <w:r>
+        <w:rPr>
+          <w:b w:val="0"/>
+          <w:i w:val="0"/>
+          <w:sz w:val="22"/>
+        </w:rPr>
+        <w:t xml:space="preserve"> with </w:t>
+      </w:r>
+      <w:r>
+        <w:rPr>
+          <w:b/>
+          <w:i w:val="0"/>
+          <w:sz w:val="22"/>
+        </w:rPr>
+        <w:t>CI/CD</w:t>
+      </w:r>
+      <w:r>
+        <w:rPr>
+          <w:b w:val="0"/>
+          <w:i w:val="0"/>
+          <w:sz w:val="22"/>
+        </w:rPr>
+        <w:t xml:space="preserve">, reducing release cycles from </w:t>
+      </w:r>
+      <w:r>
+        <w:rPr>
+          <w:b/>
+          <w:i w:val="0"/>
+          <w:sz w:val="22"/>
+        </w:rPr>
+        <w:t>2 weeks to 5 days</w:t>
+      </w:r>
+      <w:r>
+        <w:rPr>
+          <w:b w:val="0"/>
+          <w:i w:val="0"/>
+          <w:sz w:val="22"/>
+        </w:rPr>
+        <w:t xml:space="preserve"> and enabling </w:t>
+      </w:r>
+      <w:r>
+        <w:rPr>
+          <w:b/>
+          <w:i w:val="0"/>
+          <w:sz w:val="22"/>
+        </w:rPr>
+        <w:t>A/B testing</w:t>
+      </w:r>
+      <w:r>
+        <w:rPr>
+          <w:b w:val="0"/>
+          <w:i w:val="0"/>
+          <w:sz w:val="22"/>
+        </w:rPr>
+        <w:t xml:space="preserve"> and pre/post-deployment evaluation of model versions.</w:t>
       </w:r>
     </w:p>
     <w:p>

</xml_diff>

<commit_message>
Note MATE-911 publication at IEEE PST and co-development role
Co-Authored-By: Claude Opus 5.5 <noreply@anthropic.com>
Claude-Session: https://claude.ai/code/session_013uu8YLK93nR2ygpNvDWsMr
</commit_message>
<xml_diff>
--- a/resume/Ritesh_Somashekar_AI_ML_Engineer_GMU_Carelon.docx
+++ b/resume/Ritesh_Somashekar_AI_ML_Engineer_GMU_Carelon.docx
@@ -176,6 +176,22 @@
           <w:i w:val="0"/>
           <w:sz w:val="22"/>
         </w:rPr>
+        <w:t xml:space="preserve">, </w:t>
+      </w:r>
+      <w:r>
+        <w:rPr>
+          <w:b/>
+          <w:i w:val="0"/>
+          <w:sz w:val="22"/>
+        </w:rPr>
+        <w:t>IEEE PST 2026</w:t>
+      </w:r>
+      <w:r>
+        <w:rPr>
+          <w:b w:val="0"/>
+          <w:i w:val="0"/>
+          <w:sz w:val="22"/>
+        </w:rPr>
         <w:t xml:space="preserve">) with hands-on expertise in </w:t>
       </w:r>
       <w:r>
@@ -1066,7 +1082,7 @@
           <w:i w:val="0"/>
           <w:sz w:val="22"/>
         </w:rPr>
-        <w:t xml:space="preserve">Developed </w:t>
+        <w:t xml:space="preserve">Co-developed </w:t>
       </w:r>
       <w:r>
         <w:rPr>
@@ -1082,7 +1098,23 @@
           <w:i w:val="0"/>
           <w:sz w:val="22"/>
         </w:rPr>
-        <w:t xml:space="preserve">, a multimodal </w:t>
+        <w:t xml:space="preserve"> (published at </w:t>
+      </w:r>
+      <w:r>
+        <w:rPr>
+          <w:b/>
+          <w:i w:val="0"/>
+          <w:sz w:val="22"/>
+        </w:rPr>
+        <w:t>IEEE PST 2026</w:t>
+      </w:r>
+      <w:r>
+        <w:rPr>
+          <w:b w:val="0"/>
+          <w:i w:val="0"/>
+          <w:sz w:val="22"/>
+        </w:rPr>
+        <w:t xml:space="preserve">), a multimodal </w:t>
       </w:r>
       <w:r>
         <w:rPr>
@@ -2940,7 +2972,23 @@
           <w:i w:val="0"/>
           <w:sz w:val="22"/>
         </w:rPr>
-        <w:t>, and H. Purohit. “MATE-911: Multimodal AI-powered Training Environment for Next-Generation 911 Dispatcher Preparedness.” 2026.</w:t>
+        <w:t xml:space="preserve">, and H. Purohit. “MATE-911: Multimodal AI-powered Training Environment for Next-Generation 911 Dispatcher Preparedness.” In </w:t>
+      </w:r>
+      <w:r>
+        <w:rPr>
+          <w:b w:val="0"/>
+          <w:i/>
+          <w:sz w:val="22"/>
+        </w:rPr>
+        <w:t>IEEE PST Conference</w:t>
+      </w:r>
+      <w:r>
+        <w:rPr>
+          <w:b w:val="0"/>
+          <w:i w:val="0"/>
+          <w:sz w:val="22"/>
+        </w:rPr>
+        <w:t>, 2026.</w:t>
       </w:r>
     </w:p>
     <w:sectPr>

</xml_diff>

<commit_message>
Show leadership of data pipeline and validation layer for SHIELD and MATE-911
Co-Authored-By: Claude Opus 5.5 <noreply@anthropic.com>
Claude-Session: https://claude.ai/code/session_013uu8YLK93nR2ygpNvDWsMr
</commit_message>
<xml_diff>
--- a/resume/Ritesh_Somashekar_AI_ML_Engineer_GMU_Carelon.docx
+++ b/resume/Ritesh_Somashekar_AI_ML_Engineer_GMU_Carelon.docx
@@ -916,11 +916,19 @@
       </w:r>
       <w:r>
         <w:rPr>
+          <w:b/>
+          <w:i w:val="0"/>
+          <w:sz w:val="22"/>
+        </w:rPr>
+        <w:t>Led the data pipeline for both SHIELD and MATE-911</w:t>
+      </w:r>
+      <w:r>
+        <w:rPr>
           <w:b w:val="0"/>
           <w:i w:val="0"/>
           <w:sz w:val="22"/>
         </w:rPr>
-        <w:t xml:space="preserve">Engineered the SHIELD data pipeline in </w:t>
+        <w:t xml:space="preserve"> in </w:t>
       </w:r>
       <w:r>
         <w:rPr>
@@ -936,7 +944,23 @@
           <w:i w:val="0"/>
           <w:sz w:val="22"/>
         </w:rPr>
-        <w:t xml:space="preserve">, covering OCR parsing, abbreviation expansion, completeness checks, segmentation, and standardization of </w:t>
+        <w:t xml:space="preserve">, covering OCR parsing, abbreviation expansion, completeness checks, segmentation, standardization, and </w:t>
+      </w:r>
+      <w:r>
+        <w:rPr>
+          <w:b/>
+          <w:i w:val="0"/>
+          <w:sz w:val="22"/>
+        </w:rPr>
+        <w:t>ChromaDB</w:t>
+      </w:r>
+      <w:r>
+        <w:rPr>
+          <w:b w:val="0"/>
+          <w:i w:val="0"/>
+          <w:sz w:val="22"/>
+        </w:rPr>
+        <w:t xml:space="preserve"> embedding of </w:t>
       </w:r>
       <w:r>
         <w:rPr>
@@ -973,11 +997,19 @@
       </w:r>
       <w:r>
         <w:rPr>
+          <w:b/>
+          <w:i w:val="0"/>
+          <w:sz w:val="22"/>
+        </w:rPr>
+        <w:t>Led the validation layer for both platforms</w:t>
+      </w:r>
+      <w:r>
+        <w:rPr>
           <w:b w:val="0"/>
           <w:i w:val="0"/>
           <w:sz w:val="22"/>
         </w:rPr>
-        <w:t xml:space="preserve">Built a </w:t>
+        <w:t xml:space="preserve">, building a </w:t>
       </w:r>
       <w:r>
         <w:rPr>
@@ -1009,7 +1041,7 @@
           <w:i w:val="0"/>
           <w:sz w:val="22"/>
         </w:rPr>
-        <w:t xml:space="preserve"> standards and DPSC procedures, combining rule-based and </w:t>
+        <w:t xml:space="preserve"> standards and DPSC procedures that combines rule-based and </w:t>
       </w:r>
       <w:r>
         <w:rPr>
@@ -1041,7 +1073,7 @@
           <w:i w:val="0"/>
           <w:sz w:val="22"/>
         </w:rPr>
-        <w:t xml:space="preserve"> with PASS/REVIEW/FAIL confidence scoring and an </w:t>
+        <w:t xml:space="preserve">, with PASS/REVIEW/FAIL confidence scoring and an </w:t>
       </w:r>
       <w:r>
         <w:rPr>

</xml_diff>

<commit_message>
Add SHAP explainability bullet to GMU role
Co-Authored-By: Claude Opus 5.5 <noreply@anthropic.com>
Claude-Session: https://claude.ai/code/session_013uu8YLK93nR2ygpNvDWsMr
</commit_message>
<xml_diff>
--- a/resume/Ritesh_Somashekar_AI_ML_Engineer_GMU_Carelon.docx
+++ b/resume/Ritesh_Somashekar_AI_ML_Engineer_GMU_Carelon.docx
@@ -589,7 +589,7 @@
           <w:i w:val="0"/>
           <w:sz w:val="22"/>
         </w:rPr>
-        <w:t xml:space="preserve"> Supervised &amp; Unsupervised Learning, Transformers, BERT, BioBERT, Hugging Face, XGBoost, LightGBM, Graph Analytics, Ensemble Models, Time Series Forecasting, Anomaly Detection, Feature Engineering</w:t>
+        <w:t xml:space="preserve"> Supervised &amp; Unsupervised Learning, Transformers, BERT, BioBERT, Hugging Face, XGBoost, LightGBM, Graph Analytics, Ensemble Models, Time Series Forecasting, Anomaly Detection, Feature Engineering, Model Explainability (SHAP)</w:t>
       </w:r>
     </w:p>
     <w:p>
@@ -1526,6 +1526,63 @@
           <w:sz w:val="22"/>
         </w:rPr>
         <w:t>.</w:t>
+      </w:r>
+    </w:p>
+    <w:p>
+      <w:pPr>
+        <w:tabs>
+          <w:tab w:pos="475" w:val="left"/>
+        </w:tabs>
+        <w:spacing w:after="20"/>
+        <w:ind w:left="475" w:hanging="331"/>
+        <w:jc w:val="both"/>
+      </w:pPr>
+      <w:r>
+        <w:rPr>
+          <w:sz w:val="22"/>
+        </w:rPr>
+        <w:t>•</w:t>
+        <w:tab/>
+      </w:r>
+      <w:r>
+        <w:rPr>
+          <w:b w:val="0"/>
+          <w:i w:val="0"/>
+          <w:sz w:val="22"/>
+        </w:rPr>
+        <w:t xml:space="preserve">Implemented </w:t>
+      </w:r>
+      <w:r>
+        <w:rPr>
+          <w:b/>
+          <w:i w:val="0"/>
+          <w:sz w:val="22"/>
+        </w:rPr>
+        <w:t>model explainability</w:t>
+      </w:r>
+      <w:r>
+        <w:rPr>
+          <w:b w:val="0"/>
+          <w:i w:val="0"/>
+          <w:sz w:val="22"/>
+        </w:rPr>
+        <w:t xml:space="preserve"> using </w:t>
+      </w:r>
+      <w:r>
+        <w:rPr>
+          <w:b/>
+          <w:i w:val="0"/>
+          <w:sz w:val="22"/>
+        </w:rPr>
+        <w:t>SHAP</w:t>
+      </w:r>
+      <w:r>
+        <w:rPr>
+          <w:b w:val="0"/>
+          <w:i w:val="0"/>
+          <w:sz w:val="22"/>
+        </w:rPr>
+        <w:t xml:space="preserve"> to surface the drivers behind ensemble-model predictions, supporting model governance, risk assessment, and documentation for research stakeholders.</w:t>
       </w:r>
     </w:p>
     <w:p>

</xml_diff>

<commit_message>
Extend SHAP bullet to intent classification and behavioral anomaly detection
Co-Authored-By: Claude Opus 5.5 <noreply@anthropic.com>
Claude-Session: https://claude.ai/code/session_013uu8YLK93nR2ygpNvDWsMr
</commit_message>
<xml_diff>
--- a/resume/Ritesh_Somashekar_AI_ML_Engineer_GMU_Carelon.docx
+++ b/resume/Ritesh_Somashekar_AI_ML_Engineer_GMU_Carelon.docx
@@ -1582,7 +1582,71 @@
           <w:i w:val="0"/>
           <w:sz w:val="22"/>
         </w:rPr>
-        <w:t xml:space="preserve"> to surface the drivers behind ensemble-model predictions, supporting model governance, risk assessment, and documentation for research stakeholders.</w:t>
+        <w:t xml:space="preserve"> for </w:t>
+      </w:r>
+      <w:r>
+        <w:rPr>
+          <w:b/>
+          <w:i w:val="0"/>
+          <w:sz w:val="22"/>
+        </w:rPr>
+        <w:t>intent classification</w:t>
+      </w:r>
+      <w:r>
+        <w:rPr>
+          <w:b w:val="0"/>
+          <w:i w:val="0"/>
+          <w:sz w:val="22"/>
+        </w:rPr>
+        <w:t xml:space="preserve"> and </w:t>
+      </w:r>
+      <w:r>
+        <w:rPr>
+          <w:b/>
+          <w:i w:val="0"/>
+          <w:sz w:val="22"/>
+        </w:rPr>
+        <w:t>behavioral anomaly detection</w:t>
+      </w:r>
+      <w:r>
+        <w:rPr>
+          <w:b w:val="0"/>
+          <w:i w:val="0"/>
+          <w:sz w:val="22"/>
+        </w:rPr>
+        <w:t xml:space="preserve"> models, surfacing the features driving each prediction to guide threshold tuning and model governance; the </w:t>
+      </w:r>
+      <w:r>
+        <w:rPr>
+          <w:b/>
+          <w:i w:val="0"/>
+          <w:sz w:val="22"/>
+        </w:rPr>
+        <w:t>LightGBM</w:t>
+      </w:r>
+      <w:r>
+        <w:rPr>
+          <w:b w:val="0"/>
+          <w:i w:val="0"/>
+          <w:sz w:val="22"/>
+        </w:rPr>
+        <w:t xml:space="preserve"> anomaly detector with threshold-based alerting reduced false positives by </w:t>
+      </w:r>
+      <w:r>
+        <w:rPr>
+          <w:b/>
+          <w:i w:val="0"/>
+          <w:sz w:val="22"/>
+        </w:rPr>
+        <w:t>25%</w:t>
+      </w:r>
+      <w:r>
+        <w:rPr>
+          <w:b w:val="0"/>
+          <w:i w:val="0"/>
+          <w:sz w:val="22"/>
+        </w:rPr>
+        <w:t>.</w:t>
       </w:r>
     </w:p>
     <w:p>

</xml_diff>

<commit_message>
Rename role titles and make GMU/Carelon resume ATS-safe
Titles: AI & ML Research Associate, Machine Learning Engineer, Data Engineer.
ASCII punctuation, graduation date, and document title property for ATS parsing.

Co-Authored-By: Claude Opus 5.5 <noreply@anthropic.com>
Claude-Session: https://claude.ai/code/session_013uu8YLK93nR2ygpNvDWsMr
</commit_message>
<xml_diff>
--- a/resume/Ritesh_Somashekar_AI_ML_Engineer_GMU_Carelon.docx
+++ b/resume/Ritesh_Somashekar_AI_ML_Engineer_GMU_Carelon.docx
@@ -168,7 +168,7 @@
           <w:i w:val="0"/>
           <w:sz w:val="22"/>
         </w:rPr>
-        <w:t>ACM WSDM ’26</w:t>
+        <w:t>ACM WSDM '26</w:t>
       </w:r>
       <w:r>
         <w:rPr>
@@ -710,7 +710,7 @@
           <w:i w:val="0"/>
           <w:sz w:val="22"/>
         </w:rPr>
-        <w:t>Master’s in Data Analytics and Engineering</w:t>
+        <w:t>Master's in Data Analytics and Engineering</w:t>
       </w:r>
       <w:r>
         <w:rPr>
@@ -718,7 +718,7 @@
           <w:i w:val="0"/>
           <w:sz w:val="22"/>
         </w:rPr>
-        <w:t xml:space="preserve"> | George Mason University, Fairfax, VA, USA | GPA: 3.93/4.0</w:t>
+        <w:t xml:space="preserve"> | George Mason University, Fairfax, VA, USA | May 2025 | GPA: 3.93/4.0</w:t>
       </w:r>
     </w:p>
     <w:p>
@@ -732,7 +732,7 @@
           <w:i w:val="0"/>
           <w:sz w:val="22"/>
         </w:rPr>
-        <w:t>Bachelor’s in Information Science and Engineering</w:t>
+        <w:t>Bachelor's in Information Science and Engineering</w:t>
       </w:r>
       <w:r>
         <w:rPr>
@@ -783,14 +783,14 @@
           <w:b/>
           <w:i/>
         </w:rPr>
-        <w:t>Graduate Research Assistant (AI/ML)</w:t>
+        <w:t>AI &amp; ML Research Associate</w:t>
       </w:r>
       <w:r>
         <w:rPr>
           <w:b/>
         </w:rPr>
         <w:tab/>
-        <w:t>Fairfax, VA | August 2024 – Present</w:t>
+        <w:t>Fairfax, VA | August 2024 - Present</w:t>
       </w:r>
     </w:p>
     <w:p>
@@ -887,7 +887,7 @@
           <w:i w:val="0"/>
           <w:sz w:val="22"/>
         </w:rPr>
-        <w:t>ACM WSDM ’26</w:t>
+        <w:t>ACM WSDM '26</w:t>
       </w:r>
       <w:r>
         <w:rPr>
@@ -1941,14 +1941,14 @@
           <w:b/>
           <w:i/>
         </w:rPr>
-        <w:t>Data Engineer</w:t>
+        <w:t>Machine Learning Engineer</w:t>
       </w:r>
       <w:r>
         <w:rPr>
           <w:b/>
         </w:rPr>
         <w:tab/>
-        <w:t>Bengaluru, India | May 2022 – August 2023</w:t>
+        <w:t>Bengaluru, India | May 2022 - August 2023</w:t>
       </w:r>
     </w:p>
     <w:p>
@@ -2672,14 +2672,14 @@
           <w:b/>
           <w:i/>
         </w:rPr>
-        <w:t>Associate Data Analyst</w:t>
+        <w:t>Data Engineer</w:t>
       </w:r>
       <w:r>
         <w:rPr>
           <w:b/>
         </w:rPr>
         <w:tab/>
-        <w:t>Bengaluru, India | October 2020 – April 2022</w:t>
+        <w:t>Bengaluru, India | October 2020 - April 2022</w:t>
       </w:r>
     </w:p>
     <w:p>
@@ -3068,7 +3068,7 @@
           <w:i w:val="0"/>
           <w:sz w:val="22"/>
         </w:rPr>
-        <w:t xml:space="preserve">, K. B. Laskey, L. Wells II, and H. Purohit. “SHIELD: A Framework for Online Conversational AI System for Self-Regulated Learning at Emergency Communications Centers.” In </w:t>
+        <w:t xml:space="preserve">, K. B. Laskey, L. Wells II, and H. Purohit. "SHIELD: A Framework for Online Conversational AI System for Self-Regulated Learning at Emergency Communications Centers." In </w:t>
       </w:r>
       <w:r>
         <w:rPr>
@@ -3076,7 +3076,7 @@
           <w:i/>
           <w:sz w:val="22"/>
         </w:rPr>
-        <w:t>Proceedings of the 19th ACM International Conference on Web Search and Data Mining (WSDM ’26)</w:t>
+        <w:t>Proceedings of the 19th ACM International Conference on Web Search and Data Mining (WSDM '26)</w:t>
       </w:r>
       <w:r>
         <w:rPr>
@@ -3125,7 +3125,7 @@
           <w:i w:val="0"/>
           <w:sz w:val="22"/>
         </w:rPr>
-        <w:t xml:space="preserve">, and H. Purohit. “MATE-911: Multimodal AI-powered Training Environment for Next-Generation 911 Dispatcher Preparedness.” In </w:t>
+        <w:t xml:space="preserve">, and H. Purohit. "MATE-911: Multimodal AI-powered Training Environment for Next-Generation 911 Dispatcher Preparedness." In </w:t>
       </w:r>
       <w:r>
         <w:rPr>

</xml_diff>

<commit_message>
Add LinkedIn URL to contact line and leave graduation dates empty
Co-Authored-By: Claude Opus 5.5 <noreply@anthropic.com>
Claude-Session: https://claude.ai/code/session_013uu8YLK93nR2ygpNvDWsMr
</commit_message>
<xml_diff>
--- a/resume/Ritesh_Somashekar_AI_ML_Engineer_GMU_Carelon.docx
+++ b/resume/Ritesh_Somashekar_AI_ML_Engineer_GMU_Carelon.docx
@@ -32,24 +32,36 @@
       </w:pPr>
       <w:r>
         <w:rPr>
-          <w:sz w:val="24"/>
+          <w:sz w:val="22"/>
         </w:rPr>
         <w:t xml:space="preserve">Fairfax, VA | (571) 245-7770 | </w:t>
       </w:r>
-      <w:r>
-        <w:rPr>
-          <w:color w:val="0563C1"/>
-          <w:sz w:val="24"/>
-          <w:u w:val="single"/>
-        </w:rPr>
-        <w:t>ritesh.chandra33@gmail.com</w:t>
-      </w:r>
-      <w:r>
-        <w:rPr>
-          <w:sz w:val="24"/>
-        </w:rPr>
-        <w:t xml:space="preserve"> | LinkedIn</w:t>
-      </w:r>
+      <w:hyperlink r:id="rId9">
+        <w:r>
+          <w:rPr>
+            <w:color w:val="0563C1"/>
+            <w:u w:val="single"/>
+            <w:sz w:val="22"/>
+          </w:rPr>
+          <w:t>ritesh.chandra33@gmail.com</w:t>
+        </w:r>
+      </w:hyperlink>
+      <w:r>
+        <w:rPr>
+          <w:sz w:val="22"/>
+        </w:rPr>
+        <w:t xml:space="preserve"> | </w:t>
+      </w:r>
+      <w:hyperlink r:id="rId10">
+        <w:r>
+          <w:rPr>
+            <w:color w:val="0563C1"/>
+            <w:u w:val="single"/>
+            <w:sz w:val="22"/>
+          </w:rPr>
+          <w:t>linkedin.com/in/ritesh-somashekar-0497aa182</w:t>
+        </w:r>
+      </w:hyperlink>
     </w:p>
     <w:p>
       <w:pPr>
@@ -718,7 +730,7 @@
           <w:i w:val="0"/>
           <w:sz w:val="22"/>
         </w:rPr>
-        <w:t xml:space="preserve"> | George Mason University, Fairfax, VA, USA | May 2025 | GPA: 3.93/4.0</w:t>
+        <w:t xml:space="preserve"> | George Mason University, Fairfax, VA, USA | GPA: 3.93/4.0</w:t>
       </w:r>
     </w:p>
     <w:p>

</xml_diff>

<commit_message>
Expand RAG experience in GMU role and frame DE to ML to AI progression
Adds retrieval layer, context assembly, knowledge-base, guardrail and RAG
evaluation bullets from SHIELD/MATE-911; trims lower-value bullets to keep
two pages.

Co-Authored-By: Claude Opus 5.5 <noreply@anthropic.com>
Claude-Session: https://claude.ai/code/session_013uu8YLK93nR2ygpNvDWsMr
</commit_message>
<xml_diff>
--- a/resume/Ritesh_Somashekar_AI_ML_Engineer_GMU_Carelon.docx
+++ b/resume/Ritesh_Somashekar_AI_ML_Engineer_GMU_Carelon.docx
@@ -124,7 +124,7 @@
           <w:i w:val="0"/>
           <w:sz w:val="22"/>
         </w:rPr>
-        <w:t xml:space="preserve"> of experience building </w:t>
+        <w:t xml:space="preserve"> of experience progressing from </w:t>
       </w:r>
       <w:r>
         <w:rPr>
@@ -132,7 +132,7 @@
           <w:i w:val="0"/>
           <w:sz w:val="22"/>
         </w:rPr>
-        <w:t>LLM and RAG systems</w:t>
+        <w:t>data engineering</w:t>
       </w:r>
       <w:r>
         <w:rPr>
@@ -140,6 +140,54 @@
           <w:i w:val="0"/>
           <w:sz w:val="22"/>
         </w:rPr>
+        <w:t xml:space="preserve"> to </w:t>
+      </w:r>
+      <w:r>
+        <w:rPr>
+          <w:b/>
+          <w:i w:val="0"/>
+          <w:sz w:val="22"/>
+        </w:rPr>
+        <w:t>machine learning</w:t>
+      </w:r>
+      <w:r>
+        <w:rPr>
+          <w:b w:val="0"/>
+          <w:i w:val="0"/>
+          <w:sz w:val="22"/>
+        </w:rPr>
+        <w:t xml:space="preserve"> and </w:t>
+      </w:r>
+      <w:r>
+        <w:rPr>
+          <w:b/>
+          <w:i w:val="0"/>
+          <w:sz w:val="22"/>
+        </w:rPr>
+        <w:t>Generative AI</w:t>
+      </w:r>
+      <w:r>
+        <w:rPr>
+          <w:b w:val="0"/>
+          <w:i w:val="0"/>
+          <w:sz w:val="22"/>
+        </w:rPr>
+        <w:t xml:space="preserve">, building </w:t>
+      </w:r>
+      <w:r>
+        <w:rPr>
+          <w:b/>
+          <w:i w:val="0"/>
+          <w:sz w:val="22"/>
+        </w:rPr>
+        <w:t>production RAG systems</w:t>
+      </w:r>
+      <w:r>
+        <w:rPr>
+          <w:b w:val="0"/>
+          <w:i w:val="0"/>
+          <w:sz w:val="22"/>
+        </w:rPr>
         <w:t xml:space="preserve">, </w:t>
       </w:r>
       <w:r>
@@ -148,7 +196,7 @@
           <w:i w:val="0"/>
           <w:sz w:val="22"/>
         </w:rPr>
-        <w:t>NLP models</w:t>
+        <w:t>LLM applications</w:t>
       </w:r>
       <w:r>
         <w:rPr>
@@ -172,7 +220,7 @@
           <w:i w:val="0"/>
           <w:sz w:val="22"/>
         </w:rPr>
-        <w:t xml:space="preserve"> across healthcare and public-safety domains. Published researcher (</w:t>
+        <w:t xml:space="preserve"> across healthcare and public safety. Published researcher (</w:t>
       </w:r>
       <w:r>
         <w:rPr>
@@ -212,23 +260,7 @@
           <w:i w:val="0"/>
           <w:sz w:val="22"/>
         </w:rPr>
-        <w:t>Llama 3, ChromaDB, Hugging Face, PyTorch, and Scikit-learn</w:t>
-      </w:r>
-      <w:r>
-        <w:rPr>
-          <w:b w:val="0"/>
-          <w:i w:val="0"/>
-          <w:sz w:val="22"/>
-        </w:rPr>
-        <w:t xml:space="preserve">, and in </w:t>
-      </w:r>
-      <w:r>
-        <w:rPr>
-          <w:b/>
-          <w:i w:val="0"/>
-          <w:sz w:val="22"/>
-        </w:rPr>
-        <w:t>hallucination detection, ontology-based validation, and LLM evaluation</w:t>
+        <w:t>Llama 3, LlamaIndex, ChromaDB, pgvector, FAISS, Hugging Face, and PyTorch</w:t>
       </w:r>
       <w:r>
         <w:rPr>
@@ -414,7 +446,7 @@
           <w:i w:val="0"/>
           <w:sz w:val="22"/>
         </w:rPr>
-        <w:t xml:space="preserve">Demonstrated impact, including a </w:t>
+        <w:t xml:space="preserve">Demonstrated impact, including </w:t>
       </w:r>
       <w:r>
         <w:rPr>
@@ -422,6 +454,22 @@
           <w:i w:val="0"/>
           <w:sz w:val="22"/>
         </w:rPr>
+        <w:t>RAG recall@10 raised from 61% to 88%</w:t>
+      </w:r>
+      <w:r>
+        <w:rPr>
+          <w:b w:val="0"/>
+          <w:i w:val="0"/>
+          <w:sz w:val="22"/>
+        </w:rPr>
+        <w:t xml:space="preserve">, a </w:t>
+      </w:r>
+      <w:r>
+        <w:rPr>
+          <w:b/>
+          <w:i w:val="0"/>
+          <w:sz w:val="22"/>
+        </w:rPr>
         <w:t>0.81 protocol F1 with a 3.0% hallucination rate</w:t>
       </w:r>
       <w:r>
@@ -430,7 +478,7 @@
           <w:i w:val="0"/>
           <w:sz w:val="22"/>
         </w:rPr>
-        <w:t xml:space="preserve"> for RAG-generated scenarios, </w:t>
+        <w:t xml:space="preserve">, </w:t>
       </w:r>
       <w:r>
         <w:rPr>
@@ -547,7 +595,7 @@
           <w:i w:val="0"/>
           <w:sz w:val="22"/>
         </w:rPr>
-        <w:t>Generative AI &amp; LLMs:</w:t>
+        <w:t>RAG &amp; Generative AI:</w:t>
       </w:r>
       <w:r>
         <w:rPr>
@@ -555,7 +603,7 @@
           <w:i w:val="0"/>
           <w:sz w:val="22"/>
         </w:rPr>
-        <w:t xml:space="preserve"> Llama 3/3.1, Ollama, Retrieval-Augmented Generation (RAG), Prompt Engineering, Agentic AI, Vector Databases (ChromaDB, FAISS), Sentence Transformers, LoRA, Quantization-Aware Training (QAT)</w:t>
+        <w:t xml:space="preserve"> Retrieval-Augmented Generation (RAG), Chunking, Embeddings (Sentence Transformers, all-mpnet-base-v2), Metadata Filtering, Top-K Retrieval, Context Assembly, Grounding, LlamaIndex, Vector Databases (ChromaDB, pgvector, FAISS), Llama 3/3.1, Ollama, Prompt Engineering, Agentic AI, LoRA/PEFT, Quantization-Aware Training (QAT)</w:t>
       </w:r>
     </w:p>
     <w:p>
@@ -578,7 +626,7 @@
           <w:i w:val="0"/>
           <w:sz w:val="22"/>
         </w:rPr>
-        <w:t xml:space="preserve"> Hallucination Detection, Ontology-Based Validation, NLI-Based Validation, Semantic Similarity Scoring, Ablation Studies, Protocol F1, Confidence Scoring</w:t>
+        <w:t xml:space="preserve"> RAGAS, Recall@K, Faithfulness, Hallucination Detection, Guardrails, Ontology-Based Validation, NLI-Based Validation, Semantic Similarity Scoring, Ablation Studies, Protocol F1, Confidence Scoring</w:t>
       </w:r>
     </w:p>
     <w:p>
@@ -843,7 +891,7 @@
           <w:i w:val="0"/>
           <w:sz w:val="22"/>
         </w:rPr>
-        <w:t xml:space="preserve">, an online conversational AI training platform for 9-1-1 call-takers built with </w:t>
+        <w:t xml:space="preserve"> (published at </w:t>
       </w:r>
       <w:r>
         <w:rPr>
@@ -851,6 +899,22 @@
           <w:i w:val="0"/>
           <w:sz w:val="22"/>
         </w:rPr>
+        <w:t>ACM WSDM '26</w:t>
+      </w:r>
+      <w:r>
+        <w:rPr>
+          <w:b w:val="0"/>
+          <w:i w:val="0"/>
+          <w:sz w:val="22"/>
+        </w:rPr>
+        <w:t xml:space="preserve">), an online conversational AI training platform for 9-1-1 call-takers built with </w:t>
+      </w:r>
+      <w:r>
+        <w:rPr>
+          <w:b/>
+          <w:i w:val="0"/>
+          <w:sz w:val="22"/>
+        </w:rPr>
         <w:t>Fairfax County DPSC</w:t>
       </w:r>
       <w:r>
@@ -891,23 +955,7 @@
           <w:i w:val="0"/>
           <w:sz w:val="22"/>
         </w:rPr>
-        <w:t xml:space="preserve">, and produce post-call reflection analytics; published at </w:t>
-      </w:r>
-      <w:r>
-        <w:rPr>
-          <w:b/>
-          <w:i w:val="0"/>
-          <w:sz w:val="22"/>
-        </w:rPr>
-        <w:t>ACM WSDM '26</w:t>
-      </w:r>
-      <w:r>
-        <w:rPr>
-          <w:b w:val="0"/>
-          <w:i w:val="0"/>
-          <w:sz w:val="22"/>
-        </w:rPr>
-        <w:t>.</w:t>
+        <w:t>, and produce post-call reflection analytics.</w:t>
       </w:r>
     </w:p>
     <w:p>
@@ -928,11 +976,19 @@
       </w:r>
       <w:r>
         <w:rPr>
+          <w:b w:val="0"/>
+          <w:i w:val="0"/>
+          <w:sz w:val="22"/>
+        </w:rPr>
+        <w:t xml:space="preserve">Co-developed </w:t>
+      </w:r>
+      <w:r>
+        <w:rPr>
           <w:b/>
           <w:i w:val="0"/>
           <w:sz w:val="22"/>
         </w:rPr>
-        <w:t>Led the data pipeline for both SHIELD and MATE-911</w:t>
+        <w:t>MATE-911</w:t>
       </w:r>
       <w:r>
         <w:rPr>
@@ -940,7 +996,7 @@
           <w:i w:val="0"/>
           <w:sz w:val="22"/>
         </w:rPr>
-        <w:t xml:space="preserve"> in </w:t>
+        <w:t xml:space="preserve"> (published at </w:t>
       </w:r>
       <w:r>
         <w:rPr>
@@ -948,7 +1004,7 @@
           <w:i w:val="0"/>
           <w:sz w:val="22"/>
         </w:rPr>
-        <w:t>Python</w:t>
+        <w:t>IEEE PST 2026</w:t>
       </w:r>
       <w:r>
         <w:rPr>
@@ -956,7 +1012,7 @@
           <w:i w:val="0"/>
           <w:sz w:val="22"/>
         </w:rPr>
-        <w:t xml:space="preserve">, covering OCR parsing, abbreviation expansion, completeness checks, segmentation, standardization, and </w:t>
+        <w:t xml:space="preserve">), a multimodal </w:t>
       </w:r>
       <w:r>
         <w:rPr>
@@ -964,7 +1020,7 @@
           <w:i w:val="0"/>
           <w:sz w:val="22"/>
         </w:rPr>
-        <w:t>ChromaDB</w:t>
+        <w:t>RAG</w:t>
       </w:r>
       <w:r>
         <w:rPr>
@@ -972,7 +1028,7 @@
           <w:i w:val="0"/>
           <w:sz w:val="22"/>
         </w:rPr>
-        <w:t xml:space="preserve"> embedding of </w:t>
+        <w:t xml:space="preserve"> system that grounds </w:t>
       </w:r>
       <w:r>
         <w:rPr>
@@ -980,7 +1036,7 @@
           <w:i w:val="0"/>
           <w:sz w:val="22"/>
         </w:rPr>
-        <w:t>160 gold-standard emergency scenarios</w:t>
+        <w:t>Llama 3.1 8B</w:t>
       </w:r>
       <w:r>
         <w:rPr>
@@ -988,7 +1044,55 @@
           <w:i w:val="0"/>
           <w:sz w:val="22"/>
         </w:rPr>
-        <w:t xml:space="preserve"> across accident, fire, medical, and alarm incidents.</w:t>
+        <w:t xml:space="preserve"> generation in validated emergency-response knowledge, producing protocol-compliant voice and text scenarios on commodity hardware with </w:t>
+      </w:r>
+      <w:r>
+        <w:rPr>
+          <w:b/>
+          <w:i w:val="0"/>
+          <w:sz w:val="22"/>
+        </w:rPr>
+        <w:t>0.81 protocol F1</w:t>
+      </w:r>
+      <w:r>
+        <w:rPr>
+          <w:b w:val="0"/>
+          <w:i w:val="0"/>
+          <w:sz w:val="22"/>
+        </w:rPr>
+        <w:t xml:space="preserve">, a </w:t>
+      </w:r>
+      <w:r>
+        <w:rPr>
+          <w:b/>
+          <w:i w:val="0"/>
+          <w:sz w:val="22"/>
+        </w:rPr>
+        <w:t>3.0% hallucination rate</w:t>
+      </w:r>
+      <w:r>
+        <w:rPr>
+          <w:b w:val="0"/>
+          <w:i w:val="0"/>
+          <w:sz w:val="22"/>
+        </w:rPr>
+        <w:t xml:space="preserve">, and a </w:t>
+      </w:r>
+      <w:r>
+        <w:rPr>
+          <w:b/>
+          <w:i w:val="0"/>
+          <w:sz w:val="22"/>
+        </w:rPr>
+        <w:t>97.6% pass rate</w:t>
+      </w:r>
+      <w:r>
+        <w:rPr>
+          <w:b w:val="0"/>
+          <w:i w:val="0"/>
+          <w:sz w:val="22"/>
+        </w:rPr>
+        <w:t>, with no commercial API dependency.</w:t>
       </w:r>
     </w:p>
     <w:p>
@@ -1013,7 +1117,7 @@
           <w:i w:val="0"/>
           <w:sz w:val="22"/>
         </w:rPr>
-        <w:t>Led the validation layer for both platforms</w:t>
+        <w:t>Led the RAG knowledge-base and data pipeline for both platforms</w:t>
       </w:r>
       <w:r>
         <w:rPr>
@@ -1021,7 +1125,7 @@
           <w:i w:val="0"/>
           <w:sz w:val="22"/>
         </w:rPr>
-        <w:t xml:space="preserve">, building a </w:t>
+        <w:t xml:space="preserve"> in </w:t>
       </w:r>
       <w:r>
         <w:rPr>
@@ -1029,7 +1133,7 @@
           <w:i w:val="0"/>
           <w:sz w:val="22"/>
         </w:rPr>
-        <w:t>911 ontology validator</w:t>
+        <w:t>Python</w:t>
       </w:r>
       <w:r>
         <w:rPr>
@@ -1037,7 +1141,7 @@
           <w:i w:val="0"/>
           <w:sz w:val="22"/>
         </w:rPr>
-        <w:t xml:space="preserve"> derived from </w:t>
+        <w:t xml:space="preserve">, covering OCR parsing, abbreviation expansion, completeness checks, segmentation, and standardization of </w:t>
       </w:r>
       <w:r>
         <w:rPr>
@@ -1045,7 +1149,7 @@
           <w:i w:val="0"/>
           <w:sz w:val="22"/>
         </w:rPr>
-        <w:t>NENA</w:t>
+        <w:t>160 gold-standard scenarios</w:t>
       </w:r>
       <w:r>
         <w:rPr>
@@ -1053,7 +1157,7 @@
           <w:i w:val="0"/>
           <w:sz w:val="22"/>
         </w:rPr>
-        <w:t xml:space="preserve"> standards and DPSC procedures that combines rule-based and </w:t>
+        <w:t xml:space="preserve">; the curated knowledge base cut hallucinations from </w:t>
       </w:r>
       <w:r>
         <w:rPr>
@@ -1061,7 +1165,7 @@
           <w:i w:val="0"/>
           <w:sz w:val="22"/>
         </w:rPr>
-        <w:t>LLM-based semantic checks</w:t>
+        <w:t>13.0% to 3.0%</w:t>
       </w:r>
       <w:r>
         <w:rPr>
@@ -1069,39 +1173,7 @@
           <w:i w:val="0"/>
           <w:sz w:val="22"/>
         </w:rPr>
-        <w:t xml:space="preserve"> for unsafe content, protocol compliance, and </w:t>
-      </w:r>
-      <w:r>
-        <w:rPr>
-          <w:b/>
-          <w:i w:val="0"/>
-          <w:sz w:val="22"/>
-        </w:rPr>
-        <w:t>hallucination detection</w:t>
-      </w:r>
-      <w:r>
-        <w:rPr>
-          <w:b w:val="0"/>
-          <w:i w:val="0"/>
-          <w:sz w:val="22"/>
-        </w:rPr>
-        <w:t xml:space="preserve">, with PASS/REVIEW/FAIL confidence scoring and an </w:t>
-      </w:r>
-      <w:r>
-        <w:rPr>
-          <w:b/>
-          <w:i w:val="0"/>
-          <w:sz w:val="22"/>
-        </w:rPr>
-        <w:t>85% cosine-similarity</w:t>
-      </w:r>
-      <w:r>
-        <w:rPr>
-          <w:b w:val="0"/>
-          <w:i w:val="0"/>
-          <w:sz w:val="22"/>
-        </w:rPr>
-        <w:t xml:space="preserve"> quality gate.</w:t>
+        <w:t>.</w:t>
       </w:r>
     </w:p>
     <w:p>
@@ -1126,7 +1198,7 @@
           <w:i w:val="0"/>
           <w:sz w:val="22"/>
         </w:rPr>
-        <w:t xml:space="preserve">Co-developed </w:t>
+        <w:t xml:space="preserve">Built the </w:t>
       </w:r>
       <w:r>
         <w:rPr>
@@ -1134,7 +1206,7 @@
           <w:i w:val="0"/>
           <w:sz w:val="22"/>
         </w:rPr>
-        <w:t>MATE-911</w:t>
+        <w:t>retrieval layer</w:t>
       </w:r>
       <w:r>
         <w:rPr>
@@ -1142,7 +1214,7 @@
           <w:i w:val="0"/>
           <w:sz w:val="22"/>
         </w:rPr>
-        <w:t xml:space="preserve"> (published at </w:t>
+        <w:t xml:space="preserve"> with </w:t>
       </w:r>
       <w:r>
         <w:rPr>
@@ -1150,7 +1222,7 @@
           <w:i w:val="0"/>
           <w:sz w:val="22"/>
         </w:rPr>
-        <w:t>IEEE PST 2026</w:t>
+        <w:t>all-mpnet-base-v2</w:t>
       </w:r>
       <w:r>
         <w:rPr>
@@ -1158,7 +1230,7 @@
           <w:i w:val="0"/>
           <w:sz w:val="22"/>
         </w:rPr>
-        <w:t xml:space="preserve">), a multimodal </w:t>
+        <w:t xml:space="preserve"> (768-dim) embeddings in a </w:t>
       </w:r>
       <w:r>
         <w:rPr>
@@ -1166,7 +1238,7 @@
           <w:i w:val="0"/>
           <w:sz w:val="22"/>
         </w:rPr>
-        <w:t>RAG</w:t>
+        <w:t>ChromaDB HNSW cosine index</w:t>
       </w:r>
       <w:r>
         <w:rPr>
@@ -1174,7 +1246,7 @@
           <w:i w:val="0"/>
           <w:sz w:val="22"/>
         </w:rPr>
-        <w:t xml:space="preserve"> system using </w:t>
+        <w:t xml:space="preserve">, attaching metadata (category, severity, tags, confidence) for </w:t>
       </w:r>
       <w:r>
         <w:rPr>
@@ -1182,7 +1254,7 @@
           <w:i w:val="0"/>
           <w:sz w:val="22"/>
         </w:rPr>
-        <w:t>Llama 3.1 8B (Ollama)</w:t>
+        <w:t>filtered top-K retrieval</w:t>
       </w:r>
       <w:r>
         <w:rPr>
@@ -1190,7 +1262,7 @@
           <w:i w:val="0"/>
           <w:sz w:val="22"/>
         </w:rPr>
-        <w:t xml:space="preserve">, </w:t>
+        <w:t xml:space="preserve"> and a </w:t>
       </w:r>
       <w:r>
         <w:rPr>
@@ -1198,87 +1270,7 @@
           <w:i w:val="0"/>
           <w:sz w:val="22"/>
         </w:rPr>
-        <w:t>ChromaDB</w:t>
-      </w:r>
-      <w:r>
-        <w:rPr>
-          <w:b w:val="0"/>
-          <w:i w:val="0"/>
-          <w:sz w:val="22"/>
-        </w:rPr>
-        <w:t xml:space="preserve">, and </w:t>
-      </w:r>
-      <w:r>
-        <w:rPr>
-          <w:b/>
-          <w:i w:val="0"/>
-          <w:sz w:val="22"/>
-        </w:rPr>
-        <w:t>all-mpnet-base-v2</w:t>
-      </w:r>
-      <w:r>
-        <w:rPr>
-          <w:b w:val="0"/>
-          <w:i w:val="0"/>
-          <w:sz w:val="22"/>
-        </w:rPr>
-        <w:t xml:space="preserve"> embeddings to generate protocol-grounded voice and text scenarios on commodity hardware, achieving </w:t>
-      </w:r>
-      <w:r>
-        <w:rPr>
-          <w:b/>
-          <w:i w:val="0"/>
-          <w:sz w:val="22"/>
-        </w:rPr>
-        <w:t>0.81 protocol F1</w:t>
-      </w:r>
-      <w:r>
-        <w:rPr>
-          <w:b w:val="0"/>
-          <w:i w:val="0"/>
-          <w:sz w:val="22"/>
-        </w:rPr>
-        <w:t xml:space="preserve">, a </w:t>
-      </w:r>
-      <w:r>
-        <w:rPr>
-          <w:b/>
-          <w:i w:val="0"/>
-          <w:sz w:val="22"/>
-        </w:rPr>
-        <w:t>3.0% hallucination rate</w:t>
-      </w:r>
-      <w:r>
-        <w:rPr>
-          <w:b w:val="0"/>
-          <w:i w:val="0"/>
-          <w:sz w:val="22"/>
-        </w:rPr>
-        <w:t xml:space="preserve">, a </w:t>
-      </w:r>
-      <w:r>
-        <w:rPr>
-          <w:b/>
-          <w:i w:val="0"/>
-          <w:sz w:val="22"/>
-        </w:rPr>
-        <w:t>97.6% pass rate</w:t>
-      </w:r>
-      <w:r>
-        <w:rPr>
-          <w:b w:val="0"/>
-          <w:i w:val="0"/>
-          <w:sz w:val="22"/>
-        </w:rPr>
-        <w:t xml:space="preserve">, and </w:t>
-      </w:r>
-      <w:r>
-        <w:rPr>
-          <w:b/>
-          <w:i w:val="0"/>
-          <w:sz w:val="22"/>
-        </w:rPr>
-        <w:t>sub-2-second latency</w:t>
+        <w:t>70% similarity relevance gate</w:t>
       </w:r>
       <w:r>
         <w:rPr>
@@ -1311,7 +1303,7 @@
           <w:i w:val="0"/>
           <w:sz w:val="22"/>
         </w:rPr>
-        <w:t xml:space="preserve">Ran </w:t>
+        <w:t xml:space="preserve">Engineered </w:t>
       </w:r>
       <w:r>
         <w:rPr>
@@ -1319,7 +1311,7 @@
           <w:i w:val="0"/>
           <w:sz w:val="22"/>
         </w:rPr>
-        <w:t>ablation studies</w:t>
+        <w:t>prompt and context assembly</w:t>
       </w:r>
       <w:r>
         <w:rPr>
@@ -1327,7 +1319,7 @@
           <w:i w:val="0"/>
           <w:sz w:val="22"/>
         </w:rPr>
-        <w:t xml:space="preserve"> showing RAG retrieval drives scenario quality (</w:t>
+        <w:t xml:space="preserve"> to ground </w:t>
       </w:r>
       <w:r>
         <w:rPr>
@@ -1335,7 +1327,7 @@
           <w:i w:val="0"/>
           <w:sz w:val="22"/>
         </w:rPr>
-        <w:t>F1 0.81 vs. 0.59</w:t>
+        <w:t>Llama 3.1 8B (Ollama)</w:t>
       </w:r>
       <w:r>
         <w:rPr>
@@ -1343,7 +1335,7 @@
           <w:i w:val="0"/>
           <w:sz w:val="22"/>
         </w:rPr>
-        <w:t xml:space="preserve"> without it) and ontology validation acts as a safety guardrail, cutting hallucinations from </w:t>
+        <w:t xml:space="preserve"> responses in retrieved scenarios, tuning temperature, token budgets, and context windows to reach </w:t>
       </w:r>
       <w:r>
         <w:rPr>
@@ -1351,7 +1343,7 @@
           <w:i w:val="0"/>
           <w:sz w:val="22"/>
         </w:rPr>
-        <w:t>9.5% to 3.0%</w:t>
+        <w:t>960 ms (text)</w:t>
       </w:r>
       <w:r>
         <w:rPr>
@@ -1359,7 +1351,23 @@
           <w:i w:val="0"/>
           <w:sz w:val="22"/>
         </w:rPr>
-        <w:t>.</w:t>
+        <w:t xml:space="preserve"> and </w:t>
+      </w:r>
+      <w:r>
+        <w:rPr>
+          <w:b/>
+          <w:i w:val="0"/>
+          <w:sz w:val="22"/>
+        </w:rPr>
+        <w:t>1.3 s (voice)</w:t>
+      </w:r>
+      <w:r>
+        <w:rPr>
+          <w:b w:val="0"/>
+          <w:i w:val="0"/>
+          <w:sz w:val="22"/>
+        </w:rPr>
+        <w:t xml:space="preserve"> mean latency, with fallback generation for resilience.</w:t>
       </w:r>
     </w:p>
     <w:p>
@@ -1380,11 +1388,19 @@
       </w:r>
       <w:r>
         <w:rPr>
+          <w:b/>
+          <w:i w:val="0"/>
+          <w:sz w:val="22"/>
+        </w:rPr>
+        <w:t>Led the validation layer for both platforms</w:t>
+      </w:r>
+      <w:r>
+        <w:rPr>
           <w:b w:val="0"/>
           <w:i w:val="0"/>
           <w:sz w:val="22"/>
         </w:rPr>
-        <w:t xml:space="preserve">Built real-time </w:t>
+        <w:t xml:space="preserve">, building </w:t>
       </w:r>
       <w:r>
         <w:rPr>
@@ -1392,7 +1408,7 @@
           <w:i w:val="0"/>
           <w:sz w:val="22"/>
         </w:rPr>
-        <w:t>trace-log analytics</w:t>
+        <w:t>RAG guardrails</w:t>
       </w:r>
       <w:r>
         <w:rPr>
@@ -1400,7 +1416,7 @@
           <w:i w:val="0"/>
           <w:sz w:val="22"/>
         </w:rPr>
-        <w:t xml:space="preserve"> (event streams, Task Completion Rate, Average Field Latency, goal-alignment scoring) that feed an instructor </w:t>
+        <w:t xml:space="preserve"> with a </w:t>
       </w:r>
       <w:r>
         <w:rPr>
@@ -1408,7 +1424,7 @@
           <w:i w:val="0"/>
           <w:sz w:val="22"/>
         </w:rPr>
-        <w:t>performance dashboard</w:t>
+        <w:t>911 ontology validator</w:t>
       </w:r>
       <w:r>
         <w:rPr>
@@ -1416,7 +1432,55 @@
           <w:i w:val="0"/>
           <w:sz w:val="22"/>
         </w:rPr>
-        <w:t xml:space="preserve"> for adaptive feedback.</w:t>
+        <w:t xml:space="preserve"> (NENA standards, DPSC procedures), rule-based and </w:t>
+      </w:r>
+      <w:r>
+        <w:rPr>
+          <w:b/>
+          <w:i w:val="0"/>
+          <w:sz w:val="22"/>
+        </w:rPr>
+        <w:t>LLM-based semantic checks</w:t>
+      </w:r>
+      <w:r>
+        <w:rPr>
+          <w:b w:val="0"/>
+          <w:i w:val="0"/>
+          <w:sz w:val="22"/>
+        </w:rPr>
+        <w:t xml:space="preserve">, </w:t>
+      </w:r>
+      <w:r>
+        <w:rPr>
+          <w:b/>
+          <w:i w:val="0"/>
+          <w:sz w:val="22"/>
+        </w:rPr>
+        <w:t>NLI-based hallucination detection</w:t>
+      </w:r>
+      <w:r>
+        <w:rPr>
+          <w:b w:val="0"/>
+          <w:i w:val="0"/>
+          <w:sz w:val="22"/>
+        </w:rPr>
+        <w:t xml:space="preserve">, PASS/REVIEW/FAIL confidence scoring, and an </w:t>
+      </w:r>
+      <w:r>
+        <w:rPr>
+          <w:b/>
+          <w:i w:val="0"/>
+          <w:sz w:val="22"/>
+        </w:rPr>
+        <w:t>85% cosine-similarity</w:t>
+      </w:r>
+      <w:r>
+        <w:rPr>
+          <w:b w:val="0"/>
+          <w:i w:val="0"/>
+          <w:sz w:val="22"/>
+        </w:rPr>
+        <w:t xml:space="preserve"> quality gate.</w:t>
       </w:r>
     </w:p>
     <w:p>
@@ -1441,7 +1505,7 @@
           <w:i w:val="0"/>
           <w:sz w:val="22"/>
         </w:rPr>
-        <w:t xml:space="preserve">Applied </w:t>
+        <w:t xml:space="preserve">Ran </w:t>
       </w:r>
       <w:r>
         <w:rPr>
@@ -1449,7 +1513,7 @@
           <w:i w:val="0"/>
           <w:sz w:val="22"/>
         </w:rPr>
-        <w:t>graph-based analytics</w:t>
+        <w:t>RAG ablation studies</w:t>
       </w:r>
       <w:r>
         <w:rPr>
@@ -1457,6 +1521,22 @@
           <w:i w:val="0"/>
           <w:sz w:val="22"/>
         </w:rPr>
+        <w:t xml:space="preserve"> showing retrieval drives quality (</w:t>
+      </w:r>
+      <w:r>
+        <w:rPr>
+          <w:b/>
+          <w:i w:val="0"/>
+          <w:sz w:val="22"/>
+        </w:rPr>
+        <w:t>F1 0.81 vs. 0.59</w:t>
+      </w:r>
+      <w:r>
+        <w:rPr>
+          <w:b w:val="0"/>
+          <w:i w:val="0"/>
+          <w:sz w:val="22"/>
+        </w:rPr>
         <w:t xml:space="preserve"> and </w:t>
       </w:r>
       <w:r>
@@ -1465,7 +1545,7 @@
           <w:i w:val="0"/>
           <w:sz w:val="22"/>
         </w:rPr>
-        <w:t>ensemble models</w:t>
+        <w:t>97.6% vs. 49.7%</w:t>
       </w:r>
       <w:r>
         <w:rPr>
@@ -1473,7 +1553,7 @@
           <w:i w:val="0"/>
           <w:sz w:val="22"/>
         </w:rPr>
-        <w:t xml:space="preserve"> to large-scale disaster datasets on the </w:t>
+        <w:t xml:space="preserve"> pass rate without it), while ontology validation acts as a safety guardrail that cuts hallucinations from </w:t>
       </w:r>
       <w:r>
         <w:rPr>
@@ -1481,55 +1561,7 @@
           <w:i w:val="0"/>
           <w:sz w:val="22"/>
         </w:rPr>
-        <w:t>ORC Hopper HPC cluster</w:t>
-      </w:r>
-      <w:r>
-        <w:rPr>
-          <w:b w:val="0"/>
-          <w:i w:val="0"/>
-          <w:sz w:val="22"/>
-        </w:rPr>
-        <w:t xml:space="preserve"> to forecast community coping trends with an </w:t>
-      </w:r>
-      <w:r>
-        <w:rPr>
-          <w:b/>
-          <w:i w:val="0"/>
-          <w:sz w:val="22"/>
-        </w:rPr>
-        <w:t>RMSE of 0.89</w:t>
-      </w:r>
-      <w:r>
-        <w:rPr>
-          <w:b w:val="0"/>
-          <w:i w:val="0"/>
-          <w:sz w:val="22"/>
-        </w:rPr>
-        <w:t xml:space="preserve">, visualizing findings in </w:t>
-      </w:r>
-      <w:r>
-        <w:rPr>
-          <w:b/>
-          <w:i w:val="0"/>
-          <w:sz w:val="22"/>
-        </w:rPr>
-        <w:t>R</w:t>
-      </w:r>
-      <w:r>
-        <w:rPr>
-          <w:b w:val="0"/>
-          <w:i w:val="0"/>
-          <w:sz w:val="22"/>
-        </w:rPr>
-        <w:t xml:space="preserve"> and </w:t>
-      </w:r>
-      <w:r>
-        <w:rPr>
-          <w:b/>
-          <w:i w:val="0"/>
-          <w:sz w:val="22"/>
-        </w:rPr>
-        <w:t>Tableau</w:t>
+        <w:t>9.5% to 3.0%</w:t>
       </w:r>
       <w:r>
         <w:rPr>
@@ -1562,7 +1594,7 @@
           <w:i w:val="0"/>
           <w:sz w:val="22"/>
         </w:rPr>
-        <w:t xml:space="preserve">Implemented </w:t>
+        <w:t xml:space="preserve">Developed a </w:t>
       </w:r>
       <w:r>
         <w:rPr>
@@ -1570,7 +1602,7 @@
           <w:i w:val="0"/>
           <w:sz w:val="22"/>
         </w:rPr>
-        <w:t>model explainability</w:t>
+        <w:t>RAG research assistant</w:t>
       </w:r>
       <w:r>
         <w:rPr>
@@ -1578,7 +1610,7 @@
           <w:i w:val="0"/>
           <w:sz w:val="22"/>
         </w:rPr>
-        <w:t xml:space="preserve"> using </w:t>
+        <w:t xml:space="preserve"> with </w:t>
       </w:r>
       <w:r>
         <w:rPr>
@@ -1586,7 +1618,7 @@
           <w:i w:val="0"/>
           <w:sz w:val="22"/>
         </w:rPr>
-        <w:t>SHAP</w:t>
+        <w:t>LlamaIndex</w:t>
       </w:r>
       <w:r>
         <w:rPr>
@@ -1594,7 +1626,7 @@
           <w:i w:val="0"/>
           <w:sz w:val="22"/>
         </w:rPr>
-        <w:t xml:space="preserve"> for </w:t>
+        <w:t xml:space="preserve">, </w:t>
       </w:r>
       <w:r>
         <w:rPr>
@@ -1602,7 +1634,7 @@
           <w:i w:val="0"/>
           <w:sz w:val="22"/>
         </w:rPr>
-        <w:t>intent classification</w:t>
+        <w:t>pgvector</w:t>
       </w:r>
       <w:r>
         <w:rPr>
@@ -1610,7 +1642,7 @@
           <w:i w:val="0"/>
           <w:sz w:val="22"/>
         </w:rPr>
-        <w:t xml:space="preserve"> and </w:t>
+        <w:t xml:space="preserve">, and </w:t>
       </w:r>
       <w:r>
         <w:rPr>
@@ -1618,7 +1650,7 @@
           <w:i w:val="0"/>
           <w:sz w:val="22"/>
         </w:rPr>
-        <w:t>behavioral anomaly detection</w:t>
+        <w:t>FAISS</w:t>
       </w:r>
       <w:r>
         <w:rPr>
@@ -1626,7 +1658,7 @@
           <w:i w:val="0"/>
           <w:sz w:val="22"/>
         </w:rPr>
-        <w:t xml:space="preserve"> models, surfacing the features driving each prediction to guide threshold tuning and model governance; the </w:t>
+        <w:t xml:space="preserve">, optimizing chunking, embeddings, retrieval, and context assembly to raise </w:t>
       </w:r>
       <w:r>
         <w:rPr>
@@ -1634,7 +1666,7 @@
           <w:i w:val="0"/>
           <w:sz w:val="22"/>
         </w:rPr>
-        <w:t>LightGBM</w:t>
+        <w:t>recall@10 from 61% to 88%</w:t>
       </w:r>
       <w:r>
         <w:rPr>
@@ -1642,7 +1674,7 @@
           <w:i w:val="0"/>
           <w:sz w:val="22"/>
         </w:rPr>
-        <w:t xml:space="preserve"> anomaly detector with threshold-based alerting reduced false positives by </w:t>
+        <w:t xml:space="preserve">, evaluated with </w:t>
       </w:r>
       <w:r>
         <w:rPr>
@@ -1650,7 +1682,7 @@
           <w:i w:val="0"/>
           <w:sz w:val="22"/>
         </w:rPr>
-        <w:t>25%</w:t>
+        <w:t>RAGAS</w:t>
       </w:r>
       <w:r>
         <w:rPr>
@@ -1658,7 +1690,39 @@
           <w:i w:val="0"/>
           <w:sz w:val="22"/>
         </w:rPr>
-        <w:t>.</w:t>
+        <w:t xml:space="preserve"> (faithfulness, answer relevance, context precision) and served to </w:t>
+      </w:r>
+      <w:r>
+        <w:rPr>
+          <w:b/>
+          <w:i w:val="0"/>
+          <w:sz w:val="22"/>
+        </w:rPr>
+        <w:t>40+ researchers</w:t>
+      </w:r>
+      <w:r>
+        <w:rPr>
+          <w:b w:val="0"/>
+          <w:i w:val="0"/>
+          <w:sz w:val="22"/>
+        </w:rPr>
+        <w:t xml:space="preserve"> at about </w:t>
+      </w:r>
+      <w:r>
+        <w:rPr>
+          <w:b/>
+          <w:i w:val="0"/>
+          <w:sz w:val="22"/>
+        </w:rPr>
+        <w:t>190 ms p95</w:t>
+      </w:r>
+      <w:r>
+        <w:rPr>
+          <w:b w:val="0"/>
+          <w:i w:val="0"/>
+          <w:sz w:val="22"/>
+        </w:rPr>
+        <w:t xml:space="preserve"> latency.</w:t>
       </w:r>
     </w:p>
     <w:p>
@@ -1683,7 +1747,7 @@
           <w:i w:val="0"/>
           <w:sz w:val="22"/>
         </w:rPr>
-        <w:t xml:space="preserve">Fine-tuned </w:t>
+        <w:t xml:space="preserve">Applied </w:t>
       </w:r>
       <w:r>
         <w:rPr>
@@ -1691,7 +1755,7 @@
           <w:i w:val="0"/>
           <w:sz w:val="22"/>
         </w:rPr>
-        <w:t>Llama 3</w:t>
+        <w:t>graph-based analytics</w:t>
       </w:r>
       <w:r>
         <w:rPr>
@@ -1699,7 +1763,7 @@
           <w:i w:val="0"/>
           <w:sz w:val="22"/>
         </w:rPr>
-        <w:t xml:space="preserve"> and transformer models using </w:t>
+        <w:t xml:space="preserve"> and </w:t>
       </w:r>
       <w:r>
         <w:rPr>
@@ -1707,7 +1771,7 @@
           <w:i w:val="0"/>
           <w:sz w:val="22"/>
         </w:rPr>
-        <w:t>LoRA/PEFT</w:t>
+        <w:t>ensemble models</w:t>
       </w:r>
       <w:r>
         <w:rPr>
@@ -1715,6 +1779,54 @@
           <w:i w:val="0"/>
           <w:sz w:val="22"/>
         </w:rPr>
+        <w:t xml:space="preserve"> to large-scale disaster datasets on the </w:t>
+      </w:r>
+      <w:r>
+        <w:rPr>
+          <w:b/>
+          <w:i w:val="0"/>
+          <w:sz w:val="22"/>
+        </w:rPr>
+        <w:t>ORC Hopper HPC cluster</w:t>
+      </w:r>
+      <w:r>
+        <w:rPr>
+          <w:b w:val="0"/>
+          <w:i w:val="0"/>
+          <w:sz w:val="22"/>
+        </w:rPr>
+        <w:t xml:space="preserve"> to forecast community coping trends with an </w:t>
+      </w:r>
+      <w:r>
+        <w:rPr>
+          <w:b/>
+          <w:i w:val="0"/>
+          <w:sz w:val="22"/>
+        </w:rPr>
+        <w:t>RMSE of 0.89</w:t>
+      </w:r>
+      <w:r>
+        <w:rPr>
+          <w:b w:val="0"/>
+          <w:i w:val="0"/>
+          <w:sz w:val="22"/>
+        </w:rPr>
+        <w:t xml:space="preserve">, visualizing findings in </w:t>
+      </w:r>
+      <w:r>
+        <w:rPr>
+          <w:b/>
+          <w:i w:val="0"/>
+          <w:sz w:val="22"/>
+        </w:rPr>
+        <w:t>R</w:t>
+      </w:r>
+      <w:r>
+        <w:rPr>
+          <w:b w:val="0"/>
+          <w:i w:val="0"/>
+          <w:sz w:val="22"/>
+        </w:rPr>
         <w:t xml:space="preserve"> and </w:t>
       </w:r>
       <w:r>
@@ -1723,7 +1835,7 @@
           <w:i w:val="0"/>
           <w:sz w:val="22"/>
         </w:rPr>
-        <w:t>Quantization-Aware Training (QAT)</w:t>
+        <w:t>Tableau</w:t>
       </w:r>
       <w:r>
         <w:rPr>
@@ -1731,39 +1843,7 @@
           <w:i w:val="0"/>
           <w:sz w:val="22"/>
         </w:rPr>
-        <w:t xml:space="preserve">, reducing model size by </w:t>
-      </w:r>
-      <w:r>
-        <w:rPr>
-          <w:b/>
-          <w:i w:val="0"/>
-          <w:sz w:val="22"/>
-        </w:rPr>
-        <w:t>40%</w:t>
-      </w:r>
-      <w:r>
-        <w:rPr>
-          <w:b w:val="0"/>
-          <w:i w:val="0"/>
-          <w:sz w:val="22"/>
-        </w:rPr>
-        <w:t xml:space="preserve"> while keeping accuracy within </w:t>
-      </w:r>
-      <w:r>
-        <w:rPr>
-          <w:b/>
-          <w:i w:val="0"/>
-          <w:sz w:val="22"/>
-        </w:rPr>
-        <w:t>3%</w:t>
-      </w:r>
-      <w:r>
-        <w:rPr>
-          <w:b w:val="0"/>
-          <w:i w:val="0"/>
-          <w:sz w:val="22"/>
-        </w:rPr>
-        <w:t xml:space="preserve"> of full-precision benchmarks.</w:t>
+        <w:t>.</w:t>
       </w:r>
     </w:p>
     <w:p>
@@ -1788,7 +1868,7 @@
           <w:i w:val="0"/>
           <w:sz w:val="22"/>
         </w:rPr>
-        <w:t xml:space="preserve">Established </w:t>
+        <w:t xml:space="preserve">Implemented </w:t>
       </w:r>
       <w:r>
         <w:rPr>
@@ -1796,7 +1876,7 @@
           <w:i w:val="0"/>
           <w:sz w:val="22"/>
         </w:rPr>
-        <w:t>MLflow</w:t>
+        <w:t>model explainability</w:t>
       </w:r>
       <w:r>
         <w:rPr>
@@ -1804,7 +1884,87 @@
           <w:i w:val="0"/>
           <w:sz w:val="22"/>
         </w:rPr>
-        <w:t xml:space="preserve"> experiment tracking and model registry for LLM and RAG experiments, logging parameters, prompts, and evaluation metrics to make every run reproducible and comparable across model versions.</w:t>
+        <w:t xml:space="preserve"> using </w:t>
+      </w:r>
+      <w:r>
+        <w:rPr>
+          <w:b/>
+          <w:i w:val="0"/>
+          <w:sz w:val="22"/>
+        </w:rPr>
+        <w:t>SHAP</w:t>
+      </w:r>
+      <w:r>
+        <w:rPr>
+          <w:b w:val="0"/>
+          <w:i w:val="0"/>
+          <w:sz w:val="22"/>
+        </w:rPr>
+        <w:t xml:space="preserve"> for </w:t>
+      </w:r>
+      <w:r>
+        <w:rPr>
+          <w:b/>
+          <w:i w:val="0"/>
+          <w:sz w:val="22"/>
+        </w:rPr>
+        <w:t>intent classification</w:t>
+      </w:r>
+      <w:r>
+        <w:rPr>
+          <w:b w:val="0"/>
+          <w:i w:val="0"/>
+          <w:sz w:val="22"/>
+        </w:rPr>
+        <w:t xml:space="preserve"> and </w:t>
+      </w:r>
+      <w:r>
+        <w:rPr>
+          <w:b/>
+          <w:i w:val="0"/>
+          <w:sz w:val="22"/>
+        </w:rPr>
+        <w:t>behavioral anomaly detection</w:t>
+      </w:r>
+      <w:r>
+        <w:rPr>
+          <w:b w:val="0"/>
+          <w:i w:val="0"/>
+          <w:sz w:val="22"/>
+        </w:rPr>
+        <w:t xml:space="preserve"> models, guiding threshold tuning and model governance; the </w:t>
+      </w:r>
+      <w:r>
+        <w:rPr>
+          <w:b/>
+          <w:i w:val="0"/>
+          <w:sz w:val="22"/>
+        </w:rPr>
+        <w:t>LightGBM</w:t>
+      </w:r>
+      <w:r>
+        <w:rPr>
+          <w:b w:val="0"/>
+          <w:i w:val="0"/>
+          <w:sz w:val="22"/>
+        </w:rPr>
+        <w:t xml:space="preserve"> anomaly detector reduced false positives by </w:t>
+      </w:r>
+      <w:r>
+        <w:rPr>
+          <w:b/>
+          <w:i w:val="0"/>
+          <w:sz w:val="22"/>
+        </w:rPr>
+        <w:t>25%</w:t>
+      </w:r>
+      <w:r>
+        <w:rPr>
+          <w:b w:val="0"/>
+          <w:i w:val="0"/>
+          <w:sz w:val="22"/>
+        </w:rPr>
+        <w:t>.</w:t>
       </w:r>
     </w:p>
     <w:p>
@@ -1829,7 +1989,7 @@
           <w:i w:val="0"/>
           <w:sz w:val="22"/>
         </w:rPr>
-        <w:t xml:space="preserve">Took models from </w:t>
+        <w:t xml:space="preserve">Fine-tuned </w:t>
       </w:r>
       <w:r>
         <w:rPr>
@@ -1837,7 +1997,7 @@
           <w:i w:val="0"/>
           <w:sz w:val="22"/>
         </w:rPr>
-        <w:t>proof of concept to production</w:t>
+        <w:t>Llama 3</w:t>
       </w:r>
       <w:r>
         <w:rPr>
@@ -1845,7 +2005,7 @@
           <w:i w:val="0"/>
           <w:sz w:val="22"/>
         </w:rPr>
-        <w:t xml:space="preserve"> by serving them through </w:t>
+        <w:t xml:space="preserve"> and transformer models using </w:t>
       </w:r>
       <w:r>
         <w:rPr>
@@ -1853,7 +2013,7 @@
           <w:i w:val="0"/>
           <w:sz w:val="22"/>
         </w:rPr>
-        <w:t>FastAPI</w:t>
+        <w:t>LoRA/PEFT</w:t>
       </w:r>
       <w:r>
         <w:rPr>
@@ -1869,7 +2029,7 @@
           <w:i w:val="0"/>
           <w:sz w:val="22"/>
         </w:rPr>
-        <w:t>Docker</w:t>
+        <w:t>Quantization-Aware Training (QAT)</w:t>
       </w:r>
       <w:r>
         <w:rPr>
@@ -1877,7 +2037,7 @@
           <w:i w:val="0"/>
           <w:sz w:val="22"/>
         </w:rPr>
-        <w:t xml:space="preserve"> with </w:t>
+        <w:t xml:space="preserve">, reducing model size by </w:t>
       </w:r>
       <w:r>
         <w:rPr>
@@ -1885,7 +2045,7 @@
           <w:i w:val="0"/>
           <w:sz w:val="22"/>
         </w:rPr>
-        <w:t>CI/CD</w:t>
+        <w:t>40%</w:t>
       </w:r>
       <w:r>
         <w:rPr>
@@ -1893,7 +2053,7 @@
           <w:i w:val="0"/>
           <w:sz w:val="22"/>
         </w:rPr>
-        <w:t xml:space="preserve">, reducing release cycles from </w:t>
+        <w:t xml:space="preserve"> while keeping accuracy within </w:t>
       </w:r>
       <w:r>
         <w:rPr>
@@ -1901,7 +2061,7 @@
           <w:i w:val="0"/>
           <w:sz w:val="22"/>
         </w:rPr>
-        <w:t>2 weeks to 5 days</w:t>
+        <w:t>3%</w:t>
       </w:r>
       <w:r>
         <w:rPr>
@@ -1909,58 +2069,7 @@
           <w:i w:val="0"/>
           <w:sz w:val="22"/>
         </w:rPr>
-        <w:t xml:space="preserve"> and enabling </w:t>
-      </w:r>
-      <w:r>
-        <w:rPr>
-          <w:b/>
-          <w:i w:val="0"/>
-          <w:sz w:val="22"/>
-        </w:rPr>
-        <w:t>A/B testing</w:t>
-      </w:r>
-      <w:r>
-        <w:rPr>
-          <w:b w:val="0"/>
-          <w:i w:val="0"/>
-          <w:sz w:val="22"/>
-        </w:rPr>
-        <w:t xml:space="preserve"> and pre/post-deployment evaluation of model versions.</w:t>
-      </w:r>
-    </w:p>
-    <w:p>
-      <w:pPr>
-        <w:tabs>
-          <w:tab w:pos="11592" w:val="right"/>
-        </w:tabs>
-        <w:spacing w:before="120" w:after="40"/>
-      </w:pPr>
-      <w:r>
-        <w:rPr>
-          <w:b/>
-          <w:sz w:val="24"/>
-        </w:rPr>
-        <w:t xml:space="preserve">Carelon Global Solutions (Elevance Health) </w:t>
-      </w:r>
-      <w:r>
-        <w:rPr>
-          <w:b/>
-        </w:rPr>
-        <w:t xml:space="preserve">| </w:t>
-      </w:r>
-      <w:r>
-        <w:rPr>
-          <w:b/>
-          <w:i/>
-        </w:rPr>
-        <w:t>Machine Learning Engineer</w:t>
-      </w:r>
-      <w:r>
-        <w:rPr>
-          <w:b/>
-        </w:rPr>
-        <w:tab/>
-        <w:t>Bengaluru, India | May 2022 - August 2023</w:t>
+        <w:t xml:space="preserve"> of full-precision benchmarks.</w:t>
       </w:r>
     </w:p>
     <w:p>
@@ -1985,7 +2094,7 @@
           <w:i w:val="0"/>
           <w:sz w:val="22"/>
         </w:rPr>
-        <w:t xml:space="preserve">Designed and managed </w:t>
+        <w:t xml:space="preserve">Took models and RAG services from </w:t>
       </w:r>
       <w:r>
         <w:rPr>
@@ -1993,7 +2102,7 @@
           <w:i w:val="0"/>
           <w:sz w:val="22"/>
         </w:rPr>
-        <w:t>20+ enterprise ETL pipelines</w:t>
+        <w:t>proof of concept to production</w:t>
       </w:r>
       <w:r>
         <w:rPr>
@@ -2001,7 +2110,7 @@
           <w:i w:val="0"/>
           <w:sz w:val="22"/>
         </w:rPr>
-        <w:t xml:space="preserve">, boosting data throughput by </w:t>
+        <w:t xml:space="preserve"> with </w:t>
       </w:r>
       <w:r>
         <w:rPr>
@@ -2009,7 +2118,7 @@
           <w:i w:val="0"/>
           <w:sz w:val="22"/>
         </w:rPr>
-        <w:t>70%</w:t>
+        <w:t>MLflow</w:t>
       </w:r>
       <w:r>
         <w:rPr>
@@ -2017,7 +2126,122 @@
           <w:i w:val="0"/>
           <w:sz w:val="22"/>
         </w:rPr>
-        <w:t xml:space="preserve"> and ensuring high availability for downstream AI/BI applications.</w:t>
+        <w:t xml:space="preserve"> experiment tracking and model registry, </w:t>
+      </w:r>
+      <w:r>
+        <w:rPr>
+          <w:b/>
+          <w:i w:val="0"/>
+          <w:sz w:val="22"/>
+        </w:rPr>
+        <w:t>FastAPI</w:t>
+      </w:r>
+      <w:r>
+        <w:rPr>
+          <w:b w:val="0"/>
+          <w:i w:val="0"/>
+          <w:sz w:val="22"/>
+        </w:rPr>
+        <w:t xml:space="preserve">, </w:t>
+      </w:r>
+      <w:r>
+        <w:rPr>
+          <w:b/>
+          <w:i w:val="0"/>
+          <w:sz w:val="22"/>
+        </w:rPr>
+        <w:t>Docker</w:t>
+      </w:r>
+      <w:r>
+        <w:rPr>
+          <w:b w:val="0"/>
+          <w:i w:val="0"/>
+          <w:sz w:val="22"/>
+        </w:rPr>
+        <w:t xml:space="preserve">, and </w:t>
+      </w:r>
+      <w:r>
+        <w:rPr>
+          <w:b/>
+          <w:i w:val="0"/>
+          <w:sz w:val="22"/>
+        </w:rPr>
+        <w:t>CI/CD</w:t>
+      </w:r>
+      <w:r>
+        <w:rPr>
+          <w:b w:val="0"/>
+          <w:i w:val="0"/>
+          <w:sz w:val="22"/>
+        </w:rPr>
+        <w:t xml:space="preserve">, reducing release cycles from </w:t>
+      </w:r>
+      <w:r>
+        <w:rPr>
+          <w:b/>
+          <w:i w:val="0"/>
+          <w:sz w:val="22"/>
+        </w:rPr>
+        <w:t>2 weeks to 5 days</w:t>
+      </w:r>
+      <w:r>
+        <w:rPr>
+          <w:b w:val="0"/>
+          <w:i w:val="0"/>
+          <w:sz w:val="22"/>
+        </w:rPr>
+        <w:t xml:space="preserve"> and enabling </w:t>
+      </w:r>
+      <w:r>
+        <w:rPr>
+          <w:b/>
+          <w:i w:val="0"/>
+          <w:sz w:val="22"/>
+        </w:rPr>
+        <w:t>A/B testing</w:t>
+      </w:r>
+      <w:r>
+        <w:rPr>
+          <w:b w:val="0"/>
+          <w:i w:val="0"/>
+          <w:sz w:val="22"/>
+        </w:rPr>
+        <w:t xml:space="preserve"> of model and prompt versions.</w:t>
+      </w:r>
+    </w:p>
+    <w:p>
+      <w:pPr>
+        <w:tabs>
+          <w:tab w:pos="11592" w:val="right"/>
+        </w:tabs>
+        <w:spacing w:before="120" w:after="40"/>
+      </w:pPr>
+      <w:r>
+        <w:rPr>
+          <w:b/>
+          <w:sz w:val="24"/>
+        </w:rPr>
+        <w:t xml:space="preserve">Carelon Global Solutions (Elevance Health) </w:t>
+      </w:r>
+      <w:r>
+        <w:rPr>
+          <w:b/>
+        </w:rPr>
+        <w:t xml:space="preserve">| </w:t>
+      </w:r>
+      <w:r>
+        <w:rPr>
+          <w:b/>
+          <w:i/>
+        </w:rPr>
+        <w:t>Machine Learning Engineer</w:t>
+      </w:r>
+      <w:r>
+        <w:rPr>
+          <w:b/>
+        </w:rPr>
+        <w:tab/>
+        <w:t>Bengaluru, India | May 2022 - August 2023</w:t>
       </w:r>
     </w:p>
     <w:p>
@@ -2042,7 +2266,7 @@
           <w:i w:val="0"/>
           <w:sz w:val="22"/>
         </w:rPr>
-        <w:t xml:space="preserve">Automated workflows with </w:t>
+        <w:t xml:space="preserve">Designed and managed </w:t>
       </w:r>
       <w:r>
         <w:rPr>
@@ -2050,7 +2274,7 @@
           <w:i w:val="0"/>
           <w:sz w:val="22"/>
         </w:rPr>
-        <w:t>Apache Airflow, Python,</w:t>
+        <w:t>20+ enterprise ETL pipelines</w:t>
       </w:r>
       <w:r>
         <w:rPr>
@@ -2058,7 +2282,7 @@
           <w:i w:val="0"/>
           <w:sz w:val="22"/>
         </w:rPr>
-        <w:t xml:space="preserve"> and </w:t>
+        <w:t xml:space="preserve">, boosting data throughput by </w:t>
       </w:r>
       <w:r>
         <w:rPr>
@@ -2066,7 +2290,7 @@
           <w:i w:val="0"/>
           <w:sz w:val="22"/>
         </w:rPr>
-        <w:t>AWS (S3, Lambda, Athena)</w:t>
+        <w:t>70%</w:t>
       </w:r>
       <w:r>
         <w:rPr>
@@ -2074,23 +2298,7 @@
           <w:i w:val="0"/>
           <w:sz w:val="22"/>
         </w:rPr>
-        <w:t xml:space="preserve">, achieving </w:t>
-      </w:r>
-      <w:r>
-        <w:rPr>
-          <w:b/>
-          <w:i w:val="0"/>
-          <w:sz w:val="22"/>
-        </w:rPr>
-        <w:t>99.9% pipeline reliability</w:t>
-      </w:r>
-      <w:r>
-        <w:rPr>
-          <w:b w:val="0"/>
-          <w:i w:val="0"/>
-          <w:sz w:val="22"/>
-        </w:rPr>
-        <w:t xml:space="preserve"> with end-to-end lineage tracking.</w:t>
+        <w:t xml:space="preserve"> and ensuring high availability for downstream AI/BI applications.</w:t>
       </w:r>
     </w:p>
     <w:p>
@@ -2115,7 +2323,7 @@
           <w:i w:val="0"/>
           <w:sz w:val="22"/>
         </w:rPr>
-        <w:t xml:space="preserve">Built a daily ingestion workflow from </w:t>
+        <w:t xml:space="preserve">Automated workflows with </w:t>
       </w:r>
       <w:r>
         <w:rPr>
@@ -2123,7 +2331,7 @@
           <w:i w:val="0"/>
           <w:sz w:val="22"/>
         </w:rPr>
-        <w:t>NPPES</w:t>
+        <w:t>Apache Airflow, Python,</w:t>
       </w:r>
       <w:r>
         <w:rPr>
@@ -2131,7 +2339,7 @@
           <w:i w:val="0"/>
           <w:sz w:val="22"/>
         </w:rPr>
-        <w:t xml:space="preserve"> repositories, improving data accuracy by </w:t>
+        <w:t xml:space="preserve"> and </w:t>
       </w:r>
       <w:r>
         <w:rPr>
@@ -2139,7 +2347,7 @@
           <w:i w:val="0"/>
           <w:sz w:val="22"/>
         </w:rPr>
-        <w:t>74%</w:t>
+        <w:t>AWS (S3, Lambda, Athena)</w:t>
       </w:r>
       <w:r>
         <w:rPr>
@@ -2147,7 +2355,7 @@
           <w:i w:val="0"/>
           <w:sz w:val="22"/>
         </w:rPr>
-        <w:t xml:space="preserve"> and cutting processing overhead by </w:t>
+        <w:t xml:space="preserve">, achieving </w:t>
       </w:r>
       <w:r>
         <w:rPr>
@@ -2155,7 +2363,7 @@
           <w:i w:val="0"/>
           <w:sz w:val="22"/>
         </w:rPr>
-        <w:t>60%</w:t>
+        <w:t>99.9% pipeline reliability</w:t>
       </w:r>
       <w:r>
         <w:rPr>
@@ -2163,7 +2371,7 @@
           <w:i w:val="0"/>
           <w:sz w:val="22"/>
         </w:rPr>
-        <w:t>.</w:t>
+        <w:t xml:space="preserve"> with end-to-end lineage tracking.</w:t>
       </w:r>
     </w:p>
     <w:p>
@@ -2188,7 +2396,7 @@
           <w:i w:val="0"/>
           <w:sz w:val="22"/>
         </w:rPr>
-        <w:t xml:space="preserve">Engineered ingestion pipelines for </w:t>
+        <w:t xml:space="preserve">Built a daily ingestion workflow from </w:t>
       </w:r>
       <w:r>
         <w:rPr>
@@ -2196,7 +2404,7 @@
           <w:i w:val="0"/>
           <w:sz w:val="22"/>
         </w:rPr>
-        <w:t>400K+ XML/JSON healthcare records</w:t>
+        <w:t>NPPES</w:t>
       </w:r>
       <w:r>
         <w:rPr>
@@ -2204,7 +2412,7 @@
           <w:i w:val="0"/>
           <w:sz w:val="22"/>
         </w:rPr>
-        <w:t xml:space="preserve"> into </w:t>
+        <w:t xml:space="preserve"> repositories, improving data accuracy by </w:t>
       </w:r>
       <w:r>
         <w:rPr>
@@ -2212,7 +2420,7 @@
           <w:i w:val="0"/>
           <w:sz w:val="22"/>
         </w:rPr>
-        <w:t>Snowflake</w:t>
+        <w:t>74%</w:t>
       </w:r>
       <w:r>
         <w:rPr>
@@ -2220,7 +2428,7 @@
           <w:i w:val="0"/>
           <w:sz w:val="22"/>
         </w:rPr>
-        <w:t xml:space="preserve"> and </w:t>
+        <w:t xml:space="preserve"> and cutting processing overhead by </w:t>
       </w:r>
       <w:r>
         <w:rPr>
@@ -2228,39 +2436,7 @@
           <w:i w:val="0"/>
           <w:sz w:val="22"/>
         </w:rPr>
-        <w:t>Databricks</w:t>
-      </w:r>
-      <w:r>
-        <w:rPr>
-          <w:b w:val="0"/>
-          <w:i w:val="0"/>
-          <w:sz w:val="22"/>
-        </w:rPr>
-        <w:t xml:space="preserve">, accelerating model training by </w:t>
-      </w:r>
-      <w:r>
-        <w:rPr>
-          <w:b/>
-          <w:i w:val="0"/>
-          <w:sz w:val="22"/>
-        </w:rPr>
         <w:t>60%</w:t>
-      </w:r>
-      <w:r>
-        <w:rPr>
-          <w:b w:val="0"/>
-          <w:i w:val="0"/>
-          <w:sz w:val="22"/>
-        </w:rPr>
-        <w:t xml:space="preserve"> and reducing preprocessing time by </w:t>
-      </w:r>
-      <w:r>
-        <w:rPr>
-          <w:b/>
-          <w:i w:val="0"/>
-          <w:sz w:val="22"/>
-        </w:rPr>
-        <w:t>70%</w:t>
       </w:r>
       <w:r>
         <w:rPr>
@@ -2293,7 +2469,7 @@
           <w:i w:val="0"/>
           <w:sz w:val="22"/>
         </w:rPr>
-        <w:t xml:space="preserve">Built NLP models using </w:t>
+        <w:t xml:space="preserve">Engineered ingestion pipelines for </w:t>
       </w:r>
       <w:r>
         <w:rPr>
@@ -2301,7 +2477,7 @@
           <w:i w:val="0"/>
           <w:sz w:val="22"/>
         </w:rPr>
-        <w:t>BERT</w:t>
+        <w:t>400K+ XML/JSON healthcare records</w:t>
       </w:r>
       <w:r>
         <w:rPr>
@@ -2309,6 +2485,22 @@
           <w:i w:val="0"/>
           <w:sz w:val="22"/>
         </w:rPr>
+        <w:t xml:space="preserve"> into </w:t>
+      </w:r>
+      <w:r>
+        <w:rPr>
+          <w:b/>
+          <w:i w:val="0"/>
+          <w:sz w:val="22"/>
+        </w:rPr>
+        <w:t>Snowflake</w:t>
+      </w:r>
+      <w:r>
+        <w:rPr>
+          <w:b w:val="0"/>
+          <w:i w:val="0"/>
+          <w:sz w:val="22"/>
+        </w:rPr>
         <w:t xml:space="preserve"> and </w:t>
       </w:r>
       <w:r>
@@ -2317,7 +2509,7 @@
           <w:i w:val="0"/>
           <w:sz w:val="22"/>
         </w:rPr>
-        <w:t>BioBERT</w:t>
+        <w:t>Databricks</w:t>
       </w:r>
       <w:r>
         <w:rPr>
@@ -2325,7 +2517,7 @@
           <w:i w:val="0"/>
           <w:sz w:val="22"/>
         </w:rPr>
-        <w:t xml:space="preserve"> for clinical entity extraction from unstructured medical text, achieving </w:t>
+        <w:t xml:space="preserve">, accelerating model training by </w:t>
       </w:r>
       <w:r>
         <w:rPr>
@@ -2333,7 +2525,7 @@
           <w:i w:val="0"/>
           <w:sz w:val="22"/>
         </w:rPr>
-        <w:t>80% accuracy</w:t>
+        <w:t>60%</w:t>
       </w:r>
       <w:r>
         <w:rPr>
@@ -2341,7 +2533,7 @@
           <w:i w:val="0"/>
           <w:sz w:val="22"/>
         </w:rPr>
-        <w:t xml:space="preserve"> and reducing processing time by </w:t>
+        <w:t xml:space="preserve"> and reducing preprocessing time by </w:t>
       </w:r>
       <w:r>
         <w:rPr>
@@ -2349,7 +2541,7 @@
           <w:i w:val="0"/>
           <w:sz w:val="22"/>
         </w:rPr>
-        <w:t>55%</w:t>
+        <w:t>70%</w:t>
       </w:r>
       <w:r>
         <w:rPr>
@@ -2382,7 +2574,7 @@
           <w:i w:val="0"/>
           <w:sz w:val="22"/>
         </w:rPr>
-        <w:t xml:space="preserve">Built scalable </w:t>
+        <w:t xml:space="preserve">Built NLP models using </w:t>
       </w:r>
       <w:r>
         <w:rPr>
@@ -2390,7 +2582,7 @@
           <w:i w:val="0"/>
           <w:sz w:val="22"/>
         </w:rPr>
-        <w:t>PySpark</w:t>
+        <w:t>BERT</w:t>
       </w:r>
       <w:r>
         <w:rPr>
@@ -2398,7 +2590,7 @@
           <w:i w:val="0"/>
           <w:sz w:val="22"/>
         </w:rPr>
-        <w:t xml:space="preserve"> ETL on </w:t>
+        <w:t xml:space="preserve"> and </w:t>
       </w:r>
       <w:r>
         <w:rPr>
@@ -2406,7 +2598,7 @@
           <w:i w:val="0"/>
           <w:sz w:val="22"/>
         </w:rPr>
-        <w:t>AWS (Glue, SageMaker)</w:t>
+        <w:t>BioBERT</w:t>
       </w:r>
       <w:r>
         <w:rPr>
@@ -2414,7 +2606,7 @@
           <w:i w:val="0"/>
           <w:sz w:val="22"/>
         </w:rPr>
-        <w:t xml:space="preserve"> with </w:t>
+        <w:t xml:space="preserve"> for clinical entity extraction from unstructured medical text, achieving </w:t>
       </w:r>
       <w:r>
         <w:rPr>
@@ -2422,7 +2614,7 @@
           <w:i w:val="0"/>
           <w:sz w:val="22"/>
         </w:rPr>
-        <w:t>Delta Lake</w:t>
+        <w:t>80% accuracy</w:t>
       </w:r>
       <w:r>
         <w:rPr>
@@ -2430,7 +2622,7 @@
           <w:i w:val="0"/>
           <w:sz w:val="22"/>
         </w:rPr>
-        <w:t xml:space="preserve">, improving data reliability by </w:t>
+        <w:t xml:space="preserve"> and reducing processing time by </w:t>
       </w:r>
       <w:r>
         <w:rPr>
@@ -2438,71 +2630,7 @@
           <w:i w:val="0"/>
           <w:sz w:val="22"/>
         </w:rPr>
-        <w:t>30%</w:t>
-      </w:r>
-      <w:r>
-        <w:rPr>
-          <w:b w:val="0"/>
-          <w:i w:val="0"/>
-          <w:sz w:val="22"/>
-        </w:rPr>
-        <w:t xml:space="preserve"> under </w:t>
-      </w:r>
-      <w:r>
-        <w:rPr>
-          <w:b/>
-          <w:i w:val="0"/>
-          <w:sz w:val="22"/>
-        </w:rPr>
-        <w:t>HIPAA</w:t>
-      </w:r>
-      <w:r>
-        <w:rPr>
-          <w:b w:val="0"/>
-          <w:i w:val="0"/>
-          <w:sz w:val="22"/>
-        </w:rPr>
-        <w:t xml:space="preserve">, and improved </w:t>
-      </w:r>
-      <w:r>
-        <w:rPr>
-          <w:b/>
-          <w:i w:val="0"/>
-          <w:sz w:val="22"/>
-        </w:rPr>
-        <w:t>Scikit-learn/XGBoost</w:t>
-      </w:r>
-      <w:r>
-        <w:rPr>
-          <w:b w:val="0"/>
-          <w:i w:val="0"/>
-          <w:sz w:val="22"/>
-        </w:rPr>
-        <w:t xml:space="preserve"> models, increasing accuracy by </w:t>
-      </w:r>
-      <w:r>
-        <w:rPr>
-          <w:b/>
-          <w:i w:val="0"/>
-          <w:sz w:val="22"/>
-        </w:rPr>
-        <w:t>8%</w:t>
-      </w:r>
-      <w:r>
-        <w:rPr>
-          <w:b w:val="0"/>
-          <w:i w:val="0"/>
-          <w:sz w:val="22"/>
-        </w:rPr>
-        <w:t xml:space="preserve"> and cutting training time by </w:t>
-      </w:r>
-      <w:r>
-        <w:rPr>
-          <w:b/>
-          <w:i w:val="0"/>
-          <w:sz w:val="22"/>
-        </w:rPr>
-        <w:t>15%</w:t>
+        <w:t>55%</w:t>
       </w:r>
       <w:r>
         <w:rPr>
@@ -2535,7 +2663,7 @@
           <w:i w:val="0"/>
           <w:sz w:val="22"/>
         </w:rPr>
-        <w:t xml:space="preserve">Containerized ML inference services with </w:t>
+        <w:t xml:space="preserve">Built scalable </w:t>
       </w:r>
       <w:r>
         <w:rPr>
@@ -2543,7 +2671,7 @@
           <w:i w:val="0"/>
           <w:sz w:val="22"/>
         </w:rPr>
-        <w:t>Docker, Kubernetes,</w:t>
+        <w:t>PySpark</w:t>
       </w:r>
       <w:r>
         <w:rPr>
@@ -2551,7 +2679,7 @@
           <w:i w:val="0"/>
           <w:sz w:val="22"/>
         </w:rPr>
-        <w:t xml:space="preserve"> and </w:t>
+        <w:t xml:space="preserve"> ETL on </w:t>
       </w:r>
       <w:r>
         <w:rPr>
@@ -2559,7 +2687,7 @@
           <w:i w:val="0"/>
           <w:sz w:val="22"/>
         </w:rPr>
-        <w:t>Jenkins CI/CD</w:t>
+        <w:t>AWS (Glue, SageMaker)</w:t>
       </w:r>
       <w:r>
         <w:rPr>
@@ -2567,7 +2695,7 @@
           <w:i w:val="0"/>
           <w:sz w:val="22"/>
         </w:rPr>
-        <w:t xml:space="preserve">, improving system uptime by </w:t>
+        <w:t xml:space="preserve"> with </w:t>
       </w:r>
       <w:r>
         <w:rPr>
@@ -2575,7 +2703,7 @@
           <w:i w:val="0"/>
           <w:sz w:val="22"/>
         </w:rPr>
-        <w:t>20%</w:t>
+        <w:t>Delta Lake</w:t>
       </w:r>
       <w:r>
         <w:rPr>
@@ -2583,7 +2711,7 @@
           <w:i w:val="0"/>
           <w:sz w:val="22"/>
         </w:rPr>
-        <w:t xml:space="preserve"> and enabling real-time EHR integration via </w:t>
+        <w:t xml:space="preserve">, improving data reliability by </w:t>
       </w:r>
       <w:r>
         <w:rPr>
@@ -2591,7 +2719,71 @@
           <w:i w:val="0"/>
           <w:sz w:val="22"/>
         </w:rPr>
-        <w:t>REST APIs</w:t>
+        <w:t>30%</w:t>
+      </w:r>
+      <w:r>
+        <w:rPr>
+          <w:b w:val="0"/>
+          <w:i w:val="0"/>
+          <w:sz w:val="22"/>
+        </w:rPr>
+        <w:t xml:space="preserve"> under </w:t>
+      </w:r>
+      <w:r>
+        <w:rPr>
+          <w:b/>
+          <w:i w:val="0"/>
+          <w:sz w:val="22"/>
+        </w:rPr>
+        <w:t>HIPAA</w:t>
+      </w:r>
+      <w:r>
+        <w:rPr>
+          <w:b w:val="0"/>
+          <w:i w:val="0"/>
+          <w:sz w:val="22"/>
+        </w:rPr>
+        <w:t xml:space="preserve">, and improved </w:t>
+      </w:r>
+      <w:r>
+        <w:rPr>
+          <w:b/>
+          <w:i w:val="0"/>
+          <w:sz w:val="22"/>
+        </w:rPr>
+        <w:t>Scikit-learn/XGBoost</w:t>
+      </w:r>
+      <w:r>
+        <w:rPr>
+          <w:b w:val="0"/>
+          <w:i w:val="0"/>
+          <w:sz w:val="22"/>
+        </w:rPr>
+        <w:t xml:space="preserve"> models, increasing accuracy by </w:t>
+      </w:r>
+      <w:r>
+        <w:rPr>
+          <w:b/>
+          <w:i w:val="0"/>
+          <w:sz w:val="22"/>
+        </w:rPr>
+        <w:t>8%</w:t>
+      </w:r>
+      <w:r>
+        <w:rPr>
+          <w:b w:val="0"/>
+          <w:i w:val="0"/>
+          <w:sz w:val="22"/>
+        </w:rPr>
+        <w:t xml:space="preserve"> and cutting training time by </w:t>
+      </w:r>
+      <w:r>
+        <w:rPr>
+          <w:b/>
+          <w:i w:val="0"/>
+          <w:sz w:val="22"/>
+        </w:rPr>
+        <w:t>15%</w:t>
       </w:r>
       <w:r>
         <w:rPr>
@@ -2624,7 +2816,7 @@
           <w:i w:val="0"/>
           <w:sz w:val="22"/>
         </w:rPr>
-        <w:t xml:space="preserve">Delivered self-service BI pipelines integrating </w:t>
+        <w:t xml:space="preserve">Containerized ML inference services with </w:t>
       </w:r>
       <w:r>
         <w:rPr>
@@ -2632,7 +2824,7 @@
           <w:i w:val="0"/>
           <w:sz w:val="22"/>
         </w:rPr>
-        <w:t>Tableau, Power BI,</w:t>
+        <w:t>Docker, Kubernetes,</w:t>
       </w:r>
       <w:r>
         <w:rPr>
@@ -2640,7 +2832,7 @@
           <w:i w:val="0"/>
           <w:sz w:val="22"/>
         </w:rPr>
-        <w:t xml:space="preserve"> and SQL-based models, reducing reporting latency by </w:t>
+        <w:t xml:space="preserve"> and </w:t>
       </w:r>
       <w:r>
         <w:rPr>
@@ -2648,7 +2840,7 @@
           <w:i w:val="0"/>
           <w:sz w:val="22"/>
         </w:rPr>
-        <w:t>40%</w:t>
+        <w:t>Jenkins CI/CD</w:t>
       </w:r>
       <w:r>
         <w:rPr>
@@ -2656,7 +2848,39 @@
           <w:i w:val="0"/>
           <w:sz w:val="22"/>
         </w:rPr>
-        <w:t xml:space="preserve"> and enabling anomaly detection for healthcare analytics.</w:t>
+        <w:t xml:space="preserve">, improving system uptime by </w:t>
+      </w:r>
+      <w:r>
+        <w:rPr>
+          <w:b/>
+          <w:i w:val="0"/>
+          <w:sz w:val="22"/>
+        </w:rPr>
+        <w:t>20%</w:t>
+      </w:r>
+      <w:r>
+        <w:rPr>
+          <w:b w:val="0"/>
+          <w:i w:val="0"/>
+          <w:sz w:val="22"/>
+        </w:rPr>
+        <w:t xml:space="preserve"> and enabling real-time EHR integration via </w:t>
+      </w:r>
+      <w:r>
+        <w:rPr>
+          <w:b/>
+          <w:i w:val="0"/>
+          <w:sz w:val="22"/>
+        </w:rPr>
+        <w:t>REST APIs</w:t>
+      </w:r>
+      <w:r>
+        <w:rPr>
+          <w:b w:val="0"/>
+          <w:i w:val="0"/>
+          <w:sz w:val="22"/>
+        </w:rPr>
+        <w:t>.</w:t>
       </w:r>
     </w:p>
     <w:p>
@@ -2773,7 +2997,7 @@
           <w:i w:val="0"/>
           <w:sz w:val="22"/>
         </w:rPr>
-        <w:t xml:space="preserve">, improving provider insights and reducing operational overhead by </w:t>
+        <w:t xml:space="preserve"> and automated </w:t>
       </w:r>
       <w:r>
         <w:rPr>
@@ -2781,6 +3005,22 @@
           <w:i w:val="0"/>
           <w:sz w:val="22"/>
         </w:rPr>
+        <w:t>medical invoice processing</w:t>
+      </w:r>
+      <w:r>
+        <w:rPr>
+          <w:b w:val="0"/>
+          <w:i w:val="0"/>
+          <w:sz w:val="22"/>
+        </w:rPr>
+        <w:t xml:space="preserve"> pipelines, reducing operational overhead by </w:t>
+      </w:r>
+      <w:r>
+        <w:rPr>
+          <w:b/>
+          <w:i w:val="0"/>
+          <w:sz w:val="22"/>
+        </w:rPr>
         <w:t>60%</w:t>
       </w:r>
       <w:r>
@@ -2789,64 +3029,23 @@
           <w:i w:val="0"/>
           <w:sz w:val="22"/>
         </w:rPr>
+        <w:t xml:space="preserve"> and manual errors by </w:t>
+      </w:r>
+      <w:r>
+        <w:rPr>
+          <w:b/>
+          <w:i w:val="0"/>
+          <w:sz w:val="22"/>
+        </w:rPr>
+        <w:t>70%</w:t>
+      </w:r>
+      <w:r>
+        <w:rPr>
+          <w:b w:val="0"/>
+          <w:i w:val="0"/>
+          <w:sz w:val="22"/>
+        </w:rPr>
         <w:t>.</w:t>
-      </w:r>
-    </w:p>
-    <w:p>
-      <w:pPr>
-        <w:tabs>
-          <w:tab w:pos="475" w:val="left"/>
-        </w:tabs>
-        <w:spacing w:after="20"/>
-        <w:ind w:left="475" w:hanging="331"/>
-        <w:jc w:val="both"/>
-      </w:pPr>
-      <w:r>
-        <w:rPr>
-          <w:sz w:val="22"/>
-        </w:rPr>
-        <w:t>•</w:t>
-        <w:tab/>
-      </w:r>
-      <w:r>
-        <w:rPr>
-          <w:b w:val="0"/>
-          <w:i w:val="0"/>
-          <w:sz w:val="22"/>
-        </w:rPr>
-        <w:t xml:space="preserve">Automated </w:t>
-      </w:r>
-      <w:r>
-        <w:rPr>
-          <w:b/>
-          <w:i w:val="0"/>
-          <w:sz w:val="22"/>
-        </w:rPr>
-        <w:t>medical invoice processing</w:t>
-      </w:r>
-      <w:r>
-        <w:rPr>
-          <w:b w:val="0"/>
-          <w:i w:val="0"/>
-          <w:sz w:val="22"/>
-        </w:rPr>
-        <w:t xml:space="preserve"> pipelines, cutting manual errors by </w:t>
-      </w:r>
-      <w:r>
-        <w:rPr>
-          <w:b/>
-          <w:i w:val="0"/>
-          <w:sz w:val="22"/>
-        </w:rPr>
-        <w:t>70%</w:t>
-      </w:r>
-      <w:r>
-        <w:rPr>
-          <w:b w:val="0"/>
-          <w:i w:val="0"/>
-          <w:sz w:val="22"/>
-        </w:rPr>
-        <w:t xml:space="preserve"> and improving the reliability of financial reporting.</w:t>
       </w:r>
     </w:p>
     <w:p>

</xml_diff>

<commit_message>
Lead Carelon ML role with ML work, add agentic AI project, keep to 2 pages
Co-Authored-By: Claude Opus 5.5 <noreply@anthropic.com>
Claude-Session: https://claude.ai/code/session_013uu8YLK93nR2ygpNvDWsMr
</commit_message>
<xml_diff>
--- a/resume/Ritesh_Somashekar_AI_ML_Engineer_GMU_Carelon.docx
+++ b/resume/Ritesh_Somashekar_AI_ML_Engineer_GMU_Carelon.docx
@@ -494,7 +494,7 @@
           <w:i w:val="0"/>
           <w:sz w:val="22"/>
         </w:rPr>
-        <w:t xml:space="preserve">, </w:t>
+        <w:t xml:space="preserve">, and </w:t>
       </w:r>
       <w:r>
         <w:rPr>
@@ -502,7 +502,7 @@
           <w:i w:val="0"/>
           <w:sz w:val="22"/>
         </w:rPr>
-        <w:t>74% higher data accuracy</w:t>
+        <w:t>60% faster model training</w:t>
       </w:r>
       <w:r>
         <w:rPr>
@@ -510,23 +510,7 @@
           <w:i w:val="0"/>
           <w:sz w:val="22"/>
         </w:rPr>
-        <w:t xml:space="preserve">, and </w:t>
-      </w:r>
-      <w:r>
-        <w:rPr>
-          <w:b/>
-          <w:i w:val="0"/>
-          <w:sz w:val="22"/>
-        </w:rPr>
-        <w:t>60% faster model training</w:t>
-      </w:r>
-      <w:r>
-        <w:rPr>
-          <w:b w:val="0"/>
-          <w:i w:val="0"/>
-          <w:sz w:val="22"/>
-        </w:rPr>
-        <w:t xml:space="preserve">. Adept at collaborating with researchers, public agencies, and business stakeholders to deliver </w:t>
+        <w:t xml:space="preserve">, delivering </w:t>
       </w:r>
       <w:r>
         <w:rPr>
@@ -710,7 +694,7 @@
           <w:i w:val="0"/>
           <w:sz w:val="22"/>
         </w:rPr>
-        <w:t>Cloud Platforms:</w:t>
+        <w:t>Cloud &amp; Visualization:</w:t>
       </w:r>
       <w:r>
         <w:rPr>
@@ -718,30 +702,7 @@
           <w:i w:val="0"/>
           <w:sz w:val="22"/>
         </w:rPr>
-        <w:t xml:space="preserve"> AWS (S3, Lambda, Athena, Glue, SageMaker, SQS), Azure (Data Services, Stream Analytics)</w:t>
-      </w:r>
-    </w:p>
-    <w:p>
-      <w:pPr>
-        <w:spacing w:after="60"/>
-        <w:ind w:left="144"/>
-        <w:jc w:val="both"/>
-      </w:pPr>
-      <w:r>
-        <w:rPr>
-          <w:b/>
-          <w:i w:val="0"/>
-          <w:sz w:val="22"/>
-        </w:rPr>
-        <w:t>Data Analysis &amp; Visualization:</w:t>
-      </w:r>
-      <w:r>
-        <w:rPr>
-          <w:b w:val="0"/>
-          <w:i w:val="0"/>
-          <w:sz w:val="22"/>
-        </w:rPr>
-        <w:t xml:space="preserve"> Tableau, Power BI (DAX), Excel (VBA, Formulas), Statistical Analysis, Data Lineage</w:t>
+        <w:t xml:space="preserve"> AWS (S3, Lambda, Athena, Glue, SageMaker, SQS), Azure (Data Services, Stream Analytics), Tableau, Power BI (DAX), Excel (VBA)</w:t>
       </w:r>
     </w:p>
     <w:p>
@@ -1795,7 +1756,7 @@
           <w:i w:val="0"/>
           <w:sz w:val="22"/>
         </w:rPr>
-        <w:t xml:space="preserve"> to forecast community coping trends with an </w:t>
+        <w:t xml:space="preserve">, forecasting community coping trends with an </w:t>
       </w:r>
       <w:r>
         <w:rPr>
@@ -1804,38 +1765,6 @@
           <w:sz w:val="22"/>
         </w:rPr>
         <w:t>RMSE of 0.89</w:t>
-      </w:r>
-      <w:r>
-        <w:rPr>
-          <w:b w:val="0"/>
-          <w:i w:val="0"/>
-          <w:sz w:val="22"/>
-        </w:rPr>
-        <w:t xml:space="preserve">, visualizing findings in </w:t>
-      </w:r>
-      <w:r>
-        <w:rPr>
-          <w:b/>
-          <w:i w:val="0"/>
-          <w:sz w:val="22"/>
-        </w:rPr>
-        <w:t>R</w:t>
-      </w:r>
-      <w:r>
-        <w:rPr>
-          <w:b w:val="0"/>
-          <w:i w:val="0"/>
-          <w:sz w:val="22"/>
-        </w:rPr>
-        <w:t xml:space="preserve"> and </w:t>
-      </w:r>
-      <w:r>
-        <w:rPr>
-          <w:b/>
-          <w:i w:val="0"/>
-          <w:sz w:val="22"/>
-        </w:rPr>
-        <w:t>Tableau</w:t>
       </w:r>
       <w:r>
         <w:rPr>
@@ -2005,7 +1934,7 @@
           <w:i w:val="0"/>
           <w:sz w:val="22"/>
         </w:rPr>
-        <w:t xml:space="preserve"> and transformer models using </w:t>
+        <w:t xml:space="preserve"> with </w:t>
       </w:r>
       <w:r>
         <w:rPr>
@@ -2029,7 +1958,7 @@
           <w:i w:val="0"/>
           <w:sz w:val="22"/>
         </w:rPr>
-        <w:t>Quantization-Aware Training (QAT)</w:t>
+        <w:t>QAT</w:t>
       </w:r>
       <w:r>
         <w:rPr>
@@ -2037,7 +1966,7 @@
           <w:i w:val="0"/>
           <w:sz w:val="22"/>
         </w:rPr>
-        <w:t xml:space="preserve">, reducing model size by </w:t>
+        <w:t xml:space="preserve">, cutting model size by </w:t>
       </w:r>
       <w:r>
         <w:rPr>
@@ -2053,7 +1982,7 @@
           <w:i w:val="0"/>
           <w:sz w:val="22"/>
         </w:rPr>
-        <w:t xml:space="preserve"> while keeping accuracy within </w:t>
+        <w:t xml:space="preserve"> within </w:t>
       </w:r>
       <w:r>
         <w:rPr>
@@ -2069,7 +1998,7 @@
           <w:i w:val="0"/>
           <w:sz w:val="22"/>
         </w:rPr>
-        <w:t xml:space="preserve"> of full-precision benchmarks.</w:t>
+        <w:t xml:space="preserve"> of full-precision accuracy.</w:t>
       </w:r>
     </w:p>
     <w:p>
@@ -2266,7 +2195,7 @@
           <w:i w:val="0"/>
           <w:sz w:val="22"/>
         </w:rPr>
-        <w:t xml:space="preserve">Designed and managed </w:t>
+        <w:t xml:space="preserve">Built NLP models using </w:t>
       </w:r>
       <w:r>
         <w:rPr>
@@ -2274,7 +2203,7 @@
           <w:i w:val="0"/>
           <w:sz w:val="22"/>
         </w:rPr>
-        <w:t>20+ enterprise ETL pipelines</w:t>
+        <w:t>BERT</w:t>
       </w:r>
       <w:r>
         <w:rPr>
@@ -2282,7 +2211,7 @@
           <w:i w:val="0"/>
           <w:sz w:val="22"/>
         </w:rPr>
-        <w:t xml:space="preserve">, boosting data throughput by </w:t>
+        <w:t xml:space="preserve"> and </w:t>
       </w:r>
       <w:r>
         <w:rPr>
@@ -2290,7 +2219,7 @@
           <w:i w:val="0"/>
           <w:sz w:val="22"/>
         </w:rPr>
-        <w:t>70%</w:t>
+        <w:t>BioBERT</w:t>
       </w:r>
       <w:r>
         <w:rPr>
@@ -2298,7 +2227,39 @@
           <w:i w:val="0"/>
           <w:sz w:val="22"/>
         </w:rPr>
-        <w:t xml:space="preserve"> and ensuring high availability for downstream AI/BI applications.</w:t>
+        <w:t xml:space="preserve"> for clinical entity extraction from unstructured medical text, achieving </w:t>
+      </w:r>
+      <w:r>
+        <w:rPr>
+          <w:b/>
+          <w:i w:val="0"/>
+          <w:sz w:val="22"/>
+        </w:rPr>
+        <w:t>80% accuracy</w:t>
+      </w:r>
+      <w:r>
+        <w:rPr>
+          <w:b w:val="0"/>
+          <w:i w:val="0"/>
+          <w:sz w:val="22"/>
+        </w:rPr>
+        <w:t xml:space="preserve"> and reducing processing time by </w:t>
+      </w:r>
+      <w:r>
+        <w:rPr>
+          <w:b/>
+          <w:i w:val="0"/>
+          <w:sz w:val="22"/>
+        </w:rPr>
+        <w:t>55%</w:t>
+      </w:r>
+      <w:r>
+        <w:rPr>
+          <w:b w:val="0"/>
+          <w:i w:val="0"/>
+          <w:sz w:val="22"/>
+        </w:rPr>
+        <w:t>.</w:t>
       </w:r>
     </w:p>
     <w:p>
@@ -2323,7 +2284,7 @@
           <w:i w:val="0"/>
           <w:sz w:val="22"/>
         </w:rPr>
-        <w:t xml:space="preserve">Automated workflows with </w:t>
+        <w:t xml:space="preserve">Improved </w:t>
       </w:r>
       <w:r>
         <w:rPr>
@@ -2331,7 +2292,7 @@
           <w:i w:val="0"/>
           <w:sz w:val="22"/>
         </w:rPr>
-        <w:t>Apache Airflow, Python,</w:t>
+        <w:t>Scikit-learn</w:t>
       </w:r>
       <w:r>
         <w:rPr>
@@ -2347,7 +2308,7 @@
           <w:i w:val="0"/>
           <w:sz w:val="22"/>
         </w:rPr>
-        <w:t>AWS (S3, Lambda, Athena)</w:t>
+        <w:t>XGBoost</w:t>
       </w:r>
       <w:r>
         <w:rPr>
@@ -2355,7 +2316,7 @@
           <w:i w:val="0"/>
           <w:sz w:val="22"/>
         </w:rPr>
-        <w:t xml:space="preserve">, achieving </w:t>
+        <w:t xml:space="preserve"> models through feature engineering and hyperparameter tuning, increasing accuracy by </w:t>
       </w:r>
       <w:r>
         <w:rPr>
@@ -2363,7 +2324,7 @@
           <w:i w:val="0"/>
           <w:sz w:val="22"/>
         </w:rPr>
-        <w:t>99.9% pipeline reliability</w:t>
+        <w:t>8%</w:t>
       </w:r>
       <w:r>
         <w:rPr>
@@ -2371,7 +2332,23 @@
           <w:i w:val="0"/>
           <w:sz w:val="22"/>
         </w:rPr>
-        <w:t xml:space="preserve"> with end-to-end lineage tracking.</w:t>
+        <w:t xml:space="preserve"> and cutting training time by </w:t>
+      </w:r>
+      <w:r>
+        <w:rPr>
+          <w:b/>
+          <w:i w:val="0"/>
+          <w:sz w:val="22"/>
+        </w:rPr>
+        <w:t>15%</w:t>
+      </w:r>
+      <w:r>
+        <w:rPr>
+          <w:b w:val="0"/>
+          <w:i w:val="0"/>
+          <w:sz w:val="22"/>
+        </w:rPr>
+        <w:t>.</w:t>
       </w:r>
     </w:p>
     <w:p>
@@ -2396,7 +2373,7 @@
           <w:i w:val="0"/>
           <w:sz w:val="22"/>
         </w:rPr>
-        <w:t xml:space="preserve">Built a daily ingestion workflow from </w:t>
+        <w:t xml:space="preserve">Containerized ML inference services with </w:t>
       </w:r>
       <w:r>
         <w:rPr>
@@ -2404,7 +2381,7 @@
           <w:i w:val="0"/>
           <w:sz w:val="22"/>
         </w:rPr>
-        <w:t>NPPES</w:t>
+        <w:t>Docker, Kubernetes,</w:t>
       </w:r>
       <w:r>
         <w:rPr>
@@ -2412,7 +2389,7 @@
           <w:i w:val="0"/>
           <w:sz w:val="22"/>
         </w:rPr>
-        <w:t xml:space="preserve"> repositories, improving data accuracy by </w:t>
+        <w:t xml:space="preserve"> and </w:t>
       </w:r>
       <w:r>
         <w:rPr>
@@ -2420,7 +2397,7 @@
           <w:i w:val="0"/>
           <w:sz w:val="22"/>
         </w:rPr>
-        <w:t>74%</w:t>
+        <w:t>Jenkins CI/CD</w:t>
       </w:r>
       <w:r>
         <w:rPr>
@@ -2428,7 +2405,7 @@
           <w:i w:val="0"/>
           <w:sz w:val="22"/>
         </w:rPr>
-        <w:t xml:space="preserve"> and cutting processing overhead by </w:t>
+        <w:t xml:space="preserve">, improving system uptime by </w:t>
       </w:r>
       <w:r>
         <w:rPr>
@@ -2436,7 +2413,23 @@
           <w:i w:val="0"/>
           <w:sz w:val="22"/>
         </w:rPr>
-        <w:t>60%</w:t>
+        <w:t>20%</w:t>
+      </w:r>
+      <w:r>
+        <w:rPr>
+          <w:b w:val="0"/>
+          <w:i w:val="0"/>
+          <w:sz w:val="22"/>
+        </w:rPr>
+        <w:t xml:space="preserve"> and enabling real-time EHR integration via </w:t>
+      </w:r>
+      <w:r>
+        <w:rPr>
+          <w:b/>
+          <w:i w:val="0"/>
+          <w:sz w:val="22"/>
+        </w:rPr>
+        <w:t>REST APIs</w:t>
       </w:r>
       <w:r>
         <w:rPr>
@@ -2469,7 +2462,7 @@
           <w:i w:val="0"/>
           <w:sz w:val="22"/>
         </w:rPr>
-        <w:t xml:space="preserve">Engineered ingestion pipelines for </w:t>
+        <w:t xml:space="preserve">Engineered ML-ready ingestion of </w:t>
       </w:r>
       <w:r>
         <w:rPr>
@@ -2574,7 +2567,7 @@
           <w:i w:val="0"/>
           <w:sz w:val="22"/>
         </w:rPr>
-        <w:t xml:space="preserve">Built NLP models using </w:t>
+        <w:t xml:space="preserve">Built a daily </w:t>
       </w:r>
       <w:r>
         <w:rPr>
@@ -2582,7 +2575,7 @@
           <w:i w:val="0"/>
           <w:sz w:val="22"/>
         </w:rPr>
-        <w:t>BERT</w:t>
+        <w:t>NPPES</w:t>
       </w:r>
       <w:r>
         <w:rPr>
@@ -2590,7 +2583,7 @@
           <w:i w:val="0"/>
           <w:sz w:val="22"/>
         </w:rPr>
-        <w:t xml:space="preserve"> and </w:t>
+        <w:t xml:space="preserve"> ingestion workflow that improved ML data accuracy by </w:t>
       </w:r>
       <w:r>
         <w:rPr>
@@ -2598,7 +2591,7 @@
           <w:i w:val="0"/>
           <w:sz w:val="22"/>
         </w:rPr>
-        <w:t>BioBERT</w:t>
+        <w:t>74%</w:t>
       </w:r>
       <w:r>
         <w:rPr>
@@ -2606,7 +2599,7 @@
           <w:i w:val="0"/>
           <w:sz w:val="22"/>
         </w:rPr>
-        <w:t xml:space="preserve"> for clinical entity extraction from unstructured medical text, achieving </w:t>
+        <w:t xml:space="preserve"> and cut processing overhead by </w:t>
       </w:r>
       <w:r>
         <w:rPr>
@@ -2614,7 +2607,7 @@
           <w:i w:val="0"/>
           <w:sz w:val="22"/>
         </w:rPr>
-        <w:t>80% accuracy</w:t>
+        <w:t>60%</w:t>
       </w:r>
       <w:r>
         <w:rPr>
@@ -2622,7 +2615,7 @@
           <w:i w:val="0"/>
           <w:sz w:val="22"/>
         </w:rPr>
-        <w:t xml:space="preserve"> and reducing processing time by </w:t>
+        <w:t xml:space="preserve">, and built </w:t>
       </w:r>
       <w:r>
         <w:rPr>
@@ -2630,7 +2623,71 @@
           <w:i w:val="0"/>
           <w:sz w:val="22"/>
         </w:rPr>
-        <w:t>55%</w:t>
+        <w:t>PySpark</w:t>
+      </w:r>
+      <w:r>
+        <w:rPr>
+          <w:b w:val="0"/>
+          <w:i w:val="0"/>
+          <w:sz w:val="22"/>
+        </w:rPr>
+        <w:t xml:space="preserve"> ETL on </w:t>
+      </w:r>
+      <w:r>
+        <w:rPr>
+          <w:b/>
+          <w:i w:val="0"/>
+          <w:sz w:val="22"/>
+        </w:rPr>
+        <w:t>AWS (Glue, SageMaker)</w:t>
+      </w:r>
+      <w:r>
+        <w:rPr>
+          <w:b w:val="0"/>
+          <w:i w:val="0"/>
+          <w:sz w:val="22"/>
+        </w:rPr>
+        <w:t xml:space="preserve"> with </w:t>
+      </w:r>
+      <w:r>
+        <w:rPr>
+          <w:b/>
+          <w:i w:val="0"/>
+          <w:sz w:val="22"/>
+        </w:rPr>
+        <w:t>Delta Lake</w:t>
+      </w:r>
+      <w:r>
+        <w:rPr>
+          <w:b w:val="0"/>
+          <w:i w:val="0"/>
+          <w:sz w:val="22"/>
+        </w:rPr>
+        <w:t xml:space="preserve">, improving data reliability by </w:t>
+      </w:r>
+      <w:r>
+        <w:rPr>
+          <w:b/>
+          <w:i w:val="0"/>
+          <w:sz w:val="22"/>
+        </w:rPr>
+        <w:t>30%</w:t>
+      </w:r>
+      <w:r>
+        <w:rPr>
+          <w:b w:val="0"/>
+          <w:i w:val="0"/>
+          <w:sz w:val="22"/>
+        </w:rPr>
+        <w:t xml:space="preserve"> under </w:t>
+      </w:r>
+      <w:r>
+        <w:rPr>
+          <w:b/>
+          <w:i w:val="0"/>
+          <w:sz w:val="22"/>
+        </w:rPr>
+        <w:t>HIPAA</w:t>
       </w:r>
       <w:r>
         <w:rPr>
@@ -2663,7 +2720,7 @@
           <w:i w:val="0"/>
           <w:sz w:val="22"/>
         </w:rPr>
-        <w:t xml:space="preserve">Built scalable </w:t>
+        <w:t xml:space="preserve">Designed </w:t>
       </w:r>
       <w:r>
         <w:rPr>
@@ -2671,7 +2728,7 @@
           <w:i w:val="0"/>
           <w:sz w:val="22"/>
         </w:rPr>
-        <w:t>PySpark</w:t>
+        <w:t>20+ enterprise ETL pipelines</w:t>
       </w:r>
       <w:r>
         <w:rPr>
@@ -2679,7 +2736,7 @@
           <w:i w:val="0"/>
           <w:sz w:val="22"/>
         </w:rPr>
-        <w:t xml:space="preserve"> ETL on </w:t>
+        <w:t xml:space="preserve"> orchestrated with </w:t>
       </w:r>
       <w:r>
         <w:rPr>
@@ -2687,7 +2744,7 @@
           <w:i w:val="0"/>
           <w:sz w:val="22"/>
         </w:rPr>
-        <w:t>AWS (Glue, SageMaker)</w:t>
+        <w:t>Apache Airflow</w:t>
       </w:r>
       <w:r>
         <w:rPr>
@@ -2695,7 +2752,7 @@
           <w:i w:val="0"/>
           <w:sz w:val="22"/>
         </w:rPr>
-        <w:t xml:space="preserve"> with </w:t>
+        <w:t xml:space="preserve"> and </w:t>
       </w:r>
       <w:r>
         <w:rPr>
@@ -2703,7 +2760,7 @@
           <w:i w:val="0"/>
           <w:sz w:val="22"/>
         </w:rPr>
-        <w:t>Delta Lake</w:t>
+        <w:t>AWS (S3, Lambda, Athena)</w:t>
       </w:r>
       <w:r>
         <w:rPr>
@@ -2711,7 +2768,7 @@
           <w:i w:val="0"/>
           <w:sz w:val="22"/>
         </w:rPr>
-        <w:t xml:space="preserve">, improving data reliability by </w:t>
+        <w:t xml:space="preserve">, boosting throughput by </w:t>
       </w:r>
       <w:r>
         <w:rPr>
@@ -2719,7 +2776,7 @@
           <w:i w:val="0"/>
           <w:sz w:val="22"/>
         </w:rPr>
-        <w:t>30%</w:t>
+        <w:t>70%</w:t>
       </w:r>
       <w:r>
         <w:rPr>
@@ -2727,7 +2784,7 @@
           <w:i w:val="0"/>
           <w:sz w:val="22"/>
         </w:rPr>
-        <w:t xml:space="preserve"> under </w:t>
+        <w:t xml:space="preserve"> and achieving </w:t>
       </w:r>
       <w:r>
         <w:rPr>
@@ -2735,7 +2792,7 @@
           <w:i w:val="0"/>
           <w:sz w:val="22"/>
         </w:rPr>
-        <w:t>HIPAA</w:t>
+        <w:t>99.9% pipeline reliability</w:t>
       </w:r>
       <w:r>
         <w:rPr>
@@ -2743,55 +2800,42 @@
           <w:i w:val="0"/>
           <w:sz w:val="22"/>
         </w:rPr>
-        <w:t xml:space="preserve">, and improved </w:t>
-      </w:r>
+        <w:t xml:space="preserve"> with end-to-end lineage tracking.</w:t>
+      </w:r>
+    </w:p>
+    <w:p>
+      <w:pPr>
+        <w:tabs>
+          <w:tab w:pos="11592" w:val="right"/>
+        </w:tabs>
+        <w:spacing w:before="120" w:after="40"/>
+      </w:pPr>
       <w:r>
         <w:rPr>
           <w:b/>
-          <w:i w:val="0"/>
-          <w:sz w:val="22"/>
-        </w:rPr>
-        <w:t>Scikit-learn/XGBoost</w:t>
-      </w:r>
-      <w:r>
-        <w:rPr>
-          <w:b w:val="0"/>
-          <w:i w:val="0"/>
-          <w:sz w:val="22"/>
-        </w:rPr>
-        <w:t xml:space="preserve"> models, increasing accuracy by </w:t>
+          <w:sz w:val="24"/>
+        </w:rPr>
+        <w:t xml:space="preserve">Carelon Global Solutions (Elevance Health) </w:t>
       </w:r>
       <w:r>
         <w:rPr>
           <w:b/>
-          <w:i w:val="0"/>
-          <w:sz w:val="22"/>
-        </w:rPr>
-        <w:t>8%</w:t>
-      </w:r>
-      <w:r>
-        <w:rPr>
-          <w:b w:val="0"/>
-          <w:i w:val="0"/>
-          <w:sz w:val="22"/>
-        </w:rPr>
-        <w:t xml:space="preserve"> and cutting training time by </w:t>
+        </w:rPr>
+        <w:t xml:space="preserve">| </w:t>
       </w:r>
       <w:r>
         <w:rPr>
           <w:b/>
-          <w:i w:val="0"/>
-          <w:sz w:val="22"/>
-        </w:rPr>
-        <w:t>15%</w:t>
-      </w:r>
-      <w:r>
-        <w:rPr>
-          <w:b w:val="0"/>
-          <w:i w:val="0"/>
-          <w:sz w:val="22"/>
-        </w:rPr>
-        <w:t>.</w:t>
+          <w:i/>
+        </w:rPr>
+        <w:t>Data Engineer</w:t>
+      </w:r>
+      <w:r>
+        <w:rPr>
+          <w:b/>
+        </w:rPr>
+        <w:tab/>
+        <w:t>Bengaluru, India | October 2020 - April 2022</w:t>
       </w:r>
     </w:p>
     <w:p>
@@ -2816,7 +2860,7 @@
           <w:i w:val="0"/>
           <w:sz w:val="22"/>
         </w:rPr>
-        <w:t xml:space="preserve">Containerized ML inference services with </w:t>
+        <w:t xml:space="preserve">Aligned ETL pipelines with business KPIs on the </w:t>
       </w:r>
       <w:r>
         <w:rPr>
@@ -2824,7 +2868,7 @@
           <w:i w:val="0"/>
           <w:sz w:val="22"/>
         </w:rPr>
-        <w:t>Docker, Kubernetes,</w:t>
+        <w:t>Seven Plus Locations</w:t>
       </w:r>
       <w:r>
         <w:rPr>
@@ -2832,90 +2876,7 @@
           <w:i w:val="0"/>
           <w:sz w:val="22"/>
         </w:rPr>
-        <w:t xml:space="preserve"> and </w:t>
-      </w:r>
-      <w:r>
-        <w:rPr>
-          <w:b/>
-          <w:i w:val="0"/>
-          <w:sz w:val="22"/>
-        </w:rPr>
-        <w:t>Jenkins CI/CD</w:t>
-      </w:r>
-      <w:r>
-        <w:rPr>
-          <w:b w:val="0"/>
-          <w:i w:val="0"/>
-          <w:sz w:val="22"/>
-        </w:rPr>
-        <w:t xml:space="preserve">, improving system uptime by </w:t>
-      </w:r>
-      <w:r>
-        <w:rPr>
-          <w:b/>
-          <w:i w:val="0"/>
-          <w:sz w:val="22"/>
-        </w:rPr>
-        <w:t>20%</w:t>
-      </w:r>
-      <w:r>
-        <w:rPr>
-          <w:b w:val="0"/>
-          <w:i w:val="0"/>
-          <w:sz w:val="22"/>
-        </w:rPr>
-        <w:t xml:space="preserve"> and enabling real-time EHR integration via </w:t>
-      </w:r>
-      <w:r>
-        <w:rPr>
-          <w:b/>
-          <w:i w:val="0"/>
-          <w:sz w:val="22"/>
-        </w:rPr>
-        <w:t>REST APIs</w:t>
-      </w:r>
-      <w:r>
-        <w:rPr>
-          <w:b w:val="0"/>
-          <w:i w:val="0"/>
-          <w:sz w:val="22"/>
-        </w:rPr>
-        <w:t>.</w:t>
-      </w:r>
-    </w:p>
-    <w:p>
-      <w:pPr>
-        <w:tabs>
-          <w:tab w:pos="11592" w:val="right"/>
-        </w:tabs>
-        <w:spacing w:before="120" w:after="40"/>
-      </w:pPr>
-      <w:r>
-        <w:rPr>
-          <w:b/>
-          <w:sz w:val="24"/>
-        </w:rPr>
-        <w:t xml:space="preserve">Carelon Global Solutions (Elevance Health) </w:t>
-      </w:r>
-      <w:r>
-        <w:rPr>
-          <w:b/>
-        </w:rPr>
-        <w:t xml:space="preserve">| </w:t>
-      </w:r>
-      <w:r>
-        <w:rPr>
-          <w:b/>
-          <w:i/>
-        </w:rPr>
-        <w:t>Data Engineer</w:t>
-      </w:r>
-      <w:r>
-        <w:rPr>
-          <w:b/>
-        </w:rPr>
-        <w:tab/>
-        <w:t>Bengaluru, India | October 2020 - April 2022</w:t>
+        <w:t xml:space="preserve"> project, improving claims data accuracy.</w:t>
       </w:r>
     </w:p>
     <w:p>
@@ -2940,7 +2901,7 @@
           <w:i w:val="0"/>
           <w:sz w:val="22"/>
         </w:rPr>
-        <w:t xml:space="preserve">Partnered with stakeholders on the </w:t>
+        <w:t xml:space="preserve">Redesigned </w:t>
       </w:r>
       <w:r>
         <w:rPr>
@@ -2948,7 +2909,7 @@
           <w:i w:val="0"/>
           <w:sz w:val="22"/>
         </w:rPr>
-        <w:t>Seven Plus Locations</w:t>
+        <w:t>claims-balancing ETL workflows</w:t>
       </w:r>
       <w:r>
         <w:rPr>
@@ -2956,7 +2917,55 @@
           <w:i w:val="0"/>
           <w:sz w:val="22"/>
         </w:rPr>
-        <w:t xml:space="preserve"> project to align ETL pipelines with business KPIs, improving claims data accuracy and driving cost savings.</w:t>
+        <w:t xml:space="preserve"> and automated </w:t>
+      </w:r>
+      <w:r>
+        <w:rPr>
+          <w:b/>
+          <w:i w:val="0"/>
+          <w:sz w:val="22"/>
+        </w:rPr>
+        <w:t>medical invoice processing</w:t>
+      </w:r>
+      <w:r>
+        <w:rPr>
+          <w:b w:val="0"/>
+          <w:i w:val="0"/>
+          <w:sz w:val="22"/>
+        </w:rPr>
+        <w:t xml:space="preserve"> pipelines, reducing operational overhead by </w:t>
+      </w:r>
+      <w:r>
+        <w:rPr>
+          <w:b/>
+          <w:i w:val="0"/>
+          <w:sz w:val="22"/>
+        </w:rPr>
+        <w:t>60%</w:t>
+      </w:r>
+      <w:r>
+        <w:rPr>
+          <w:b w:val="0"/>
+          <w:i w:val="0"/>
+          <w:sz w:val="22"/>
+        </w:rPr>
+        <w:t xml:space="preserve"> and manual errors by </w:t>
+      </w:r>
+      <w:r>
+        <w:rPr>
+          <w:b/>
+          <w:i w:val="0"/>
+          <w:sz w:val="22"/>
+        </w:rPr>
+        <w:t>70%</w:t>
+      </w:r>
+      <w:r>
+        <w:rPr>
+          <w:b w:val="0"/>
+          <w:i w:val="0"/>
+          <w:sz w:val="22"/>
+        </w:rPr>
+        <w:t>.</w:t>
       </w:r>
     </w:p>
     <w:p>
@@ -2981,7 +2990,7 @@
           <w:i w:val="0"/>
           <w:sz w:val="22"/>
         </w:rPr>
-        <w:t xml:space="preserve">Redesigned </w:t>
+        <w:t xml:space="preserve">Migrated large-scale processing workloads from </w:t>
       </w:r>
       <w:r>
         <w:rPr>
@@ -2989,7 +2998,7 @@
           <w:i w:val="0"/>
           <w:sz w:val="22"/>
         </w:rPr>
-        <w:t>claims-balancing ETL workflows</w:t>
+        <w:t>Hive</w:t>
       </w:r>
       <w:r>
         <w:rPr>
@@ -2997,7 +3006,7 @@
           <w:i w:val="0"/>
           <w:sz w:val="22"/>
         </w:rPr>
-        <w:t xml:space="preserve"> and automated </w:t>
+        <w:t xml:space="preserve"> to </w:t>
       </w:r>
       <w:r>
         <w:rPr>
@@ -3005,7 +3014,7 @@
           <w:i w:val="0"/>
           <w:sz w:val="22"/>
         </w:rPr>
-        <w:t>medical invoice processing</w:t>
+        <w:t>Apache Spark/PySpark</w:t>
       </w:r>
       <w:r>
         <w:rPr>
@@ -3013,7 +3022,7 @@
           <w:i w:val="0"/>
           <w:sz w:val="22"/>
         </w:rPr>
-        <w:t xml:space="preserve"> pipelines, reducing operational overhead by </w:t>
+        <w:t xml:space="preserve">, and moved </w:t>
       </w:r>
       <w:r>
         <w:rPr>
@@ -3021,7 +3030,7 @@
           <w:i w:val="0"/>
           <w:sz w:val="22"/>
         </w:rPr>
-        <w:t>60%</w:t>
+        <w:t>Sqoop/Hadoop</w:t>
       </w:r>
       <w:r>
         <w:rPr>
@@ -3029,7 +3038,7 @@
           <w:i w:val="0"/>
           <w:sz w:val="22"/>
         </w:rPr>
-        <w:t xml:space="preserve"> and manual errors by </w:t>
+        <w:t xml:space="preserve"> ingestion to </w:t>
       </w:r>
       <w:r>
         <w:rPr>
@@ -3037,7 +3046,7 @@
           <w:i w:val="0"/>
           <w:sz w:val="22"/>
         </w:rPr>
-        <w:t>70%</w:t>
+        <w:t>Azure Data Services</w:t>
       </w:r>
       <w:r>
         <w:rPr>
@@ -3045,7 +3054,7 @@
           <w:i w:val="0"/>
           <w:sz w:val="22"/>
         </w:rPr>
-        <w:t>.</w:t>
+        <w:t>, improving performance, scalability, and pipeline efficiency.</w:t>
       </w:r>
     </w:p>
     <w:p>
@@ -3070,7 +3079,7 @@
           <w:i w:val="0"/>
           <w:sz w:val="22"/>
         </w:rPr>
-        <w:t xml:space="preserve">Migrated large-scale processing workloads from </w:t>
+        <w:t xml:space="preserve">Developed </w:t>
       </w:r>
       <w:r>
         <w:rPr>
@@ -3078,7 +3087,7 @@
           <w:i w:val="0"/>
           <w:sz w:val="22"/>
         </w:rPr>
-        <w:t>Hive</w:t>
+        <w:t>RESTful microservices</w:t>
       </w:r>
       <w:r>
         <w:rPr>
@@ -3086,7 +3095,7 @@
           <w:i w:val="0"/>
           <w:sz w:val="22"/>
         </w:rPr>
-        <w:t xml:space="preserve"> to </w:t>
+        <w:t xml:space="preserve"> with </w:t>
       </w:r>
       <w:r>
         <w:rPr>
@@ -3094,7 +3103,7 @@
           <w:i w:val="0"/>
           <w:sz w:val="22"/>
         </w:rPr>
-        <w:t>Apache Spark/PySpark</w:t>
+        <w:t>OAuth 2.0</w:t>
       </w:r>
       <w:r>
         <w:rPr>
@@ -3102,7 +3111,7 @@
           <w:i w:val="0"/>
           <w:sz w:val="22"/>
         </w:rPr>
-        <w:t xml:space="preserve">, and moved </w:t>
+        <w:t xml:space="preserve"> and API versioning, and designed </w:t>
       </w:r>
       <w:r>
         <w:rPr>
@@ -3110,7 +3119,7 @@
           <w:i w:val="0"/>
           <w:sz w:val="22"/>
         </w:rPr>
-        <w:t>Sqoop/Hadoop</w:t>
+        <w:t>MongoDB</w:t>
       </w:r>
       <w:r>
         <w:rPr>
@@ -3118,7 +3127,7 @@
           <w:i w:val="0"/>
           <w:sz w:val="22"/>
         </w:rPr>
-        <w:t xml:space="preserve"> ingestion to </w:t>
+        <w:t xml:space="preserve"> data models with </w:t>
       </w:r>
       <w:r>
         <w:rPr>
@@ -3126,7 +3135,7 @@
           <w:i w:val="0"/>
           <w:sz w:val="22"/>
         </w:rPr>
-        <w:t>Azure Data Services</w:t>
+        <w:t>Python/Java</w:t>
       </w:r>
       <w:r>
         <w:rPr>
@@ -3134,7 +3143,43 @@
           <w:i w:val="0"/>
           <w:sz w:val="22"/>
         </w:rPr>
-        <w:t>, improving performance, scalability, and pipeline efficiency.</w:t>
+        <w:t xml:space="preserve"> validation scripts (UDFs) to improve data quality and consistency.</w:t>
+      </w:r>
+    </w:p>
+    <w:p>
+      <w:pPr>
+        <w:spacing w:before="120" w:after="80"/>
+        <w:pBdr>
+          <w:bottom w:val="single" w:sz="6" w:space="1" w:color="808080"/>
+        </w:pBdr>
+      </w:pPr>
+      <w:r>
+        <w:rPr>
+          <w:b/>
+          <w:sz w:val="28"/>
+        </w:rPr>
+        <w:t>PROJECTS</w:t>
+      </w:r>
+    </w:p>
+    <w:p>
+      <w:pPr>
+        <w:spacing w:after="40"/>
+      </w:pPr>
+      <w:r>
+        <w:rPr>
+          <w:b/>
+          <w:i w:val="0"/>
+          <w:sz w:val="22"/>
+        </w:rPr>
+        <w:t>Agentic AI-Based Ticket Automation System</w:t>
+      </w:r>
+      <w:r>
+        <w:rPr>
+          <w:b w:val="0"/>
+          <w:i w:val="0"/>
+          <w:sz w:val="22"/>
+        </w:rPr>
+        <w:t xml:space="preserve"> | SecureGPT, LLaMA, AWS SQS, JIRA, NIST-CSF</w:t>
       </w:r>
     </w:p>
     <w:p>
@@ -3159,7 +3204,7 @@
           <w:i w:val="0"/>
           <w:sz w:val="22"/>
         </w:rPr>
-        <w:t xml:space="preserve">Developed </w:t>
+        <w:t xml:space="preserve">Built an </w:t>
       </w:r>
       <w:r>
         <w:rPr>
@@ -3167,7 +3212,7 @@
           <w:i w:val="0"/>
           <w:sz w:val="22"/>
         </w:rPr>
-        <w:t>RESTful microservices</w:t>
+        <w:t>agentic AI</w:t>
       </w:r>
       <w:r>
         <w:rPr>
@@ -3175,7 +3220,7 @@
           <w:i w:val="0"/>
           <w:sz w:val="22"/>
         </w:rPr>
-        <w:t xml:space="preserve"> with </w:t>
+        <w:t xml:space="preserve"> pipeline with </w:t>
       </w:r>
       <w:r>
         <w:rPr>
@@ -3183,7 +3228,7 @@
           <w:i w:val="0"/>
           <w:sz w:val="22"/>
         </w:rPr>
-        <w:t>OAuth 2.0</w:t>
+        <w:t>SecureGPT</w:t>
       </w:r>
       <w:r>
         <w:rPr>
@@ -3191,7 +3236,7 @@
           <w:i w:val="0"/>
           <w:sz w:val="22"/>
         </w:rPr>
-        <w:t xml:space="preserve"> and API versioning, and designed </w:t>
+        <w:t xml:space="preserve"> and </w:t>
       </w:r>
       <w:r>
         <w:rPr>
@@ -3199,7 +3244,7 @@
           <w:i w:val="0"/>
           <w:sz w:val="22"/>
         </w:rPr>
-        <w:t>MongoDB</w:t>
+        <w:t>LLaMA</w:t>
       </w:r>
       <w:r>
         <w:rPr>
@@ -3207,7 +3252,7 @@
           <w:i w:val="0"/>
           <w:sz w:val="22"/>
         </w:rPr>
-        <w:t xml:space="preserve"> data models with </w:t>
+        <w:t xml:space="preserve"> on </w:t>
       </w:r>
       <w:r>
         <w:rPr>
@@ -3215,7 +3260,7 @@
           <w:i w:val="0"/>
           <w:sz w:val="22"/>
         </w:rPr>
-        <w:t>Python/Java</w:t>
+        <w:t>AWS SQS</w:t>
       </w:r>
       <w:r>
         <w:rPr>
@@ -3223,7 +3268,144 @@
           <w:i w:val="0"/>
           <w:sz w:val="22"/>
         </w:rPr>
-        <w:t xml:space="preserve"> validation scripts (UDFs) to improve data quality and consistency.</w:t>
+        <w:t xml:space="preserve"> event queues that monitors cybersecurity threats and auto-generates </w:t>
+      </w:r>
+      <w:r>
+        <w:rPr>
+          <w:b/>
+          <w:i w:val="0"/>
+          <w:sz w:val="22"/>
+        </w:rPr>
+        <w:t>JIRA</w:t>
+      </w:r>
+      <w:r>
+        <w:rPr>
+          <w:b w:val="0"/>
+          <w:i w:val="0"/>
+          <w:sz w:val="22"/>
+        </w:rPr>
+        <w:t xml:space="preserve"> tickets under </w:t>
+      </w:r>
+      <w:r>
+        <w:rPr>
+          <w:b/>
+          <w:i w:val="0"/>
+          <w:sz w:val="22"/>
+        </w:rPr>
+        <w:t>NIST-CSF</w:t>
+      </w:r>
+      <w:r>
+        <w:rPr>
+          <w:b w:val="0"/>
+          <w:i w:val="0"/>
+          <w:sz w:val="22"/>
+        </w:rPr>
+        <w:t xml:space="preserve">, reaching </w:t>
+      </w:r>
+      <w:r>
+        <w:rPr>
+          <w:b/>
+          <w:i w:val="0"/>
+          <w:sz w:val="22"/>
+        </w:rPr>
+        <w:t>93% automation accuracy</w:t>
+      </w:r>
+      <w:r>
+        <w:rPr>
+          <w:b w:val="0"/>
+          <w:i w:val="0"/>
+          <w:sz w:val="22"/>
+        </w:rPr>
+        <w:t xml:space="preserve"> and cutting triage time by </w:t>
+      </w:r>
+      <w:r>
+        <w:rPr>
+          <w:b/>
+          <w:i w:val="0"/>
+          <w:sz w:val="22"/>
+        </w:rPr>
+        <w:t>70%</w:t>
+      </w:r>
+      <w:r>
+        <w:rPr>
+          <w:b w:val="0"/>
+          <w:i w:val="0"/>
+          <w:sz w:val="22"/>
+        </w:rPr>
+        <w:t>.</w:t>
+      </w:r>
+    </w:p>
+    <w:p>
+      <w:pPr>
+        <w:tabs>
+          <w:tab w:pos="475" w:val="left"/>
+        </w:tabs>
+        <w:spacing w:after="20"/>
+        <w:ind w:left="475" w:hanging="331"/>
+        <w:jc w:val="both"/>
+      </w:pPr>
+      <w:r>
+        <w:rPr>
+          <w:sz w:val="22"/>
+        </w:rPr>
+        <w:t>•</w:t>
+        <w:tab/>
+      </w:r>
+      <w:r>
+        <w:rPr>
+          <w:b w:val="0"/>
+          <w:i w:val="0"/>
+          <w:sz w:val="22"/>
+        </w:rPr>
+        <w:t xml:space="preserve">Used </w:t>
+      </w:r>
+      <w:r>
+        <w:rPr>
+          <w:b/>
+          <w:i w:val="0"/>
+          <w:sz w:val="22"/>
+        </w:rPr>
+        <w:t>LLM prompt engineering</w:t>
+      </w:r>
+      <w:r>
+        <w:rPr>
+          <w:b w:val="0"/>
+          <w:i w:val="0"/>
+          <w:sz w:val="22"/>
+        </w:rPr>
+        <w:t xml:space="preserve"> to classify and rank events, improving scalability by </w:t>
+      </w:r>
+      <w:r>
+        <w:rPr>
+          <w:b/>
+          <w:i w:val="0"/>
+          <w:sz w:val="22"/>
+        </w:rPr>
+        <w:t>50%</w:t>
+      </w:r>
+      <w:r>
+        <w:rPr>
+          <w:b w:val="0"/>
+          <w:i w:val="0"/>
+          <w:sz w:val="22"/>
+        </w:rPr>
+        <w:t xml:space="preserve"> and cutting operational risk by </w:t>
+      </w:r>
+      <w:r>
+        <w:rPr>
+          <w:b/>
+          <w:i w:val="0"/>
+          <w:sz w:val="22"/>
+        </w:rPr>
+        <w:t>40%</w:t>
+      </w:r>
+      <w:r>
+        <w:rPr>
+          <w:b w:val="0"/>
+          <w:i w:val="0"/>
+          <w:sz w:val="22"/>
+        </w:rPr>
+        <w:t>.</w:t>
       </w:r>
     </w:p>
     <w:p>

</xml_diff>

<commit_message>
Keep every resume bullet and skill line to two lines
Co-Authored-By: Claude Opus 5.5 <noreply@anthropic.com>
Claude-Session: https://claude.ai/code/session_013uu8YLK93nR2ygpNvDWsMr
</commit_message>
<xml_diff>
--- a/resume/Ritesh_Somashekar_AI_ML_Engineer_GMU_Carelon.docx
+++ b/resume/Ritesh_Somashekar_AI_ML_Engineer_GMU_Carelon.docx
@@ -124,7 +124,7 @@
           <w:i w:val="0"/>
           <w:sz w:val="22"/>
         </w:rPr>
-        <w:t xml:space="preserve"> of experience progressing from </w:t>
+        <w:t xml:space="preserve"> progressing from </w:t>
       </w:r>
       <w:r>
         <w:rPr>
@@ -188,7 +188,7 @@
           <w:i w:val="0"/>
           <w:sz w:val="22"/>
         </w:rPr>
-        <w:t xml:space="preserve">, </w:t>
+        <w:t xml:space="preserve"> and </w:t>
       </w:r>
       <w:r>
         <w:rPr>
@@ -204,7 +204,7 @@
           <w:i w:val="0"/>
           <w:sz w:val="22"/>
         </w:rPr>
-        <w:t xml:space="preserve">, and </w:t>
+        <w:t xml:space="preserve">; published at </w:t>
       </w:r>
       <w:r>
         <w:rPr>
@@ -212,7 +212,7 @@
           <w:i w:val="0"/>
           <w:sz w:val="22"/>
         </w:rPr>
-        <w:t>enterprise data pipelines</w:t>
+        <w:t>ACM WSDM '26</w:t>
       </w:r>
       <w:r>
         <w:rPr>
@@ -220,7 +220,7 @@
           <w:i w:val="0"/>
           <w:sz w:val="22"/>
         </w:rPr>
-        <w:t xml:space="preserve"> across healthcare and public safety. Published researcher (</w:t>
+        <w:t xml:space="preserve"> and </w:t>
       </w:r>
       <w:r>
         <w:rPr>
@@ -228,39 +228,7 @@
           <w:i w:val="0"/>
           <w:sz w:val="22"/>
         </w:rPr>
-        <w:t>ACM WSDM '26</w:t>
-      </w:r>
-      <w:r>
-        <w:rPr>
-          <w:b w:val="0"/>
-          <w:i w:val="0"/>
-          <w:sz w:val="22"/>
-        </w:rPr>
-        <w:t xml:space="preserve">, </w:t>
-      </w:r>
-      <w:r>
-        <w:rPr>
-          <w:b/>
-          <w:i w:val="0"/>
-          <w:sz w:val="22"/>
-        </w:rPr>
         <w:t>IEEE PST 2026</w:t>
-      </w:r>
-      <w:r>
-        <w:rPr>
-          <w:b w:val="0"/>
-          <w:i w:val="0"/>
-          <w:sz w:val="22"/>
-        </w:rPr>
-        <w:t xml:space="preserve">) with hands-on expertise in </w:t>
-      </w:r>
-      <w:r>
-        <w:rPr>
-          <w:b/>
-          <w:i w:val="0"/>
-          <w:sz w:val="22"/>
-        </w:rPr>
-        <w:t>Llama 3, LlamaIndex, ChromaDB, pgvector, FAISS, Hugging Face, and PyTorch</w:t>
       </w:r>
       <w:r>
         <w:rPr>
@@ -293,7 +261,7 @@
           <w:i w:val="0"/>
           <w:sz w:val="22"/>
         </w:rPr>
-        <w:t xml:space="preserve">Strong background in </w:t>
+        <w:t xml:space="preserve">Skilled in </w:t>
       </w:r>
       <w:r>
         <w:rPr>
@@ -301,7 +269,7 @@
           <w:i w:val="0"/>
           <w:sz w:val="22"/>
         </w:rPr>
-        <w:t>data engineering</w:t>
+        <w:t>Llama 3, LlamaIndex, ChromaDB, pgvector, PyTorch, Airflow, Spark,</w:t>
       </w:r>
       <w:r>
         <w:rPr>
@@ -309,7 +277,7 @@
           <w:i w:val="0"/>
           <w:sz w:val="22"/>
         </w:rPr>
-        <w:t xml:space="preserve"> with </w:t>
+        <w:t xml:space="preserve"> and </w:t>
       </w:r>
       <w:r>
         <w:rPr>
@@ -317,7 +285,7 @@
           <w:i w:val="0"/>
           <w:sz w:val="22"/>
         </w:rPr>
-        <w:t>Apache Airflow, Spark/PySpark, Snowflake, and Databricks</w:t>
+        <w:t>Snowflake</w:t>
       </w:r>
       <w:r>
         <w:rPr>
@@ -325,7 +293,7 @@
           <w:i w:val="0"/>
           <w:sz w:val="22"/>
         </w:rPr>
-        <w:t xml:space="preserve">, and </w:t>
+        <w:t xml:space="preserve"> on </w:t>
       </w:r>
       <w:r>
         <w:rPr>
@@ -333,7 +301,7 @@
           <w:i w:val="0"/>
           <w:sz w:val="22"/>
         </w:rPr>
-        <w:t>cloud pipelines on AWS (S3, Lambda, Athena, Glue, SageMaker)</w:t>
+        <w:t>AWS</w:t>
       </w:r>
       <w:r>
         <w:rPr>
@@ -357,7 +325,7 @@
           <w:i w:val="0"/>
           <w:sz w:val="22"/>
         </w:rPr>
-        <w:t xml:space="preserve">, with a focus on </w:t>
+        <w:t xml:space="preserve">, with </w:t>
       </w:r>
       <w:r>
         <w:rPr>
@@ -365,6 +333,54 @@
           <w:i w:val="0"/>
           <w:sz w:val="22"/>
         </w:rPr>
+        <w:t>MLOps</w:t>
+      </w:r>
+      <w:r>
+        <w:rPr>
+          <w:b w:val="0"/>
+          <w:i w:val="0"/>
+          <w:sz w:val="22"/>
+        </w:rPr>
+        <w:t xml:space="preserve"> via </w:t>
+      </w:r>
+      <w:r>
+        <w:rPr>
+          <w:b/>
+          <w:i w:val="0"/>
+          <w:sz w:val="22"/>
+        </w:rPr>
+        <w:t>MLflow, Docker, Kubernetes, FastAPI,</w:t>
+      </w:r>
+      <w:r>
+        <w:rPr>
+          <w:b w:val="0"/>
+          <w:i w:val="0"/>
+          <w:sz w:val="22"/>
+        </w:rPr>
+        <w:t xml:space="preserve"> and </w:t>
+      </w:r>
+      <w:r>
+        <w:rPr>
+          <w:b/>
+          <w:i w:val="0"/>
+          <w:sz w:val="22"/>
+        </w:rPr>
+        <w:t>CI/CD</w:t>
+      </w:r>
+      <w:r>
+        <w:rPr>
+          <w:b w:val="0"/>
+          <w:i w:val="0"/>
+          <w:sz w:val="22"/>
+        </w:rPr>
+        <w:t xml:space="preserve"> for </w:t>
+      </w:r>
+      <w:r>
+        <w:rPr>
+          <w:b/>
+          <w:i w:val="0"/>
+          <w:sz w:val="22"/>
+        </w:rPr>
         <w:t>HIPAA-compliant</w:t>
       </w:r>
       <w:r>
@@ -373,55 +389,7 @@
           <w:i w:val="0"/>
           <w:sz w:val="22"/>
         </w:rPr>
-        <w:t xml:space="preserve"> healthcare data. Experienced in </w:t>
-      </w:r>
-      <w:r>
-        <w:rPr>
-          <w:b/>
-          <w:i w:val="0"/>
-          <w:sz w:val="22"/>
-        </w:rPr>
-        <w:t>MLOps</w:t>
-      </w:r>
-      <w:r>
-        <w:rPr>
-          <w:b w:val="0"/>
-          <w:i w:val="0"/>
-          <w:sz w:val="22"/>
-        </w:rPr>
-        <w:t xml:space="preserve"> using </w:t>
-      </w:r>
-      <w:r>
-        <w:rPr>
-          <w:b/>
-          <w:i w:val="0"/>
-          <w:sz w:val="22"/>
-        </w:rPr>
-        <w:t>MLflow, Docker, Kubernetes, FastAPI,</w:t>
-      </w:r>
-      <w:r>
-        <w:rPr>
-          <w:b w:val="0"/>
-          <w:i w:val="0"/>
-          <w:sz w:val="22"/>
-        </w:rPr>
-        <w:t xml:space="preserve"> and </w:t>
-      </w:r>
-      <w:r>
-        <w:rPr>
-          <w:b/>
-          <w:i w:val="0"/>
-          <w:sz w:val="22"/>
-        </w:rPr>
-        <w:t>CI/CD pipelines</w:t>
-      </w:r>
-      <w:r>
-        <w:rPr>
-          <w:b w:val="0"/>
-          <w:i w:val="0"/>
-          <w:sz w:val="22"/>
-        </w:rPr>
-        <w:t>.</w:t>
+        <w:t xml:space="preserve"> data.</w:t>
       </w:r>
     </w:p>
     <w:p>
@@ -587,7 +555,7 @@
           <w:i w:val="0"/>
           <w:sz w:val="22"/>
         </w:rPr>
-        <w:t xml:space="preserve"> Retrieval-Augmented Generation (RAG), Chunking, Embeddings (Sentence Transformers, all-mpnet-base-v2), Metadata Filtering, Top-K Retrieval, Context Assembly, Grounding, LlamaIndex, Vector Databases (ChromaDB, pgvector, FAISS), Llama 3/3.1, Ollama, Prompt Engineering, Agentic AI, LoRA/PEFT, Quantization-Aware Training (QAT)</w:t>
+        <w:t xml:space="preserve"> RAG, Chunking, Embeddings (all-mpnet-base-v2), Metadata Filtering, Top-K Retrieval, Context Assembly, LlamaIndex, ChromaDB, pgvector, FAISS, Llama 3/3.1, Ollama, Prompt Engineering, Agentic AI, LoRA/PEFT, QAT</w:t>
       </w:r>
     </w:p>
     <w:p>
@@ -633,7 +601,7 @@
           <w:i w:val="0"/>
           <w:sz w:val="22"/>
         </w:rPr>
-        <w:t xml:space="preserve"> Supervised &amp; Unsupervised Learning, Transformers, BERT, BioBERT, Hugging Face, XGBoost, LightGBM, Graph Analytics, Ensemble Models, Time Series Forecasting, Anomaly Detection, Feature Engineering, Model Explainability (SHAP)</w:t>
+        <w:t xml:space="preserve"> Transformers, BERT, BioBERT, Hugging Face, XGBoost, LightGBM, Graph Analytics, Ensemble Models, Time Series Forecasting, Anomaly Detection, Feature Engineering, SHAP</w:t>
       </w:r>
     </w:p>
     <w:p>
@@ -852,7 +820,7 @@
           <w:i w:val="0"/>
           <w:sz w:val="22"/>
         </w:rPr>
-        <w:t xml:space="preserve"> (published at </w:t>
+        <w:t xml:space="preserve"> (</w:t>
       </w:r>
       <w:r>
         <w:rPr>
@@ -868,7 +836,7 @@
           <w:i w:val="0"/>
           <w:sz w:val="22"/>
         </w:rPr>
-        <w:t xml:space="preserve">), an online conversational AI training platform for 9-1-1 call-takers built with </w:t>
+        <w:t xml:space="preserve">), a conversational AI platform for 9-1-1 call-taker training with </w:t>
       </w:r>
       <w:r>
         <w:rPr>
@@ -900,7 +868,7 @@
           <w:i w:val="0"/>
           <w:sz w:val="22"/>
         </w:rPr>
-        <w:t xml:space="preserve"> to generate call scenarios from CAD data, deliver </w:t>
+        <w:t xml:space="preserve"> to generate scenarios from CAD data and deliver </w:t>
       </w:r>
       <w:r>
         <w:rPr>
@@ -916,7 +884,7 @@
           <w:i w:val="0"/>
           <w:sz w:val="22"/>
         </w:rPr>
-        <w:t>, and produce post-call reflection analytics.</w:t>
+        <w:t>.</w:t>
       </w:r>
     </w:p>
     <w:p>
@@ -957,7 +925,7 @@
           <w:i w:val="0"/>
           <w:sz w:val="22"/>
         </w:rPr>
-        <w:t xml:space="preserve"> (published at </w:t>
+        <w:t xml:space="preserve"> (</w:t>
       </w:r>
       <w:r>
         <w:rPr>
@@ -989,7 +957,7 @@
           <w:i w:val="0"/>
           <w:sz w:val="22"/>
         </w:rPr>
-        <w:t xml:space="preserve"> system that grounds </w:t>
+        <w:t xml:space="preserve"> system grounding </w:t>
       </w:r>
       <w:r>
         <w:rPr>
@@ -1005,7 +973,7 @@
           <w:i w:val="0"/>
           <w:sz w:val="22"/>
         </w:rPr>
-        <w:t xml:space="preserve"> generation in validated emergency-response knowledge, producing protocol-compliant voice and text scenarios on commodity hardware with </w:t>
+        <w:t xml:space="preserve"> in emergency protocols, reaching </w:t>
       </w:r>
       <w:r>
         <w:rPr>
@@ -1053,7 +1021,7 @@
           <w:i w:val="0"/>
           <w:sz w:val="22"/>
         </w:rPr>
-        <w:t>, with no commercial API dependency.</w:t>
+        <w:t xml:space="preserve"> on local hardware.</w:t>
       </w:r>
     </w:p>
     <w:p>
@@ -1078,7 +1046,7 @@
           <w:i w:val="0"/>
           <w:sz w:val="22"/>
         </w:rPr>
-        <w:t>Led the RAG knowledge-base and data pipeline for both platforms</w:t>
+        <w:t>Led the RAG knowledge base and data pipeline for both platforms</w:t>
       </w:r>
       <w:r>
         <w:rPr>
@@ -1086,7 +1054,7 @@
           <w:i w:val="0"/>
           <w:sz w:val="22"/>
         </w:rPr>
-        <w:t xml:space="preserve"> in </w:t>
+        <w:t xml:space="preserve">: OCR parsing, abbreviation expansion, completeness checks, and segmentation of </w:t>
       </w:r>
       <w:r>
         <w:rPr>
@@ -1094,7 +1062,7 @@
           <w:i w:val="0"/>
           <w:sz w:val="22"/>
         </w:rPr>
-        <w:t>Python</w:t>
+        <w:t>160 gold-standard scenarios</w:t>
       </w:r>
       <w:r>
         <w:rPr>
@@ -1102,23 +1070,7 @@
           <w:i w:val="0"/>
           <w:sz w:val="22"/>
         </w:rPr>
-        <w:t xml:space="preserve">, covering OCR parsing, abbreviation expansion, completeness checks, segmentation, and standardization of </w:t>
-      </w:r>
-      <w:r>
-        <w:rPr>
-          <w:b/>
-          <w:i w:val="0"/>
-          <w:sz w:val="22"/>
-        </w:rPr>
-        <w:t>160 gold-standard scenarios</w:t>
-      </w:r>
-      <w:r>
-        <w:rPr>
-          <w:b w:val="0"/>
-          <w:i w:val="0"/>
-          <w:sz w:val="22"/>
-        </w:rPr>
-        <w:t xml:space="preserve">; the curated knowledge base cut hallucinations from </w:t>
+        <w:t xml:space="preserve">, cutting hallucinations from </w:t>
       </w:r>
       <w:r>
         <w:rPr>
@@ -1280,7 +1232,7 @@
           <w:i w:val="0"/>
           <w:sz w:val="22"/>
         </w:rPr>
-        <w:t xml:space="preserve"> to ground </w:t>
+        <w:t xml:space="preserve"> grounding </w:t>
       </w:r>
       <w:r>
         <w:rPr>
@@ -1296,7 +1248,7 @@
           <w:i w:val="0"/>
           <w:sz w:val="22"/>
         </w:rPr>
-        <w:t xml:space="preserve"> responses in retrieved scenarios, tuning temperature, token budgets, and context windows to reach </w:t>
+        <w:t xml:space="preserve"> in retrieved scenarios, tuning temperature, token budgets, and context windows for </w:t>
       </w:r>
       <w:r>
         <w:rPr>
@@ -1304,7 +1256,7 @@
           <w:i w:val="0"/>
           <w:sz w:val="22"/>
         </w:rPr>
-        <w:t>960 ms (text)</w:t>
+        <w:t>960 ms</w:t>
       </w:r>
       <w:r>
         <w:rPr>
@@ -1312,7 +1264,7 @@
           <w:i w:val="0"/>
           <w:sz w:val="22"/>
         </w:rPr>
-        <w:t xml:space="preserve"> and </w:t>
+        <w:t xml:space="preserve"> text and </w:t>
       </w:r>
       <w:r>
         <w:rPr>
@@ -1320,7 +1272,7 @@
           <w:i w:val="0"/>
           <w:sz w:val="22"/>
         </w:rPr>
-        <w:t>1.3 s (voice)</w:t>
+        <w:t>1.3 s</w:t>
       </w:r>
       <w:r>
         <w:rPr>
@@ -1328,7 +1280,7 @@
           <w:i w:val="0"/>
           <w:sz w:val="22"/>
         </w:rPr>
-        <w:t xml:space="preserve"> mean latency, with fallback generation for resilience.</w:t>
+        <w:t xml:space="preserve"> voice latency.</w:t>
       </w:r>
     </w:p>
     <w:p>
@@ -1361,7 +1313,7 @@
           <w:i w:val="0"/>
           <w:sz w:val="22"/>
         </w:rPr>
-        <w:t xml:space="preserve">, building </w:t>
+        <w:t xml:space="preserve">: </w:t>
       </w:r>
       <w:r>
         <w:rPr>
@@ -1377,7 +1329,7 @@
           <w:i w:val="0"/>
           <w:sz w:val="22"/>
         </w:rPr>
-        <w:t xml:space="preserve"> with a </w:t>
+        <w:t xml:space="preserve"> with a NENA-based </w:t>
       </w:r>
       <w:r>
         <w:rPr>
@@ -1385,7 +1337,7 @@
           <w:i w:val="0"/>
           <w:sz w:val="22"/>
         </w:rPr>
-        <w:t>911 ontology validator</w:t>
+        <w:t>ontology validator</w:t>
       </w:r>
       <w:r>
         <w:rPr>
@@ -1393,7 +1345,7 @@
           <w:i w:val="0"/>
           <w:sz w:val="22"/>
         </w:rPr>
-        <w:t xml:space="preserve"> (NENA standards, DPSC procedures), rule-based and </w:t>
+        <w:t xml:space="preserve">, </w:t>
       </w:r>
       <w:r>
         <w:rPr>
@@ -1401,7 +1353,7 @@
           <w:i w:val="0"/>
           <w:sz w:val="22"/>
         </w:rPr>
-        <w:t>LLM-based semantic checks</w:t>
+        <w:t>LLM</w:t>
       </w:r>
       <w:r>
         <w:rPr>
@@ -1409,7 +1361,7 @@
           <w:i w:val="0"/>
           <w:sz w:val="22"/>
         </w:rPr>
-        <w:t xml:space="preserve">, </w:t>
+        <w:t xml:space="preserve"> and </w:t>
       </w:r>
       <w:r>
         <w:rPr>
@@ -1417,7 +1369,7 @@
           <w:i w:val="0"/>
           <w:sz w:val="22"/>
         </w:rPr>
-        <w:t>NLI-based hallucination detection</w:t>
+        <w:t>NLI-based hallucination checks</w:t>
       </w:r>
       <w:r>
         <w:rPr>
@@ -1425,7 +1377,7 @@
           <w:i w:val="0"/>
           <w:sz w:val="22"/>
         </w:rPr>
-        <w:t xml:space="preserve">, PASS/REVIEW/FAIL confidence scoring, and an </w:t>
+        <w:t xml:space="preserve">, PASS/REVIEW/FAIL scoring, and an </w:t>
       </w:r>
       <w:r>
         <w:rPr>
@@ -1433,7 +1385,7 @@
           <w:i w:val="0"/>
           <w:sz w:val="22"/>
         </w:rPr>
-        <w:t>85% cosine-similarity</w:t>
+        <w:t>85% similarity</w:t>
       </w:r>
       <w:r>
         <w:rPr>
@@ -1441,7 +1393,7 @@
           <w:i w:val="0"/>
           <w:sz w:val="22"/>
         </w:rPr>
-        <w:t xml:space="preserve"> quality gate.</w:t>
+        <w:t xml:space="preserve"> gate.</w:t>
       </w:r>
     </w:p>
     <w:p>
@@ -1555,7 +1507,7 @@
           <w:i w:val="0"/>
           <w:sz w:val="22"/>
         </w:rPr>
-        <w:t xml:space="preserve">Developed a </w:t>
+        <w:t xml:space="preserve">Built a </w:t>
       </w:r>
       <w:r>
         <w:rPr>
@@ -1579,7 +1531,7 @@
           <w:i w:val="0"/>
           <w:sz w:val="22"/>
         </w:rPr>
-        <w:t>LlamaIndex</w:t>
+        <w:t>LlamaIndex, pgvector,</w:t>
       </w:r>
       <w:r>
         <w:rPr>
@@ -1587,7 +1539,7 @@
           <w:i w:val="0"/>
           <w:sz w:val="22"/>
         </w:rPr>
-        <w:t xml:space="preserve">, </w:t>
+        <w:t xml:space="preserve"> and </w:t>
       </w:r>
       <w:r>
         <w:rPr>
@@ -1595,7 +1547,7 @@
           <w:i w:val="0"/>
           <w:sz w:val="22"/>
         </w:rPr>
-        <w:t>pgvector</w:t>
+        <w:t>FAISS</w:t>
       </w:r>
       <w:r>
         <w:rPr>
@@ -1603,7 +1555,7 @@
           <w:i w:val="0"/>
           <w:sz w:val="22"/>
         </w:rPr>
-        <w:t xml:space="preserve">, and </w:t>
+        <w:t xml:space="preserve">, raising </w:t>
       </w:r>
       <w:r>
         <w:rPr>
@@ -1611,7 +1563,7 @@
           <w:i w:val="0"/>
           <w:sz w:val="22"/>
         </w:rPr>
-        <w:t>FAISS</w:t>
+        <w:t>recall@10 from 61% to 88%</w:t>
       </w:r>
       <w:r>
         <w:rPr>
@@ -1619,7 +1571,7 @@
           <w:i w:val="0"/>
           <w:sz w:val="22"/>
         </w:rPr>
-        <w:t xml:space="preserve">, optimizing chunking, embeddings, retrieval, and context assembly to raise </w:t>
+        <w:t xml:space="preserve"> (evaluated with </w:t>
       </w:r>
       <w:r>
         <w:rPr>
@@ -1627,7 +1579,7 @@
           <w:i w:val="0"/>
           <w:sz w:val="22"/>
         </w:rPr>
-        <w:t>recall@10 from 61% to 88%</w:t>
+        <w:t>RAGAS</w:t>
       </w:r>
       <w:r>
         <w:rPr>
@@ -1635,7 +1587,7 @@
           <w:i w:val="0"/>
           <w:sz w:val="22"/>
         </w:rPr>
-        <w:t xml:space="preserve">, evaluated with </w:t>
+        <w:t xml:space="preserve">) and serving </w:t>
       </w:r>
       <w:r>
         <w:rPr>
@@ -1643,7 +1595,7 @@
           <w:i w:val="0"/>
           <w:sz w:val="22"/>
         </w:rPr>
-        <w:t>RAGAS</w:t>
+        <w:t>40+ researchers</w:t>
       </w:r>
       <w:r>
         <w:rPr>
@@ -1651,23 +1603,7 @@
           <w:i w:val="0"/>
           <w:sz w:val="22"/>
         </w:rPr>
-        <w:t xml:space="preserve"> (faithfulness, answer relevance, context precision) and served to </w:t>
-      </w:r>
-      <w:r>
-        <w:rPr>
-          <w:b/>
-          <w:i w:val="0"/>
-          <w:sz w:val="22"/>
-        </w:rPr>
-        <w:t>40+ researchers</w:t>
-      </w:r>
-      <w:r>
-        <w:rPr>
-          <w:b w:val="0"/>
-          <w:i w:val="0"/>
-          <w:sz w:val="22"/>
-        </w:rPr>
-        <w:t xml:space="preserve"> at about </w:t>
+        <w:t xml:space="preserve"> at </w:t>
       </w:r>
       <w:r>
         <w:rPr>
@@ -1708,7 +1644,7 @@
           <w:i w:val="0"/>
           <w:sz w:val="22"/>
         </w:rPr>
-        <w:t xml:space="preserve">Applied </w:t>
+        <w:t xml:space="preserve">Built real-time </w:t>
       </w:r>
       <w:r>
         <w:rPr>
@@ -1716,7 +1652,7 @@
           <w:i w:val="0"/>
           <w:sz w:val="22"/>
         </w:rPr>
-        <w:t>graph-based analytics</w:t>
+        <w:t>trace-log analytics</w:t>
       </w:r>
       <w:r>
         <w:rPr>
@@ -1724,7 +1660,7 @@
           <w:i w:val="0"/>
           <w:sz w:val="22"/>
         </w:rPr>
-        <w:t xml:space="preserve"> and </w:t>
+        <w:t xml:space="preserve"> (event streams, Task Completion Rate, Average Field Latency, goal-alignment scoring) feeding an instructor </w:t>
       </w:r>
       <w:r>
         <w:rPr>
@@ -1732,7 +1668,7 @@
           <w:i w:val="0"/>
           <w:sz w:val="22"/>
         </w:rPr>
-        <w:t>ensemble models</w:t>
+        <w:t>performance dashboard</w:t>
       </w:r>
       <w:r>
         <w:rPr>
@@ -1740,39 +1676,7 @@
           <w:i w:val="0"/>
           <w:sz w:val="22"/>
         </w:rPr>
-        <w:t xml:space="preserve"> to large-scale disaster datasets on the </w:t>
-      </w:r>
-      <w:r>
-        <w:rPr>
-          <w:b/>
-          <w:i w:val="0"/>
-          <w:sz w:val="22"/>
-        </w:rPr>
-        <w:t>ORC Hopper HPC cluster</w:t>
-      </w:r>
-      <w:r>
-        <w:rPr>
-          <w:b w:val="0"/>
-          <w:i w:val="0"/>
-          <w:sz w:val="22"/>
-        </w:rPr>
-        <w:t xml:space="preserve">, forecasting community coping trends with an </w:t>
-      </w:r>
-      <w:r>
-        <w:rPr>
-          <w:b/>
-          <w:i w:val="0"/>
-          <w:sz w:val="22"/>
-        </w:rPr>
-        <w:t>RMSE of 0.89</w:t>
-      </w:r>
-      <w:r>
-        <w:rPr>
-          <w:b w:val="0"/>
-          <w:i w:val="0"/>
-          <w:sz w:val="22"/>
-        </w:rPr>
-        <w:t>.</w:t>
+        <w:t xml:space="preserve"> for adaptive feedback.</w:t>
       </w:r>
     </w:p>
     <w:p>
@@ -1797,7 +1701,7 @@
           <w:i w:val="0"/>
           <w:sz w:val="22"/>
         </w:rPr>
-        <w:t xml:space="preserve">Implemented </w:t>
+        <w:t xml:space="preserve">Applied </w:t>
       </w:r>
       <w:r>
         <w:rPr>
@@ -1805,7 +1709,7 @@
           <w:i w:val="0"/>
           <w:sz w:val="22"/>
         </w:rPr>
-        <w:t>model explainability</w:t>
+        <w:t>graph-based analytics</w:t>
       </w:r>
       <w:r>
         <w:rPr>
@@ -1813,7 +1717,7 @@
           <w:i w:val="0"/>
           <w:sz w:val="22"/>
         </w:rPr>
-        <w:t xml:space="preserve"> using </w:t>
+        <w:t xml:space="preserve"> and </w:t>
       </w:r>
       <w:r>
         <w:rPr>
@@ -1821,7 +1725,7 @@
           <w:i w:val="0"/>
           <w:sz w:val="22"/>
         </w:rPr>
-        <w:t>SHAP</w:t>
+        <w:t>ensemble models</w:t>
       </w:r>
       <w:r>
         <w:rPr>
@@ -1829,7 +1733,7 @@
           <w:i w:val="0"/>
           <w:sz w:val="22"/>
         </w:rPr>
-        <w:t xml:space="preserve"> for </w:t>
+        <w:t xml:space="preserve"> to large-scale disaster datasets on the </w:t>
       </w:r>
       <w:r>
         <w:rPr>
@@ -1837,7 +1741,7 @@
           <w:i w:val="0"/>
           <w:sz w:val="22"/>
         </w:rPr>
-        <w:t>intent classification</w:t>
+        <w:t>ORC Hopper HPC cluster</w:t>
       </w:r>
       <w:r>
         <w:rPr>
@@ -1845,7 +1749,7 @@
           <w:i w:val="0"/>
           <w:sz w:val="22"/>
         </w:rPr>
-        <w:t xml:space="preserve"> and </w:t>
+        <w:t xml:space="preserve">, forecasting community coping trends with an </w:t>
       </w:r>
       <w:r>
         <w:rPr>
@@ -1853,39 +1757,7 @@
           <w:i w:val="0"/>
           <w:sz w:val="22"/>
         </w:rPr>
-        <w:t>behavioral anomaly detection</w:t>
-      </w:r>
-      <w:r>
-        <w:rPr>
-          <w:b w:val="0"/>
-          <w:i w:val="0"/>
-          <w:sz w:val="22"/>
-        </w:rPr>
-        <w:t xml:space="preserve"> models, guiding threshold tuning and model governance; the </w:t>
-      </w:r>
-      <w:r>
-        <w:rPr>
-          <w:b/>
-          <w:i w:val="0"/>
-          <w:sz w:val="22"/>
-        </w:rPr>
-        <w:t>LightGBM</w:t>
-      </w:r>
-      <w:r>
-        <w:rPr>
-          <w:b w:val="0"/>
-          <w:i w:val="0"/>
-          <w:sz w:val="22"/>
-        </w:rPr>
-        <w:t xml:space="preserve"> anomaly detector reduced false positives by </w:t>
-      </w:r>
-      <w:r>
-        <w:rPr>
-          <w:b/>
-          <w:i w:val="0"/>
-          <w:sz w:val="22"/>
-        </w:rPr>
-        <w:t>25%</w:t>
+        <w:t>RMSE of 0.89</w:t>
       </w:r>
       <w:r>
         <w:rPr>
@@ -1918,7 +1790,7 @@
           <w:i w:val="0"/>
           <w:sz w:val="22"/>
         </w:rPr>
-        <w:t xml:space="preserve">Fine-tuned </w:t>
+        <w:t xml:space="preserve">Implemented </w:t>
       </w:r>
       <w:r>
         <w:rPr>
@@ -1926,7 +1798,7 @@
           <w:i w:val="0"/>
           <w:sz w:val="22"/>
         </w:rPr>
-        <w:t>Llama 3</w:t>
+        <w:t>model explainability</w:t>
       </w:r>
       <w:r>
         <w:rPr>
@@ -1934,7 +1806,7 @@
           <w:i w:val="0"/>
           <w:sz w:val="22"/>
         </w:rPr>
-        <w:t xml:space="preserve"> with </w:t>
+        <w:t xml:space="preserve"> using </w:t>
       </w:r>
       <w:r>
         <w:rPr>
@@ -1942,7 +1814,7 @@
           <w:i w:val="0"/>
           <w:sz w:val="22"/>
         </w:rPr>
-        <w:t>LoRA/PEFT</w:t>
+        <w:t>SHAP</w:t>
       </w:r>
       <w:r>
         <w:rPr>
@@ -1950,6 +1822,22 @@
           <w:i w:val="0"/>
           <w:sz w:val="22"/>
         </w:rPr>
+        <w:t xml:space="preserve"> for </w:t>
+      </w:r>
+      <w:r>
+        <w:rPr>
+          <w:b/>
+          <w:i w:val="0"/>
+          <w:sz w:val="22"/>
+        </w:rPr>
+        <w:t>intent classification</w:t>
+      </w:r>
+      <w:r>
+        <w:rPr>
+          <w:b w:val="0"/>
+          <w:i w:val="0"/>
+          <w:sz w:val="22"/>
+        </w:rPr>
         <w:t xml:space="preserve"> and </w:t>
       </w:r>
       <w:r>
@@ -1958,7 +1846,7 @@
           <w:i w:val="0"/>
           <w:sz w:val="22"/>
         </w:rPr>
-        <w:t>QAT</w:t>
+        <w:t>behavioral anomaly detection</w:t>
       </w:r>
       <w:r>
         <w:rPr>
@@ -1966,7 +1854,7 @@
           <w:i w:val="0"/>
           <w:sz w:val="22"/>
         </w:rPr>
-        <w:t xml:space="preserve">, cutting model size by </w:t>
+        <w:t xml:space="preserve"> models, guiding threshold tuning and model governance; the </w:t>
       </w:r>
       <w:r>
         <w:rPr>
@@ -1974,7 +1862,7 @@
           <w:i w:val="0"/>
           <w:sz w:val="22"/>
         </w:rPr>
-        <w:t>40%</w:t>
+        <w:t>LightGBM</w:t>
       </w:r>
       <w:r>
         <w:rPr>
@@ -1982,7 +1870,7 @@
           <w:i w:val="0"/>
           <w:sz w:val="22"/>
         </w:rPr>
-        <w:t xml:space="preserve"> within </w:t>
+        <w:t xml:space="preserve"> anomaly detector reduced false positives by </w:t>
       </w:r>
       <w:r>
         <w:rPr>
@@ -1990,7 +1878,7 @@
           <w:i w:val="0"/>
           <w:sz w:val="22"/>
         </w:rPr>
-        <w:t>3%</w:t>
+        <w:t>25%</w:t>
       </w:r>
       <w:r>
         <w:rPr>
@@ -1998,7 +1886,7 @@
           <w:i w:val="0"/>
           <w:sz w:val="22"/>
         </w:rPr>
-        <w:t xml:space="preserve"> of full-precision accuracy.</w:t>
+        <w:t>.</w:t>
       </w:r>
     </w:p>
     <w:p>
@@ -2023,7 +1911,7 @@
           <w:i w:val="0"/>
           <w:sz w:val="22"/>
         </w:rPr>
-        <w:t xml:space="preserve">Took models and RAG services from </w:t>
+        <w:t xml:space="preserve">Fine-tuned </w:t>
       </w:r>
       <w:r>
         <w:rPr>
@@ -2031,7 +1919,7 @@
           <w:i w:val="0"/>
           <w:sz w:val="22"/>
         </w:rPr>
-        <w:t>proof of concept to production</w:t>
+        <w:t>Llama 3</w:t>
       </w:r>
       <w:r>
         <w:rPr>
@@ -2047,7 +1935,7 @@
           <w:i w:val="0"/>
           <w:sz w:val="22"/>
         </w:rPr>
-        <w:t>MLflow</w:t>
+        <w:t>LoRA/PEFT</w:t>
       </w:r>
       <w:r>
         <w:rPr>
@@ -2055,7 +1943,7 @@
           <w:i w:val="0"/>
           <w:sz w:val="22"/>
         </w:rPr>
-        <w:t xml:space="preserve"> experiment tracking and model registry, </w:t>
+        <w:t xml:space="preserve"> and </w:t>
       </w:r>
       <w:r>
         <w:rPr>
@@ -2063,7 +1951,7 @@
           <w:i w:val="0"/>
           <w:sz w:val="22"/>
         </w:rPr>
-        <w:t>FastAPI</w:t>
+        <w:t>QAT</w:t>
       </w:r>
       <w:r>
         <w:rPr>
@@ -2071,7 +1959,7 @@
           <w:i w:val="0"/>
           <w:sz w:val="22"/>
         </w:rPr>
-        <w:t xml:space="preserve">, </w:t>
+        <w:t xml:space="preserve">, cutting model size by </w:t>
       </w:r>
       <w:r>
         <w:rPr>
@@ -2079,7 +1967,7 @@
           <w:i w:val="0"/>
           <w:sz w:val="22"/>
         </w:rPr>
-        <w:t>Docker</w:t>
+        <w:t>40%</w:t>
       </w:r>
       <w:r>
         <w:rPr>
@@ -2087,7 +1975,7 @@
           <w:i w:val="0"/>
           <w:sz w:val="22"/>
         </w:rPr>
-        <w:t xml:space="preserve">, and </w:t>
+        <w:t xml:space="preserve"> within </w:t>
       </w:r>
       <w:r>
         <w:rPr>
@@ -2095,7 +1983,7 @@
           <w:i w:val="0"/>
           <w:sz w:val="22"/>
         </w:rPr>
-        <w:t>CI/CD</w:t>
+        <w:t>3%</w:t>
       </w:r>
       <w:r>
         <w:rPr>
@@ -2103,74 +1991,7 @@
           <w:i w:val="0"/>
           <w:sz w:val="22"/>
         </w:rPr>
-        <w:t xml:space="preserve">, reducing release cycles from </w:t>
-      </w:r>
-      <w:r>
-        <w:rPr>
-          <w:b/>
-          <w:i w:val="0"/>
-          <w:sz w:val="22"/>
-        </w:rPr>
-        <w:t>2 weeks to 5 days</w:t>
-      </w:r>
-      <w:r>
-        <w:rPr>
-          <w:b w:val="0"/>
-          <w:i w:val="0"/>
-          <w:sz w:val="22"/>
-        </w:rPr>
-        <w:t xml:space="preserve"> and enabling </w:t>
-      </w:r>
-      <w:r>
-        <w:rPr>
-          <w:b/>
-          <w:i w:val="0"/>
-          <w:sz w:val="22"/>
-        </w:rPr>
-        <w:t>A/B testing</w:t>
-      </w:r>
-      <w:r>
-        <w:rPr>
-          <w:b w:val="0"/>
-          <w:i w:val="0"/>
-          <w:sz w:val="22"/>
-        </w:rPr>
-        <w:t xml:space="preserve"> of model and prompt versions.</w:t>
-      </w:r>
-    </w:p>
-    <w:p>
-      <w:pPr>
-        <w:tabs>
-          <w:tab w:pos="11592" w:val="right"/>
-        </w:tabs>
-        <w:spacing w:before="120" w:after="40"/>
-      </w:pPr>
-      <w:r>
-        <w:rPr>
-          <w:b/>
-          <w:sz w:val="24"/>
-        </w:rPr>
-        <w:t xml:space="preserve">Carelon Global Solutions (Elevance Health) </w:t>
-      </w:r>
-      <w:r>
-        <w:rPr>
-          <w:b/>
-        </w:rPr>
-        <w:t xml:space="preserve">| </w:t>
-      </w:r>
-      <w:r>
-        <w:rPr>
-          <w:b/>
-          <w:i/>
-        </w:rPr>
-        <w:t>Machine Learning Engineer</w:t>
-      </w:r>
-      <w:r>
-        <w:rPr>
-          <w:b/>
-        </w:rPr>
-        <w:tab/>
-        <w:t>Bengaluru, India | May 2022 - August 2023</w:t>
+        <w:t xml:space="preserve"> of full-precision accuracy.</w:t>
       </w:r>
     </w:p>
     <w:p>
@@ -2195,7 +2016,7 @@
           <w:i w:val="0"/>
           <w:sz w:val="22"/>
         </w:rPr>
-        <w:t xml:space="preserve">Built NLP models using </w:t>
+        <w:t xml:space="preserve">Took models and RAG services from </w:t>
       </w:r>
       <w:r>
         <w:rPr>
@@ -2203,7 +2024,7 @@
           <w:i w:val="0"/>
           <w:sz w:val="22"/>
         </w:rPr>
-        <w:t>BERT</w:t>
+        <w:t>proof of concept to production</w:t>
       </w:r>
       <w:r>
         <w:rPr>
@@ -2211,6 +2032,22 @@
           <w:i w:val="0"/>
           <w:sz w:val="22"/>
         </w:rPr>
+        <w:t xml:space="preserve"> with </w:t>
+      </w:r>
+      <w:r>
+        <w:rPr>
+          <w:b/>
+          <w:i w:val="0"/>
+          <w:sz w:val="22"/>
+        </w:rPr>
+        <w:t>MLflow, FastAPI, Docker,</w:t>
+      </w:r>
+      <w:r>
+        <w:rPr>
+          <w:b w:val="0"/>
+          <w:i w:val="0"/>
+          <w:sz w:val="22"/>
+        </w:rPr>
         <w:t xml:space="preserve"> and </w:t>
       </w:r>
       <w:r>
@@ -2219,7 +2056,7 @@
           <w:i w:val="0"/>
           <w:sz w:val="22"/>
         </w:rPr>
-        <w:t>BioBERT</w:t>
+        <w:t>CI/CD</w:t>
       </w:r>
       <w:r>
         <w:rPr>
@@ -2227,7 +2064,7 @@
           <w:i w:val="0"/>
           <w:sz w:val="22"/>
         </w:rPr>
-        <w:t xml:space="preserve"> for clinical entity extraction from unstructured medical text, achieving </w:t>
+        <w:t xml:space="preserve">, cutting release cycles from </w:t>
       </w:r>
       <w:r>
         <w:rPr>
@@ -2235,7 +2072,7 @@
           <w:i w:val="0"/>
           <w:sz w:val="22"/>
         </w:rPr>
-        <w:t>80% accuracy</w:t>
+        <w:t>2 weeks to 5 days</w:t>
       </w:r>
       <w:r>
         <w:rPr>
@@ -2243,7 +2080,7 @@
           <w:i w:val="0"/>
           <w:sz w:val="22"/>
         </w:rPr>
-        <w:t xml:space="preserve"> and reducing processing time by </w:t>
+        <w:t xml:space="preserve"> with </w:t>
       </w:r>
       <w:r>
         <w:rPr>
@@ -2251,7 +2088,7 @@
           <w:i w:val="0"/>
           <w:sz w:val="22"/>
         </w:rPr>
-        <w:t>55%</w:t>
+        <w:t>A/B testing</w:t>
       </w:r>
       <w:r>
         <w:rPr>
@@ -2260,6 +2097,41 @@
           <w:sz w:val="22"/>
         </w:rPr>
         <w:t>.</w:t>
+      </w:r>
+    </w:p>
+    <w:p>
+      <w:pPr>
+        <w:tabs>
+          <w:tab w:pos="11592" w:val="right"/>
+        </w:tabs>
+        <w:spacing w:before="120" w:after="40"/>
+      </w:pPr>
+      <w:r>
+        <w:rPr>
+          <w:b/>
+          <w:sz w:val="24"/>
+        </w:rPr>
+        <w:t xml:space="preserve">Carelon Global Solutions (Elevance Health) </w:t>
+      </w:r>
+      <w:r>
+        <w:rPr>
+          <w:b/>
+        </w:rPr>
+        <w:t xml:space="preserve">| </w:t>
+      </w:r>
+      <w:r>
+        <w:rPr>
+          <w:b/>
+          <w:i/>
+        </w:rPr>
+        <w:t>Machine Learning Engineer</w:t>
+      </w:r>
+      <w:r>
+        <w:rPr>
+          <w:b/>
+        </w:rPr>
+        <w:tab/>
+        <w:t>Bengaluru, India | May 2022 - August 2023</w:t>
       </w:r>
     </w:p>
     <w:p>
@@ -2284,7 +2156,7 @@
           <w:i w:val="0"/>
           <w:sz w:val="22"/>
         </w:rPr>
-        <w:t xml:space="preserve">Improved </w:t>
+        <w:t xml:space="preserve">Built NLP models using </w:t>
       </w:r>
       <w:r>
         <w:rPr>
@@ -2292,7 +2164,7 @@
           <w:i w:val="0"/>
           <w:sz w:val="22"/>
         </w:rPr>
-        <w:t>Scikit-learn</w:t>
+        <w:t>BERT</w:t>
       </w:r>
       <w:r>
         <w:rPr>
@@ -2308,7 +2180,7 @@
           <w:i w:val="0"/>
           <w:sz w:val="22"/>
         </w:rPr>
-        <w:t>XGBoost</w:t>
+        <w:t>BioBERT</w:t>
       </w:r>
       <w:r>
         <w:rPr>
@@ -2316,7 +2188,7 @@
           <w:i w:val="0"/>
           <w:sz w:val="22"/>
         </w:rPr>
-        <w:t xml:space="preserve"> models through feature engineering and hyperparameter tuning, increasing accuracy by </w:t>
+        <w:t xml:space="preserve"> for clinical entity extraction from unstructured medical text, achieving </w:t>
       </w:r>
       <w:r>
         <w:rPr>
@@ -2324,7 +2196,7 @@
           <w:i w:val="0"/>
           <w:sz w:val="22"/>
         </w:rPr>
-        <w:t>8%</w:t>
+        <w:t>80% accuracy</w:t>
       </w:r>
       <w:r>
         <w:rPr>
@@ -2332,7 +2204,7 @@
           <w:i w:val="0"/>
           <w:sz w:val="22"/>
         </w:rPr>
-        <w:t xml:space="preserve"> and cutting training time by </w:t>
+        <w:t xml:space="preserve"> and reducing processing time by </w:t>
       </w:r>
       <w:r>
         <w:rPr>
@@ -2340,7 +2212,7 @@
           <w:i w:val="0"/>
           <w:sz w:val="22"/>
         </w:rPr>
-        <w:t>15%</w:t>
+        <w:t>55%</w:t>
       </w:r>
       <w:r>
         <w:rPr>
@@ -2373,7 +2245,7 @@
           <w:i w:val="0"/>
           <w:sz w:val="22"/>
         </w:rPr>
-        <w:t xml:space="preserve">Containerized ML inference services with </w:t>
+        <w:t xml:space="preserve">Improved </w:t>
       </w:r>
       <w:r>
         <w:rPr>
@@ -2381,7 +2253,7 @@
           <w:i w:val="0"/>
           <w:sz w:val="22"/>
         </w:rPr>
-        <w:t>Docker, Kubernetes,</w:t>
+        <w:t>Scikit-learn</w:t>
       </w:r>
       <w:r>
         <w:rPr>
@@ -2397,7 +2269,7 @@
           <w:i w:val="0"/>
           <w:sz w:val="22"/>
         </w:rPr>
-        <w:t>Jenkins CI/CD</w:t>
+        <w:t>XGBoost</w:t>
       </w:r>
       <w:r>
         <w:rPr>
@@ -2405,7 +2277,7 @@
           <w:i w:val="0"/>
           <w:sz w:val="22"/>
         </w:rPr>
-        <w:t xml:space="preserve">, improving system uptime by </w:t>
+        <w:t xml:space="preserve"> models through feature engineering and hyperparameter tuning, increasing accuracy by </w:t>
       </w:r>
       <w:r>
         <w:rPr>
@@ -2413,7 +2285,7 @@
           <w:i w:val="0"/>
           <w:sz w:val="22"/>
         </w:rPr>
-        <w:t>20%</w:t>
+        <w:t>8%</w:t>
       </w:r>
       <w:r>
         <w:rPr>
@@ -2421,7 +2293,7 @@
           <w:i w:val="0"/>
           <w:sz w:val="22"/>
         </w:rPr>
-        <w:t xml:space="preserve"> and enabling real-time EHR integration via </w:t>
+        <w:t xml:space="preserve"> and cutting training time by </w:t>
       </w:r>
       <w:r>
         <w:rPr>
@@ -2429,7 +2301,7 @@
           <w:i w:val="0"/>
           <w:sz w:val="22"/>
         </w:rPr>
-        <w:t>REST APIs</w:t>
+        <w:t>15%</w:t>
       </w:r>
       <w:r>
         <w:rPr>
@@ -2462,7 +2334,7 @@
           <w:i w:val="0"/>
           <w:sz w:val="22"/>
         </w:rPr>
-        <w:t xml:space="preserve">Engineered ML-ready ingestion of </w:t>
+        <w:t xml:space="preserve">Containerized ML inference services with </w:t>
       </w:r>
       <w:r>
         <w:rPr>
@@ -2470,7 +2342,7 @@
           <w:i w:val="0"/>
           <w:sz w:val="22"/>
         </w:rPr>
-        <w:t>400K+ XML/JSON healthcare records</w:t>
+        <w:t>Docker, Kubernetes,</w:t>
       </w:r>
       <w:r>
         <w:rPr>
@@ -2478,7 +2350,7 @@
           <w:i w:val="0"/>
           <w:sz w:val="22"/>
         </w:rPr>
-        <w:t xml:space="preserve"> into </w:t>
+        <w:t xml:space="preserve"> and </w:t>
       </w:r>
       <w:r>
         <w:rPr>
@@ -2486,7 +2358,7 @@
           <w:i w:val="0"/>
           <w:sz w:val="22"/>
         </w:rPr>
-        <w:t>Snowflake</w:t>
+        <w:t>Jenkins CI/CD</w:t>
       </w:r>
       <w:r>
         <w:rPr>
@@ -2494,7 +2366,7 @@
           <w:i w:val="0"/>
           <w:sz w:val="22"/>
         </w:rPr>
-        <w:t xml:space="preserve"> and </w:t>
+        <w:t xml:space="preserve">, improving system uptime by </w:t>
       </w:r>
       <w:r>
         <w:rPr>
@@ -2502,7 +2374,7 @@
           <w:i w:val="0"/>
           <w:sz w:val="22"/>
         </w:rPr>
-        <w:t>Databricks</w:t>
+        <w:t>20%</w:t>
       </w:r>
       <w:r>
         <w:rPr>
@@ -2510,7 +2382,7 @@
           <w:i w:val="0"/>
           <w:sz w:val="22"/>
         </w:rPr>
-        <w:t xml:space="preserve">, accelerating model training by </w:t>
+        <w:t xml:space="preserve"> and enabling real-time EHR integration via </w:t>
       </w:r>
       <w:r>
         <w:rPr>
@@ -2518,23 +2390,7 @@
           <w:i w:val="0"/>
           <w:sz w:val="22"/>
         </w:rPr>
-        <w:t>60%</w:t>
-      </w:r>
-      <w:r>
-        <w:rPr>
-          <w:b w:val="0"/>
-          <w:i w:val="0"/>
-          <w:sz w:val="22"/>
-        </w:rPr>
-        <w:t xml:space="preserve"> and reducing preprocessing time by </w:t>
-      </w:r>
-      <w:r>
-        <w:rPr>
-          <w:b/>
-          <w:i w:val="0"/>
-          <w:sz w:val="22"/>
-        </w:rPr>
-        <w:t>70%</w:t>
+        <w:t>REST APIs</w:t>
       </w:r>
       <w:r>
         <w:rPr>
@@ -2567,7 +2423,7 @@
           <w:i w:val="0"/>
           <w:sz w:val="22"/>
         </w:rPr>
-        <w:t xml:space="preserve">Built a daily </w:t>
+        <w:t xml:space="preserve">Engineered ML-ready ingestion of </w:t>
       </w:r>
       <w:r>
         <w:rPr>
@@ -2575,7 +2431,7 @@
           <w:i w:val="0"/>
           <w:sz w:val="22"/>
         </w:rPr>
-        <w:t>NPPES</w:t>
+        <w:t>400K+ XML/JSON healthcare records</w:t>
       </w:r>
       <w:r>
         <w:rPr>
@@ -2583,7 +2439,7 @@
           <w:i w:val="0"/>
           <w:sz w:val="22"/>
         </w:rPr>
-        <w:t xml:space="preserve"> ingestion workflow that improved ML data accuracy by </w:t>
+        <w:t xml:space="preserve"> into </w:t>
       </w:r>
       <w:r>
         <w:rPr>
@@ -2591,7 +2447,7 @@
           <w:i w:val="0"/>
           <w:sz w:val="22"/>
         </w:rPr>
-        <w:t>74%</w:t>
+        <w:t>Snowflake</w:t>
       </w:r>
       <w:r>
         <w:rPr>
@@ -2599,7 +2455,7 @@
           <w:i w:val="0"/>
           <w:sz w:val="22"/>
         </w:rPr>
-        <w:t xml:space="preserve"> and cut processing overhead by </w:t>
+        <w:t xml:space="preserve"> and </w:t>
       </w:r>
       <w:r>
         <w:rPr>
@@ -2607,6 +2463,22 @@
           <w:i w:val="0"/>
           <w:sz w:val="22"/>
         </w:rPr>
+        <w:t>Databricks</w:t>
+      </w:r>
+      <w:r>
+        <w:rPr>
+          <w:b w:val="0"/>
+          <w:i w:val="0"/>
+          <w:sz w:val="22"/>
+        </w:rPr>
+        <w:t xml:space="preserve">, accelerating model training by </w:t>
+      </w:r>
+      <w:r>
+        <w:rPr>
+          <w:b/>
+          <w:i w:val="0"/>
+          <w:sz w:val="22"/>
+        </w:rPr>
         <w:t>60%</w:t>
       </w:r>
       <w:r>
@@ -2615,7 +2487,7 @@
           <w:i w:val="0"/>
           <w:sz w:val="22"/>
         </w:rPr>
-        <w:t xml:space="preserve">, and built </w:t>
+        <w:t xml:space="preserve"> and reducing preprocessing time by </w:t>
       </w:r>
       <w:r>
         <w:rPr>
@@ -2623,71 +2495,7 @@
           <w:i w:val="0"/>
           <w:sz w:val="22"/>
         </w:rPr>
-        <w:t>PySpark</w:t>
-      </w:r>
-      <w:r>
-        <w:rPr>
-          <w:b w:val="0"/>
-          <w:i w:val="0"/>
-          <w:sz w:val="22"/>
-        </w:rPr>
-        <w:t xml:space="preserve"> ETL on </w:t>
-      </w:r>
-      <w:r>
-        <w:rPr>
-          <w:b/>
-          <w:i w:val="0"/>
-          <w:sz w:val="22"/>
-        </w:rPr>
-        <w:t>AWS (Glue, SageMaker)</w:t>
-      </w:r>
-      <w:r>
-        <w:rPr>
-          <w:b w:val="0"/>
-          <w:i w:val="0"/>
-          <w:sz w:val="22"/>
-        </w:rPr>
-        <w:t xml:space="preserve"> with </w:t>
-      </w:r>
-      <w:r>
-        <w:rPr>
-          <w:b/>
-          <w:i w:val="0"/>
-          <w:sz w:val="22"/>
-        </w:rPr>
-        <w:t>Delta Lake</w:t>
-      </w:r>
-      <w:r>
-        <w:rPr>
-          <w:b w:val="0"/>
-          <w:i w:val="0"/>
-          <w:sz w:val="22"/>
-        </w:rPr>
-        <w:t xml:space="preserve">, improving data reliability by </w:t>
-      </w:r>
-      <w:r>
-        <w:rPr>
-          <w:b/>
-          <w:i w:val="0"/>
-          <w:sz w:val="22"/>
-        </w:rPr>
-        <w:t>30%</w:t>
-      </w:r>
-      <w:r>
-        <w:rPr>
-          <w:b w:val="0"/>
-          <w:i w:val="0"/>
-          <w:sz w:val="22"/>
-        </w:rPr>
-        <w:t xml:space="preserve"> under </w:t>
-      </w:r>
-      <w:r>
-        <w:rPr>
-          <w:b/>
-          <w:i w:val="0"/>
-          <w:sz w:val="22"/>
-        </w:rPr>
-        <w:t>HIPAA</w:t>
+        <w:t>70%</w:t>
       </w:r>
       <w:r>
         <w:rPr>
@@ -2720,7 +2528,7 @@
           <w:i w:val="0"/>
           <w:sz w:val="22"/>
         </w:rPr>
-        <w:t xml:space="preserve">Designed </w:t>
+        <w:t xml:space="preserve">Built a daily </w:t>
       </w:r>
       <w:r>
         <w:rPr>
@@ -2728,7 +2536,7 @@
           <w:i w:val="0"/>
           <w:sz w:val="22"/>
         </w:rPr>
-        <w:t>20+ enterprise ETL pipelines</w:t>
+        <w:t>NPPES</w:t>
       </w:r>
       <w:r>
         <w:rPr>
@@ -2736,7 +2544,7 @@
           <w:i w:val="0"/>
           <w:sz w:val="22"/>
         </w:rPr>
-        <w:t xml:space="preserve"> orchestrated with </w:t>
+        <w:t xml:space="preserve"> ingestion workflow that improved ML data accuracy by </w:t>
       </w:r>
       <w:r>
         <w:rPr>
@@ -2744,7 +2552,7 @@
           <w:i w:val="0"/>
           <w:sz w:val="22"/>
         </w:rPr>
-        <w:t>Apache Airflow</w:t>
+        <w:t>74%</w:t>
       </w:r>
       <w:r>
         <w:rPr>
@@ -2752,7 +2560,7 @@
           <w:i w:val="0"/>
           <w:sz w:val="22"/>
         </w:rPr>
-        <w:t xml:space="preserve"> and </w:t>
+        <w:t xml:space="preserve"> and cut processing overhead by </w:t>
       </w:r>
       <w:r>
         <w:rPr>
@@ -2760,7 +2568,7 @@
           <w:i w:val="0"/>
           <w:sz w:val="22"/>
         </w:rPr>
-        <w:t>AWS (S3, Lambda, Athena)</w:t>
+        <w:t>60%</w:t>
       </w:r>
       <w:r>
         <w:rPr>
@@ -2768,7 +2576,7 @@
           <w:i w:val="0"/>
           <w:sz w:val="22"/>
         </w:rPr>
-        <w:t xml:space="preserve">, boosting throughput by </w:t>
+        <w:t xml:space="preserve">, and built </w:t>
       </w:r>
       <w:r>
         <w:rPr>
@@ -2776,7 +2584,7 @@
           <w:i w:val="0"/>
           <w:sz w:val="22"/>
         </w:rPr>
-        <w:t>70%</w:t>
+        <w:t>PySpark</w:t>
       </w:r>
       <w:r>
         <w:rPr>
@@ -2784,7 +2592,7 @@
           <w:i w:val="0"/>
           <w:sz w:val="22"/>
         </w:rPr>
-        <w:t xml:space="preserve"> and achieving </w:t>
+        <w:t xml:space="preserve"> ETL on </w:t>
       </w:r>
       <w:r>
         <w:rPr>
@@ -2792,7 +2600,7 @@
           <w:i w:val="0"/>
           <w:sz w:val="22"/>
         </w:rPr>
-        <w:t>99.9% pipeline reliability</w:t>
+        <w:t>AWS (Glue, SageMaker)</w:t>
       </w:r>
       <w:r>
         <w:rPr>
@@ -2800,42 +2608,55 @@
           <w:i w:val="0"/>
           <w:sz w:val="22"/>
         </w:rPr>
-        <w:t xml:space="preserve"> with end-to-end lineage tracking.</w:t>
-      </w:r>
-    </w:p>
-    <w:p>
-      <w:pPr>
-        <w:tabs>
-          <w:tab w:pos="11592" w:val="right"/>
-        </w:tabs>
-        <w:spacing w:before="120" w:after="40"/>
-      </w:pPr>
+        <w:t xml:space="preserve"> with </w:t>
+      </w:r>
       <w:r>
         <w:rPr>
           <w:b/>
-          <w:sz w:val="24"/>
-        </w:rPr>
-        <w:t xml:space="preserve">Carelon Global Solutions (Elevance Health) </w:t>
+          <w:i w:val="0"/>
+          <w:sz w:val="22"/>
+        </w:rPr>
+        <w:t>Delta Lake</w:t>
+      </w:r>
+      <w:r>
+        <w:rPr>
+          <w:b w:val="0"/>
+          <w:i w:val="0"/>
+          <w:sz w:val="22"/>
+        </w:rPr>
+        <w:t xml:space="preserve">, improving data reliability by </w:t>
       </w:r>
       <w:r>
         <w:rPr>
           <w:b/>
-        </w:rPr>
-        <w:t xml:space="preserve">| </w:t>
+          <w:i w:val="0"/>
+          <w:sz w:val="22"/>
+        </w:rPr>
+        <w:t>30%</w:t>
+      </w:r>
+      <w:r>
+        <w:rPr>
+          <w:b w:val="0"/>
+          <w:i w:val="0"/>
+          <w:sz w:val="22"/>
+        </w:rPr>
+        <w:t xml:space="preserve"> under </w:t>
       </w:r>
       <w:r>
         <w:rPr>
           <w:b/>
-          <w:i/>
-        </w:rPr>
-        <w:t>Data Engineer</w:t>
-      </w:r>
-      <w:r>
-        <w:rPr>
-          <w:b/>
-        </w:rPr>
-        <w:tab/>
-        <w:t>Bengaluru, India | October 2020 - April 2022</w:t>
+          <w:i w:val="0"/>
+          <w:sz w:val="22"/>
+        </w:rPr>
+        <w:t>HIPAA</w:t>
+      </w:r>
+      <w:r>
+        <w:rPr>
+          <w:b w:val="0"/>
+          <w:i w:val="0"/>
+          <w:sz w:val="22"/>
+        </w:rPr>
+        <w:t>.</w:t>
       </w:r>
     </w:p>
     <w:p>
@@ -2860,7 +2681,7 @@
           <w:i w:val="0"/>
           <w:sz w:val="22"/>
         </w:rPr>
-        <w:t xml:space="preserve">Aligned ETL pipelines with business KPIs on the </w:t>
+        <w:t xml:space="preserve">Designed </w:t>
       </w:r>
       <w:r>
         <w:rPr>
@@ -2868,7 +2689,7 @@
           <w:i w:val="0"/>
           <w:sz w:val="22"/>
         </w:rPr>
-        <w:t>Seven Plus Locations</w:t>
+        <w:t>20+ enterprise ETL pipelines</w:t>
       </w:r>
       <w:r>
         <w:rPr>
@@ -2876,7 +2697,106 @@
           <w:i w:val="0"/>
           <w:sz w:val="22"/>
         </w:rPr>
-        <w:t xml:space="preserve"> project, improving claims data accuracy.</w:t>
+        <w:t xml:space="preserve"> orchestrated with </w:t>
+      </w:r>
+      <w:r>
+        <w:rPr>
+          <w:b/>
+          <w:i w:val="0"/>
+          <w:sz w:val="22"/>
+        </w:rPr>
+        <w:t>Apache Airflow</w:t>
+      </w:r>
+      <w:r>
+        <w:rPr>
+          <w:b w:val="0"/>
+          <w:i w:val="0"/>
+          <w:sz w:val="22"/>
+        </w:rPr>
+        <w:t xml:space="preserve"> and </w:t>
+      </w:r>
+      <w:r>
+        <w:rPr>
+          <w:b/>
+          <w:i w:val="0"/>
+          <w:sz w:val="22"/>
+        </w:rPr>
+        <w:t>AWS (S3, Lambda, Athena)</w:t>
+      </w:r>
+      <w:r>
+        <w:rPr>
+          <w:b w:val="0"/>
+          <w:i w:val="0"/>
+          <w:sz w:val="22"/>
+        </w:rPr>
+        <w:t xml:space="preserve">, boosting throughput by </w:t>
+      </w:r>
+      <w:r>
+        <w:rPr>
+          <w:b/>
+          <w:i w:val="0"/>
+          <w:sz w:val="22"/>
+        </w:rPr>
+        <w:t>70%</w:t>
+      </w:r>
+      <w:r>
+        <w:rPr>
+          <w:b w:val="0"/>
+          <w:i w:val="0"/>
+          <w:sz w:val="22"/>
+        </w:rPr>
+        <w:t xml:space="preserve"> and achieving </w:t>
+      </w:r>
+      <w:r>
+        <w:rPr>
+          <w:b/>
+          <w:i w:val="0"/>
+          <w:sz w:val="22"/>
+        </w:rPr>
+        <w:t>99.9% pipeline reliability</w:t>
+      </w:r>
+      <w:r>
+        <w:rPr>
+          <w:b w:val="0"/>
+          <w:i w:val="0"/>
+          <w:sz w:val="22"/>
+        </w:rPr>
+        <w:t xml:space="preserve"> with end-to-end lineage tracking.</w:t>
+      </w:r>
+    </w:p>
+    <w:p>
+      <w:pPr>
+        <w:tabs>
+          <w:tab w:pos="11592" w:val="right"/>
+        </w:tabs>
+        <w:spacing w:before="120" w:after="40"/>
+      </w:pPr>
+      <w:r>
+        <w:rPr>
+          <w:b/>
+          <w:sz w:val="24"/>
+        </w:rPr>
+        <w:t xml:space="preserve">Carelon Global Solutions (Elevance Health) </w:t>
+      </w:r>
+      <w:r>
+        <w:rPr>
+          <w:b/>
+        </w:rPr>
+        <w:t xml:space="preserve">| </w:t>
+      </w:r>
+      <w:r>
+        <w:rPr>
+          <w:b/>
+          <w:i/>
+        </w:rPr>
+        <w:t>Data Engineer</w:t>
+      </w:r>
+      <w:r>
+        <w:rPr>
+          <w:b/>
+        </w:rPr>
+        <w:tab/>
+        <w:t>Bengaluru, India | October 2020 - April 2022</w:t>
       </w:r>
     </w:p>
     <w:p>
@@ -2901,7 +2821,7 @@
           <w:i w:val="0"/>
           <w:sz w:val="22"/>
         </w:rPr>
-        <w:t xml:space="preserve">Redesigned </w:t>
+        <w:t xml:space="preserve">Aligned ETL pipelines with business KPIs on the </w:t>
       </w:r>
       <w:r>
         <w:rPr>
@@ -2909,7 +2829,7 @@
           <w:i w:val="0"/>
           <w:sz w:val="22"/>
         </w:rPr>
-        <w:t>claims-balancing ETL workflows</w:t>
+        <w:t>Seven Plus Locations</w:t>
       </w:r>
       <w:r>
         <w:rPr>
@@ -2917,55 +2837,7 @@
           <w:i w:val="0"/>
           <w:sz w:val="22"/>
         </w:rPr>
-        <w:t xml:space="preserve"> and automated </w:t>
-      </w:r>
-      <w:r>
-        <w:rPr>
-          <w:b/>
-          <w:i w:val="0"/>
-          <w:sz w:val="22"/>
-        </w:rPr>
-        <w:t>medical invoice processing</w:t>
-      </w:r>
-      <w:r>
-        <w:rPr>
-          <w:b w:val="0"/>
-          <w:i w:val="0"/>
-          <w:sz w:val="22"/>
-        </w:rPr>
-        <w:t xml:space="preserve"> pipelines, reducing operational overhead by </w:t>
-      </w:r>
-      <w:r>
-        <w:rPr>
-          <w:b/>
-          <w:i w:val="0"/>
-          <w:sz w:val="22"/>
-        </w:rPr>
-        <w:t>60%</w:t>
-      </w:r>
-      <w:r>
-        <w:rPr>
-          <w:b w:val="0"/>
-          <w:i w:val="0"/>
-          <w:sz w:val="22"/>
-        </w:rPr>
-        <w:t xml:space="preserve"> and manual errors by </w:t>
-      </w:r>
-      <w:r>
-        <w:rPr>
-          <w:b/>
-          <w:i w:val="0"/>
-          <w:sz w:val="22"/>
-        </w:rPr>
-        <w:t>70%</w:t>
-      </w:r>
-      <w:r>
-        <w:rPr>
-          <w:b w:val="0"/>
-          <w:i w:val="0"/>
-          <w:sz w:val="22"/>
-        </w:rPr>
-        <w:t>.</w:t>
+        <w:t xml:space="preserve"> project, improving claims data accuracy.</w:t>
       </w:r>
     </w:p>
     <w:p>
@@ -2990,7 +2862,7 @@
           <w:i w:val="0"/>
           <w:sz w:val="22"/>
         </w:rPr>
-        <w:t xml:space="preserve">Migrated large-scale processing workloads from </w:t>
+        <w:t xml:space="preserve">Redesigned </w:t>
       </w:r>
       <w:r>
         <w:rPr>
@@ -2998,7 +2870,7 @@
           <w:i w:val="0"/>
           <w:sz w:val="22"/>
         </w:rPr>
-        <w:t>Hive</w:t>
+        <w:t>claims-balancing ETL workflows</w:t>
       </w:r>
       <w:r>
         <w:rPr>
@@ -3006,7 +2878,7 @@
           <w:i w:val="0"/>
           <w:sz w:val="22"/>
         </w:rPr>
-        <w:t xml:space="preserve"> to </w:t>
+        <w:t xml:space="preserve"> and automated </w:t>
       </w:r>
       <w:r>
         <w:rPr>
@@ -3014,7 +2886,7 @@
           <w:i w:val="0"/>
           <w:sz w:val="22"/>
         </w:rPr>
-        <w:t>Apache Spark/PySpark</w:t>
+        <w:t>medical invoice processing</w:t>
       </w:r>
       <w:r>
         <w:rPr>
@@ -3022,7 +2894,7 @@
           <w:i w:val="0"/>
           <w:sz w:val="22"/>
         </w:rPr>
-        <w:t xml:space="preserve">, and moved </w:t>
+        <w:t xml:space="preserve"> pipelines, reducing operational overhead by </w:t>
       </w:r>
       <w:r>
         <w:rPr>
@@ -3030,7 +2902,7 @@
           <w:i w:val="0"/>
           <w:sz w:val="22"/>
         </w:rPr>
-        <w:t>Sqoop/Hadoop</w:t>
+        <w:t>60%</w:t>
       </w:r>
       <w:r>
         <w:rPr>
@@ -3038,7 +2910,7 @@
           <w:i w:val="0"/>
           <w:sz w:val="22"/>
         </w:rPr>
-        <w:t xml:space="preserve"> ingestion to </w:t>
+        <w:t xml:space="preserve"> and manual errors by </w:t>
       </w:r>
       <w:r>
         <w:rPr>
@@ -3046,7 +2918,7 @@
           <w:i w:val="0"/>
           <w:sz w:val="22"/>
         </w:rPr>
-        <w:t>Azure Data Services</w:t>
+        <w:t>70%</w:t>
       </w:r>
       <w:r>
         <w:rPr>
@@ -3054,7 +2926,7 @@
           <w:i w:val="0"/>
           <w:sz w:val="22"/>
         </w:rPr>
-        <w:t>, improving performance, scalability, and pipeline efficiency.</w:t>
+        <w:t>.</w:t>
       </w:r>
     </w:p>
     <w:p>
@@ -3079,7 +2951,7 @@
           <w:i w:val="0"/>
           <w:sz w:val="22"/>
         </w:rPr>
-        <w:t xml:space="preserve">Developed </w:t>
+        <w:t xml:space="preserve">Delivered self-service BI pipelines with </w:t>
       </w:r>
       <w:r>
         <w:rPr>
@@ -3087,7 +2959,7 @@
           <w:i w:val="0"/>
           <w:sz w:val="22"/>
         </w:rPr>
-        <w:t>RESTful microservices</w:t>
+        <w:t>Tableau, Power BI,</w:t>
       </w:r>
       <w:r>
         <w:rPr>
@@ -3095,7 +2967,7 @@
           <w:i w:val="0"/>
           <w:sz w:val="22"/>
         </w:rPr>
-        <w:t xml:space="preserve"> with </w:t>
+        <w:t xml:space="preserve"> and SQL-based models, reducing reporting latency by </w:t>
       </w:r>
       <w:r>
         <w:rPr>
@@ -3103,7 +2975,7 @@
           <w:i w:val="0"/>
           <w:sz w:val="22"/>
         </w:rPr>
-        <w:t>OAuth 2.0</w:t>
+        <w:t>40%</w:t>
       </w:r>
       <w:r>
         <w:rPr>
@@ -3111,75 +2983,7 @@
           <w:i w:val="0"/>
           <w:sz w:val="22"/>
         </w:rPr>
-        <w:t xml:space="preserve"> and API versioning, and designed </w:t>
-      </w:r>
-      <w:r>
-        <w:rPr>
-          <w:b/>
-          <w:i w:val="0"/>
-          <w:sz w:val="22"/>
-        </w:rPr>
-        <w:t>MongoDB</w:t>
-      </w:r>
-      <w:r>
-        <w:rPr>
-          <w:b w:val="0"/>
-          <w:i w:val="0"/>
-          <w:sz w:val="22"/>
-        </w:rPr>
-        <w:t xml:space="preserve"> data models with </w:t>
-      </w:r>
-      <w:r>
-        <w:rPr>
-          <w:b/>
-          <w:i w:val="0"/>
-          <w:sz w:val="22"/>
-        </w:rPr>
-        <w:t>Python/Java</w:t>
-      </w:r>
-      <w:r>
-        <w:rPr>
-          <w:b w:val="0"/>
-          <w:i w:val="0"/>
-          <w:sz w:val="22"/>
-        </w:rPr>
-        <w:t xml:space="preserve"> validation scripts (UDFs) to improve data quality and consistency.</w:t>
-      </w:r>
-    </w:p>
-    <w:p>
-      <w:pPr>
-        <w:spacing w:before="120" w:after="80"/>
-        <w:pBdr>
-          <w:bottom w:val="single" w:sz="6" w:space="1" w:color="808080"/>
-        </w:pBdr>
-      </w:pPr>
-      <w:r>
-        <w:rPr>
-          <w:b/>
-          <w:sz w:val="28"/>
-        </w:rPr>
-        <w:t>PROJECTS</w:t>
-      </w:r>
-    </w:p>
-    <w:p>
-      <w:pPr>
-        <w:spacing w:after="40"/>
-      </w:pPr>
-      <w:r>
-        <w:rPr>
-          <w:b/>
-          <w:i w:val="0"/>
-          <w:sz w:val="22"/>
-        </w:rPr>
-        <w:t>Agentic AI-Based Ticket Automation System</w:t>
-      </w:r>
-      <w:r>
-        <w:rPr>
-          <w:b w:val="0"/>
-          <w:i w:val="0"/>
-          <w:sz w:val="22"/>
-        </w:rPr>
-        <w:t xml:space="preserve"> | SecureGPT, LLaMA, AWS SQS, JIRA, NIST-CSF</w:t>
+        <w:t xml:space="preserve"> and enabling anomaly detection for healthcare analytics.</w:t>
       </w:r>
     </w:p>
     <w:p>
@@ -3204,7 +3008,7 @@
           <w:i w:val="0"/>
           <w:sz w:val="22"/>
         </w:rPr>
-        <w:t xml:space="preserve">Built an </w:t>
+        <w:t xml:space="preserve">Migrated large-scale processing workloads from </w:t>
       </w:r>
       <w:r>
         <w:rPr>
@@ -3212,7 +3016,7 @@
           <w:i w:val="0"/>
           <w:sz w:val="22"/>
         </w:rPr>
-        <w:t>agentic AI</w:t>
+        <w:t>Hive</w:t>
       </w:r>
       <w:r>
         <w:rPr>
@@ -3220,7 +3024,7 @@
           <w:i w:val="0"/>
           <w:sz w:val="22"/>
         </w:rPr>
-        <w:t xml:space="preserve"> pipeline with </w:t>
+        <w:t xml:space="preserve"> to </w:t>
       </w:r>
       <w:r>
         <w:rPr>
@@ -3228,7 +3032,7 @@
           <w:i w:val="0"/>
           <w:sz w:val="22"/>
         </w:rPr>
-        <w:t>SecureGPT</w:t>
+        <w:t>Apache Spark/PySpark</w:t>
       </w:r>
       <w:r>
         <w:rPr>
@@ -3236,7 +3040,7 @@
           <w:i w:val="0"/>
           <w:sz w:val="22"/>
         </w:rPr>
-        <w:t xml:space="preserve"> and </w:t>
+        <w:t xml:space="preserve">, and moved </w:t>
       </w:r>
       <w:r>
         <w:rPr>
@@ -3244,7 +3048,7 @@
           <w:i w:val="0"/>
           <w:sz w:val="22"/>
         </w:rPr>
-        <w:t>LLaMA</w:t>
+        <w:t>Sqoop/Hadoop</w:t>
       </w:r>
       <w:r>
         <w:rPr>
@@ -3252,7 +3056,7 @@
           <w:i w:val="0"/>
           <w:sz w:val="22"/>
         </w:rPr>
-        <w:t xml:space="preserve"> on </w:t>
+        <w:t xml:space="preserve"> ingestion to </w:t>
       </w:r>
       <w:r>
         <w:rPr>
@@ -3260,7 +3064,7 @@
           <w:i w:val="0"/>
           <w:sz w:val="22"/>
         </w:rPr>
-        <w:t>AWS SQS</w:t>
+        <w:t>Azure Data Services</w:t>
       </w:r>
       <w:r>
         <w:rPr>
@@ -3268,71 +3072,7 @@
           <w:i w:val="0"/>
           <w:sz w:val="22"/>
         </w:rPr>
-        <w:t xml:space="preserve"> event queues that monitors cybersecurity threats and auto-generates </w:t>
-      </w:r>
-      <w:r>
-        <w:rPr>
-          <w:b/>
-          <w:i w:val="0"/>
-          <w:sz w:val="22"/>
-        </w:rPr>
-        <w:t>JIRA</w:t>
-      </w:r>
-      <w:r>
-        <w:rPr>
-          <w:b w:val="0"/>
-          <w:i w:val="0"/>
-          <w:sz w:val="22"/>
-        </w:rPr>
-        <w:t xml:space="preserve"> tickets under </w:t>
-      </w:r>
-      <w:r>
-        <w:rPr>
-          <w:b/>
-          <w:i w:val="0"/>
-          <w:sz w:val="22"/>
-        </w:rPr>
-        <w:t>NIST-CSF</w:t>
-      </w:r>
-      <w:r>
-        <w:rPr>
-          <w:b w:val="0"/>
-          <w:i w:val="0"/>
-          <w:sz w:val="22"/>
-        </w:rPr>
-        <w:t xml:space="preserve">, reaching </w:t>
-      </w:r>
-      <w:r>
-        <w:rPr>
-          <w:b/>
-          <w:i w:val="0"/>
-          <w:sz w:val="22"/>
-        </w:rPr>
-        <w:t>93% automation accuracy</w:t>
-      </w:r>
-      <w:r>
-        <w:rPr>
-          <w:b w:val="0"/>
-          <w:i w:val="0"/>
-          <w:sz w:val="22"/>
-        </w:rPr>
-        <w:t xml:space="preserve"> and cutting triage time by </w:t>
-      </w:r>
-      <w:r>
-        <w:rPr>
-          <w:b/>
-          <w:i w:val="0"/>
-          <w:sz w:val="22"/>
-        </w:rPr>
-        <w:t>70%</w:t>
-      </w:r>
-      <w:r>
-        <w:rPr>
-          <w:b w:val="0"/>
-          <w:i w:val="0"/>
-          <w:sz w:val="22"/>
-        </w:rPr>
-        <w:t>.</w:t>
+        <w:t>, improving performance, scalability, and pipeline efficiency.</w:t>
       </w:r>
     </w:p>
     <w:p>
@@ -3357,7 +3097,7 @@
           <w:i w:val="0"/>
           <w:sz w:val="22"/>
         </w:rPr>
-        <w:t xml:space="preserve">Used </w:t>
+        <w:t xml:space="preserve">Developed </w:t>
       </w:r>
       <w:r>
         <w:rPr>
@@ -3365,7 +3105,7 @@
           <w:i w:val="0"/>
           <w:sz w:val="22"/>
         </w:rPr>
-        <w:t>LLM prompt engineering</w:t>
+        <w:t>RESTful microservices</w:t>
       </w:r>
       <w:r>
         <w:rPr>
@@ -3373,7 +3113,7 @@
           <w:i w:val="0"/>
           <w:sz w:val="22"/>
         </w:rPr>
-        <w:t xml:space="preserve"> to classify and rank events, improving scalability by </w:t>
+        <w:t xml:space="preserve"> with </w:t>
       </w:r>
       <w:r>
         <w:rPr>
@@ -3381,7 +3121,7 @@
           <w:i w:val="0"/>
           <w:sz w:val="22"/>
         </w:rPr>
-        <w:t>50%</w:t>
+        <w:t>OAuth 2.0</w:t>
       </w:r>
       <w:r>
         <w:rPr>
@@ -3389,7 +3129,7 @@
           <w:i w:val="0"/>
           <w:sz w:val="22"/>
         </w:rPr>
-        <w:t xml:space="preserve"> and cutting operational risk by </w:t>
+        <w:t xml:space="preserve"> and API versioning, and designed </w:t>
       </w:r>
       <w:r>
         <w:rPr>
@@ -3397,7 +3137,7 @@
           <w:i w:val="0"/>
           <w:sz w:val="22"/>
         </w:rPr>
-        <w:t>40%</w:t>
+        <w:t>MongoDB</w:t>
       </w:r>
       <w:r>
         <w:rPr>
@@ -3405,7 +3145,23 @@
           <w:i w:val="0"/>
           <w:sz w:val="22"/>
         </w:rPr>
-        <w:t>.</w:t>
+        <w:t xml:space="preserve"> data models with </w:t>
+      </w:r>
+      <w:r>
+        <w:rPr>
+          <w:b/>
+          <w:i w:val="0"/>
+          <w:sz w:val="22"/>
+        </w:rPr>
+        <w:t>Python/Java</w:t>
+      </w:r>
+      <w:r>
+        <w:rPr>
+          <w:b w:val="0"/>
+          <w:i w:val="0"/>
+          <w:sz w:val="22"/>
+        </w:rPr>
+        <w:t xml:space="preserve"> validation scripts (UDFs) to improve data quality and consistency.</w:t>
       </w:r>
     </w:p>
     <w:p>
@@ -3420,7 +3176,28 @@
           <w:b/>
           <w:sz w:val="28"/>
         </w:rPr>
-        <w:t>PUBLICATIONS</w:t>
+        <w:t>PROJECTS</w:t>
+      </w:r>
+    </w:p>
+    <w:p>
+      <w:pPr>
+        <w:spacing w:after="40"/>
+      </w:pPr>
+      <w:r>
+        <w:rPr>
+          <w:b/>
+          <w:i w:val="0"/>
+          <w:sz w:val="22"/>
+        </w:rPr>
+        <w:t>Agentic AI-Based Ticket Automation System</w:t>
+      </w:r>
+      <w:r>
+        <w:rPr>
+          <w:b w:val="0"/>
+          <w:i w:val="0"/>
+          <w:sz w:val="22"/>
+        </w:rPr>
+        <w:t xml:space="preserve"> | SecureGPT, LLaMA, AWS SQS, JIRA, NIST-CSF</w:t>
       </w:r>
     </w:p>
     <w:p>
@@ -3445,6 +3222,247 @@
           <w:i w:val="0"/>
           <w:sz w:val="22"/>
         </w:rPr>
+        <w:t xml:space="preserve">Built an </w:t>
+      </w:r>
+      <w:r>
+        <w:rPr>
+          <w:b/>
+          <w:i w:val="0"/>
+          <w:sz w:val="22"/>
+        </w:rPr>
+        <w:t>agentic AI</w:t>
+      </w:r>
+      <w:r>
+        <w:rPr>
+          <w:b w:val="0"/>
+          <w:i w:val="0"/>
+          <w:sz w:val="22"/>
+        </w:rPr>
+        <w:t xml:space="preserve"> pipeline with </w:t>
+      </w:r>
+      <w:r>
+        <w:rPr>
+          <w:b/>
+          <w:i w:val="0"/>
+          <w:sz w:val="22"/>
+        </w:rPr>
+        <w:t>SecureGPT</w:t>
+      </w:r>
+      <w:r>
+        <w:rPr>
+          <w:b w:val="0"/>
+          <w:i w:val="0"/>
+          <w:sz w:val="22"/>
+        </w:rPr>
+        <w:t xml:space="preserve"> and </w:t>
+      </w:r>
+      <w:r>
+        <w:rPr>
+          <w:b/>
+          <w:i w:val="0"/>
+          <w:sz w:val="22"/>
+        </w:rPr>
+        <w:t>LLaMA</w:t>
+      </w:r>
+      <w:r>
+        <w:rPr>
+          <w:b w:val="0"/>
+          <w:i w:val="0"/>
+          <w:sz w:val="22"/>
+        </w:rPr>
+        <w:t xml:space="preserve"> on </w:t>
+      </w:r>
+      <w:r>
+        <w:rPr>
+          <w:b/>
+          <w:i w:val="0"/>
+          <w:sz w:val="22"/>
+        </w:rPr>
+        <w:t>AWS SQS</w:t>
+      </w:r>
+      <w:r>
+        <w:rPr>
+          <w:b w:val="0"/>
+          <w:i w:val="0"/>
+          <w:sz w:val="22"/>
+        </w:rPr>
+        <w:t xml:space="preserve"> event queues that monitors cybersecurity threats and auto-generates </w:t>
+      </w:r>
+      <w:r>
+        <w:rPr>
+          <w:b/>
+          <w:i w:val="0"/>
+          <w:sz w:val="22"/>
+        </w:rPr>
+        <w:t>JIRA</w:t>
+      </w:r>
+      <w:r>
+        <w:rPr>
+          <w:b w:val="0"/>
+          <w:i w:val="0"/>
+          <w:sz w:val="22"/>
+        </w:rPr>
+        <w:t xml:space="preserve"> tickets under </w:t>
+      </w:r>
+      <w:r>
+        <w:rPr>
+          <w:b/>
+          <w:i w:val="0"/>
+          <w:sz w:val="22"/>
+        </w:rPr>
+        <w:t>NIST-CSF</w:t>
+      </w:r>
+      <w:r>
+        <w:rPr>
+          <w:b w:val="0"/>
+          <w:i w:val="0"/>
+          <w:sz w:val="22"/>
+        </w:rPr>
+        <w:t xml:space="preserve">, reaching </w:t>
+      </w:r>
+      <w:r>
+        <w:rPr>
+          <w:b/>
+          <w:i w:val="0"/>
+          <w:sz w:val="22"/>
+        </w:rPr>
+        <w:t>93% automation accuracy</w:t>
+      </w:r>
+      <w:r>
+        <w:rPr>
+          <w:b w:val="0"/>
+          <w:i w:val="0"/>
+          <w:sz w:val="22"/>
+        </w:rPr>
+        <w:t xml:space="preserve"> and cutting triage time by </w:t>
+      </w:r>
+      <w:r>
+        <w:rPr>
+          <w:b/>
+          <w:i w:val="0"/>
+          <w:sz w:val="22"/>
+        </w:rPr>
+        <w:t>70%</w:t>
+      </w:r>
+      <w:r>
+        <w:rPr>
+          <w:b w:val="0"/>
+          <w:i w:val="0"/>
+          <w:sz w:val="22"/>
+        </w:rPr>
+        <w:t>.</w:t>
+      </w:r>
+    </w:p>
+    <w:p>
+      <w:pPr>
+        <w:tabs>
+          <w:tab w:pos="475" w:val="left"/>
+        </w:tabs>
+        <w:spacing w:after="20"/>
+        <w:ind w:left="475" w:hanging="331"/>
+        <w:jc w:val="both"/>
+      </w:pPr>
+      <w:r>
+        <w:rPr>
+          <w:sz w:val="22"/>
+        </w:rPr>
+        <w:t>•</w:t>
+        <w:tab/>
+      </w:r>
+      <w:r>
+        <w:rPr>
+          <w:b w:val="0"/>
+          <w:i w:val="0"/>
+          <w:sz w:val="22"/>
+        </w:rPr>
+        <w:t xml:space="preserve">Used </w:t>
+      </w:r>
+      <w:r>
+        <w:rPr>
+          <w:b/>
+          <w:i w:val="0"/>
+          <w:sz w:val="22"/>
+        </w:rPr>
+        <w:t>LLM prompt engineering</w:t>
+      </w:r>
+      <w:r>
+        <w:rPr>
+          <w:b w:val="0"/>
+          <w:i w:val="0"/>
+          <w:sz w:val="22"/>
+        </w:rPr>
+        <w:t xml:space="preserve"> to classify and rank events, improving scalability by </w:t>
+      </w:r>
+      <w:r>
+        <w:rPr>
+          <w:b/>
+          <w:i w:val="0"/>
+          <w:sz w:val="22"/>
+        </w:rPr>
+        <w:t>50%</w:t>
+      </w:r>
+      <w:r>
+        <w:rPr>
+          <w:b w:val="0"/>
+          <w:i w:val="0"/>
+          <w:sz w:val="22"/>
+        </w:rPr>
+        <w:t xml:space="preserve"> and cutting operational risk by </w:t>
+      </w:r>
+      <w:r>
+        <w:rPr>
+          <w:b/>
+          <w:i w:val="0"/>
+          <w:sz w:val="22"/>
+        </w:rPr>
+        <w:t>40%</w:t>
+      </w:r>
+      <w:r>
+        <w:rPr>
+          <w:b w:val="0"/>
+          <w:i w:val="0"/>
+          <w:sz w:val="22"/>
+        </w:rPr>
+        <w:t>.</w:t>
+      </w:r>
+    </w:p>
+    <w:p>
+      <w:pPr>
+        <w:spacing w:before="120" w:after="80"/>
+        <w:pBdr>
+          <w:bottom w:val="single" w:sz="6" w:space="1" w:color="808080"/>
+        </w:pBdr>
+      </w:pPr>
+      <w:r>
+        <w:rPr>
+          <w:b/>
+          <w:sz w:val="28"/>
+        </w:rPr>
+        <w:t>PUBLICATIONS</w:t>
+      </w:r>
+    </w:p>
+    <w:p>
+      <w:pPr>
+        <w:tabs>
+          <w:tab w:pos="475" w:val="left"/>
+        </w:tabs>
+        <w:spacing w:after="20"/>
+        <w:ind w:left="475" w:hanging="331"/>
+        <w:jc w:val="both"/>
+      </w:pPr>
+      <w:r>
+        <w:rPr>
+          <w:sz w:val="22"/>
+        </w:rPr>
+        <w:t>•</w:t>
+        <w:tab/>
+      </w:r>
+      <w:r>
+        <w:rPr>
+          <w:b w:val="0"/>
+          <w:i w:val="0"/>
+          <w:sz w:val="22"/>
+        </w:rPr>
         <w:t xml:space="preserve">R. S. Nayaka, </w:t>
       </w:r>
       <w:r>
@@ -3461,7 +3479,7 @@
           <w:i w:val="0"/>
           <w:sz w:val="22"/>
         </w:rPr>
-        <w:t xml:space="preserve">, K. B. Laskey, L. Wells II, and H. Purohit. "SHIELD: A Framework for Online Conversational AI System for Self-Regulated Learning at Emergency Communications Centers." In </w:t>
+        <w:t xml:space="preserve">, K. B. Laskey, L. Wells II, H. Purohit. "SHIELD: A Framework for Online Conversational AI System for Self-Regulated Learning at Emergency Communications Centers." </w:t>
       </w:r>
       <w:r>
         <w:rPr>
@@ -3469,7 +3487,7 @@
           <w:i/>
           <w:sz w:val="22"/>
         </w:rPr>
-        <w:t>Proceedings of the 19th ACM International Conference on Web Search and Data Mining (WSDM '26)</w:t>
+        <w:t>ACM WSDM '26</w:t>
       </w:r>
       <w:r>
         <w:rPr>
@@ -3477,7 +3495,7 @@
           <w:i w:val="0"/>
           <w:sz w:val="22"/>
         </w:rPr>
-        <w:t>, Boise, ID, 2026. doi:10.1145/3773966.3779411</w:t>
+        <w:t>. doi:10.1145/3773966.3779411</w:t>
       </w:r>
     </w:p>
     <w:p>

</xml_diff>

<commit_message>
Rewrite resume bullets in STAR form, trim low-value detail, verify ATS parsing
Co-Authored-By: Claude Opus 5.5 <noreply@anthropic.com>
Claude-Session: https://claude.ai/code/session_013uu8YLK93nR2ygpNvDWsMr
</commit_message>
<xml_diff>
--- a/resume/Ritesh_Somashekar_AI_ML_Engineer_GMU_Carelon.docx
+++ b/resume/Ritesh_Somashekar_AI_ML_Engineer_GMU_Carelon.docx
@@ -100,7 +100,7 @@
           <w:i w:val="0"/>
           <w:sz w:val="22"/>
         </w:rPr>
-        <w:t>AI &amp; Machine Learning Engineer</w:t>
+        <w:t>AI &amp; ML Engineer</w:t>
       </w:r>
       <w:r>
         <w:rPr>
@@ -124,7 +124,7 @@
           <w:i w:val="0"/>
           <w:sz w:val="22"/>
         </w:rPr>
-        <w:t xml:space="preserve"> progressing from </w:t>
+        <w:t xml:space="preserve"> of experience growing from </w:t>
       </w:r>
       <w:r>
         <w:rPr>
@@ -172,7 +172,7 @@
           <w:i w:val="0"/>
           <w:sz w:val="22"/>
         </w:rPr>
-        <w:t xml:space="preserve">, building </w:t>
+        <w:t xml:space="preserve">, now building </w:t>
       </w:r>
       <w:r>
         <w:rPr>
@@ -180,7 +180,7 @@
           <w:i w:val="0"/>
           <w:sz w:val="22"/>
         </w:rPr>
-        <w:t>production RAG systems</w:t>
+        <w:t>RAG systems</w:t>
       </w:r>
       <w:r>
         <w:rPr>
@@ -261,7 +261,7 @@
           <w:i w:val="0"/>
           <w:sz w:val="22"/>
         </w:rPr>
-        <w:t xml:space="preserve">Skilled in </w:t>
+        <w:t xml:space="preserve">Built healthcare data and ML pipelines at </w:t>
       </w:r>
       <w:r>
         <w:rPr>
@@ -269,7 +269,7 @@
           <w:i w:val="0"/>
           <w:sz w:val="22"/>
         </w:rPr>
-        <w:t>Llama 3, LlamaIndex, ChromaDB, pgvector, PyTorch, Airflow, Spark,</w:t>
+        <w:t>Carelon Global Solutions</w:t>
       </w:r>
       <w:r>
         <w:rPr>
@@ -277,6 +277,38 @@
           <w:i w:val="0"/>
           <w:sz w:val="22"/>
         </w:rPr>
+        <w:t xml:space="preserve">, then led RAG data, retrieval, and validation work at </w:t>
+      </w:r>
+      <w:r>
+        <w:rPr>
+          <w:b/>
+          <w:i w:val="0"/>
+          <w:sz w:val="22"/>
+        </w:rPr>
+        <w:t>George Mason University</w:t>
+      </w:r>
+      <w:r>
+        <w:rPr>
+          <w:b w:val="0"/>
+          <w:i w:val="0"/>
+          <w:sz w:val="22"/>
+        </w:rPr>
+        <w:t xml:space="preserve"> using </w:t>
+      </w:r>
+      <w:r>
+        <w:rPr>
+          <w:b/>
+          <w:i w:val="0"/>
+          <w:sz w:val="22"/>
+        </w:rPr>
+        <w:t>Python, Llama 3, LlamaIndex, ChromaDB, PyTorch,</w:t>
+      </w:r>
+      <w:r>
+        <w:rPr>
+          <w:b w:val="0"/>
+          <w:i w:val="0"/>
+          <w:sz w:val="22"/>
+        </w:rPr>
         <w:t xml:space="preserve"> and </w:t>
       </w:r>
       <w:r>
@@ -285,7 +317,7 @@
           <w:i w:val="0"/>
           <w:sz w:val="22"/>
         </w:rPr>
-        <w:t>Snowflake</w:t>
+        <w:t>AWS</w:t>
       </w:r>
       <w:r>
         <w:rPr>
@@ -293,103 +325,7 @@
           <w:i w:val="0"/>
           <w:sz w:val="22"/>
         </w:rPr>
-        <w:t xml:space="preserve"> on </w:t>
-      </w:r>
-      <w:r>
-        <w:rPr>
-          <w:b/>
-          <w:i w:val="0"/>
-          <w:sz w:val="22"/>
-        </w:rPr>
-        <w:t>AWS</w:t>
-      </w:r>
-      <w:r>
-        <w:rPr>
-          <w:b w:val="0"/>
-          <w:i w:val="0"/>
-          <w:sz w:val="22"/>
-        </w:rPr>
-        <w:t xml:space="preserve"> and </w:t>
-      </w:r>
-      <w:r>
-        <w:rPr>
-          <w:b/>
-          <w:i w:val="0"/>
-          <w:sz w:val="22"/>
-        </w:rPr>
-        <w:t>Azure</w:t>
-      </w:r>
-      <w:r>
-        <w:rPr>
-          <w:b w:val="0"/>
-          <w:i w:val="0"/>
-          <w:sz w:val="22"/>
-        </w:rPr>
-        <w:t xml:space="preserve">, with </w:t>
-      </w:r>
-      <w:r>
-        <w:rPr>
-          <w:b/>
-          <w:i w:val="0"/>
-          <w:sz w:val="22"/>
-        </w:rPr>
-        <w:t>MLOps</w:t>
-      </w:r>
-      <w:r>
-        <w:rPr>
-          <w:b w:val="0"/>
-          <w:i w:val="0"/>
-          <w:sz w:val="22"/>
-        </w:rPr>
-        <w:t xml:space="preserve"> via </w:t>
-      </w:r>
-      <w:r>
-        <w:rPr>
-          <w:b/>
-          <w:i w:val="0"/>
-          <w:sz w:val="22"/>
-        </w:rPr>
-        <w:t>MLflow, Docker, Kubernetes, FastAPI,</w:t>
-      </w:r>
-      <w:r>
-        <w:rPr>
-          <w:b w:val="0"/>
-          <w:i w:val="0"/>
-          <w:sz w:val="22"/>
-        </w:rPr>
-        <w:t xml:space="preserve"> and </w:t>
-      </w:r>
-      <w:r>
-        <w:rPr>
-          <w:b/>
-          <w:i w:val="0"/>
-          <w:sz w:val="22"/>
-        </w:rPr>
-        <w:t>CI/CD</w:t>
-      </w:r>
-      <w:r>
-        <w:rPr>
-          <w:b w:val="0"/>
-          <w:i w:val="0"/>
-          <w:sz w:val="22"/>
-        </w:rPr>
-        <w:t xml:space="preserve"> for </w:t>
-      </w:r>
-      <w:r>
-        <w:rPr>
-          <w:b/>
-          <w:i w:val="0"/>
-          <w:sz w:val="22"/>
-        </w:rPr>
-        <w:t>HIPAA-compliant</w:t>
-      </w:r>
-      <w:r>
-        <w:rPr>
-          <w:b w:val="0"/>
-          <w:i w:val="0"/>
-          <w:sz w:val="22"/>
-        </w:rPr>
-        <w:t xml:space="preserve"> data.</w:t>
+        <w:t>.</w:t>
       </w:r>
     </w:p>
     <w:p>
@@ -414,7 +350,7 @@
           <w:i w:val="0"/>
           <w:sz w:val="22"/>
         </w:rPr>
-        <w:t xml:space="preserve">Demonstrated impact, including </w:t>
+        <w:t xml:space="preserve">Proven results: </w:t>
       </w:r>
       <w:r>
         <w:rPr>
@@ -438,7 +374,7 @@
           <w:i w:val="0"/>
           <w:sz w:val="22"/>
         </w:rPr>
-        <w:t>0.81 protocol F1 with a 3.0% hallucination rate</w:t>
+        <w:t>3.0% LLM hallucination rate</w:t>
       </w:r>
       <w:r>
         <w:rPr>
@@ -478,23 +414,7 @@
           <w:i w:val="0"/>
           <w:sz w:val="22"/>
         </w:rPr>
-        <w:t xml:space="preserve">, delivering </w:t>
-      </w:r>
-      <w:r>
-        <w:rPr>
-          <w:b/>
-          <w:i w:val="0"/>
-          <w:sz w:val="22"/>
-        </w:rPr>
-        <w:t>end-to-end AI solutions</w:t>
-      </w:r>
-      <w:r>
-        <w:rPr>
-          <w:b w:val="0"/>
-          <w:i w:val="0"/>
-          <w:sz w:val="22"/>
-        </w:rPr>
-        <w:t xml:space="preserve"> from research to production.</w:t>
+        <w:t>.</w:t>
       </w:r>
     </w:p>
     <w:p>
@@ -524,7 +444,7 @@
           <w:i w:val="0"/>
           <w:sz w:val="22"/>
         </w:rPr>
-        <w:t>Programming &amp; Scripting:</w:t>
+        <w:t>Programming:</w:t>
       </w:r>
       <w:r>
         <w:rPr>
@@ -532,7 +452,7 @@
           <w:i w:val="0"/>
           <w:sz w:val="22"/>
         </w:rPr>
-        <w:t xml:space="preserve"> Python (NumPy, pandas, scikit-learn, PyTorch, TensorFlow), SQL, R, Scala, Java, Bash</w:t>
+        <w:t xml:space="preserve"> Python, SQL, R, Java</w:t>
       </w:r>
     </w:p>
     <w:p>
@@ -547,7 +467,7 @@
           <w:i w:val="0"/>
           <w:sz w:val="22"/>
         </w:rPr>
-        <w:t>RAG &amp; Generative AI:</w:t>
+        <w:t>Generative AI &amp; RAG:</w:t>
       </w:r>
       <w:r>
         <w:rPr>
@@ -555,7 +475,7 @@
           <w:i w:val="0"/>
           <w:sz w:val="22"/>
         </w:rPr>
-        <w:t xml:space="preserve"> RAG, Chunking, Embeddings (all-mpnet-base-v2), Metadata Filtering, Top-K Retrieval, Context Assembly, LlamaIndex, ChromaDB, pgvector, FAISS, Llama 3/3.1, Ollama, Prompt Engineering, Agentic AI, LoRA/PEFT, QAT</w:t>
+        <w:t xml:space="preserve"> Large Language Models (LLMs), Retrieval-Augmented Generation (RAG), LlamaIndex, Prompt Engineering, Embeddings, Vector Databases (ChromaDB, pgvector, FAISS), Llama 3, Ollama, Agentic AI, LoRA/PEFT</w:t>
       </w:r>
     </w:p>
     <w:p>
@@ -570,7 +490,7 @@
           <w:i w:val="0"/>
           <w:sz w:val="22"/>
         </w:rPr>
-        <w:t>LLM Evaluation &amp; Safety:</w:t>
+        <w:t>LLM Evaluation:</w:t>
       </w:r>
       <w:r>
         <w:rPr>
@@ -578,7 +498,7 @@
           <w:i w:val="0"/>
           <w:sz w:val="22"/>
         </w:rPr>
-        <w:t xml:space="preserve"> RAGAS, Recall@K, Faithfulness, Hallucination Detection, Guardrails, Ontology-Based Validation, NLI-Based Validation, Semantic Similarity Scoring, Ablation Studies, Protocol F1, Confidence Scoring</w:t>
+        <w:t xml:space="preserve"> RAGAS, Recall@K, Hallucination Detection, Guardrails, Ablation Studies, A/B Testing</w:t>
       </w:r>
     </w:p>
     <w:p>
@@ -601,7 +521,7 @@
           <w:i w:val="0"/>
           <w:sz w:val="22"/>
         </w:rPr>
-        <w:t xml:space="preserve"> Transformers, BERT, BioBERT, Hugging Face, XGBoost, LightGBM, Graph Analytics, Ensemble Models, Time Series Forecasting, Anomaly Detection, Feature Engineering, SHAP</w:t>
+        <w:t xml:space="preserve"> PyTorch, TensorFlow, Scikit-learn, Hugging Face Transformers, BERT, XGBoost, LightGBM, SHAP, Anomaly Detection, Time Series Forecasting</w:t>
       </w:r>
     </w:p>
     <w:p>
@@ -616,7 +536,7 @@
           <w:i w:val="0"/>
           <w:sz w:val="22"/>
         </w:rPr>
-        <w:t>MLOps &amp; ML Infrastructure:</w:t>
+        <w:t>MLOps:</w:t>
       </w:r>
       <w:r>
         <w:rPr>
@@ -624,7 +544,7 @@
           <w:i w:val="0"/>
           <w:sz w:val="22"/>
         </w:rPr>
-        <w:t xml:space="preserve"> MLflow, Docker, Kubernetes, Jenkins, CI/CD, FastAPI, Git, DVC, Model Deployment</w:t>
+        <w:t xml:space="preserve"> MLflow, Docker, Kubernetes, FastAPI, CI/CD (Jenkins), Git, DVC</w:t>
       </w:r>
     </w:p>
     <w:p>
@@ -639,7 +559,7 @@
           <w:i w:val="0"/>
           <w:sz w:val="22"/>
         </w:rPr>
-        <w:t>Data Engineering &amp; Big Data:</w:t>
+        <w:t>Data Engineering:</w:t>
       </w:r>
       <w:r>
         <w:rPr>
@@ -647,7 +567,7 @@
           <w:i w:val="0"/>
           <w:sz w:val="22"/>
         </w:rPr>
-        <w:t xml:space="preserve"> Apache Airflow, Apache Spark, PySpark, Kafka, Databricks, Snowflake, Delta Lake, Hadoop, Hive, Sqoop, Informatica PowerCenter, Precisely Data360, SQL Server, MySQL, MongoDB</w:t>
+        <w:t xml:space="preserve"> Apache Airflow, Apache Spark, PySpark, Kafka, Databricks, Snowflake, Delta Lake, Hadoop, SQL Server, MongoDB</w:t>
       </w:r>
     </w:p>
     <w:p>
@@ -662,7 +582,7 @@
           <w:i w:val="0"/>
           <w:sz w:val="22"/>
         </w:rPr>
-        <w:t>Cloud &amp; Visualization:</w:t>
+        <w:t>Cloud &amp; BI:</w:t>
       </w:r>
       <w:r>
         <w:rPr>
@@ -670,7 +590,7 @@
           <w:i w:val="0"/>
           <w:sz w:val="22"/>
         </w:rPr>
-        <w:t xml:space="preserve"> AWS (S3, Lambda, Athena, Glue, SageMaker, SQS), Azure (Data Services, Stream Analytics), Tableau, Power BI (DAX), Excel (VBA)</w:t>
+        <w:t xml:space="preserve"> AWS (S3, Lambda, Glue, SageMaker, SQS), Azure, Tableau, Power BI</w:t>
       </w:r>
     </w:p>
     <w:p>
@@ -729,7 +649,7 @@
           <w:i w:val="0"/>
           <w:sz w:val="22"/>
         </w:rPr>
-        <w:t xml:space="preserve"> | Visvesvaraya Technological University, Bengaluru, Karnataka, India.</w:t>
+        <w:t xml:space="preserve"> | Visvesvaraya Technological University, Bengaluru, India</w:t>
       </w:r>
     </w:p>
     <w:p>
@@ -804,7 +724,7 @@
           <w:i w:val="0"/>
           <w:sz w:val="22"/>
         </w:rPr>
-        <w:t xml:space="preserve">Co-developed </w:t>
+        <w:t xml:space="preserve">To scale 9-1-1 call-taker training beyond instructor role-play, co-developed </w:t>
       </w:r>
       <w:r>
         <w:rPr>
@@ -820,7 +740,7 @@
           <w:i w:val="0"/>
           <w:sz w:val="22"/>
         </w:rPr>
-        <w:t xml:space="preserve"> (</w:t>
+        <w:t xml:space="preserve"> with </w:t>
       </w:r>
       <w:r>
         <w:rPr>
@@ -828,55 +748,39 @@
           <w:i w:val="0"/>
           <w:sz w:val="22"/>
         </w:rPr>
+        <w:t>Fairfax County DPSC</w:t>
+      </w:r>
+      <w:r>
+        <w:rPr>
+          <w:b w:val="0"/>
+          <w:i w:val="0"/>
+          <w:sz w:val="22"/>
+        </w:rPr>
+        <w:t xml:space="preserve">, an </w:t>
+      </w:r>
+      <w:r>
+        <w:rPr>
+          <w:b/>
+          <w:i w:val="0"/>
+          <w:sz w:val="22"/>
+        </w:rPr>
+        <w:t>LLM-agent</w:t>
+      </w:r>
+      <w:r>
+        <w:rPr>
+          <w:b w:val="0"/>
+          <w:i w:val="0"/>
+          <w:sz w:val="22"/>
+        </w:rPr>
+        <w:t xml:space="preserve"> platform that simulates calls and coaches trainees in real time; published at </w:t>
+      </w:r>
+      <w:r>
+        <w:rPr>
+          <w:b/>
+          <w:i w:val="0"/>
+          <w:sz w:val="22"/>
+        </w:rPr>
         <w:t>ACM WSDM '26</w:t>
-      </w:r>
-      <w:r>
-        <w:rPr>
-          <w:b w:val="0"/>
-          <w:i w:val="0"/>
-          <w:sz w:val="22"/>
-        </w:rPr>
-        <w:t xml:space="preserve">), a conversational AI platform for 9-1-1 call-taker training with </w:t>
-      </w:r>
-      <w:r>
-        <w:rPr>
-          <w:b/>
-          <w:i w:val="0"/>
-          <w:sz w:val="22"/>
-        </w:rPr>
-        <w:t>Fairfax County DPSC</w:t>
-      </w:r>
-      <w:r>
-        <w:rPr>
-          <w:b w:val="0"/>
-          <w:i w:val="0"/>
-          <w:sz w:val="22"/>
-        </w:rPr>
-        <w:t xml:space="preserve">, using </w:t>
-      </w:r>
-      <w:r>
-        <w:rPr>
-          <w:b/>
-          <w:i w:val="0"/>
-          <w:sz w:val="22"/>
-        </w:rPr>
-        <w:t>LLM agents</w:t>
-      </w:r>
-      <w:r>
-        <w:rPr>
-          <w:b w:val="0"/>
-          <w:i w:val="0"/>
-          <w:sz w:val="22"/>
-        </w:rPr>
-        <w:t xml:space="preserve"> to generate scenarios from CAD data and deliver </w:t>
-      </w:r>
-      <w:r>
-        <w:rPr>
-          <w:b/>
-          <w:i w:val="0"/>
-          <w:sz w:val="22"/>
-        </w:rPr>
-        <w:t>real-time metacognitive nudges</w:t>
       </w:r>
       <w:r>
         <w:rPr>
@@ -909,7 +813,7 @@
           <w:i w:val="0"/>
           <w:sz w:val="22"/>
         </w:rPr>
-        <w:t xml:space="preserve">Co-developed </w:t>
+        <w:t xml:space="preserve">To generate safe training calls without commercial APIs, co-developed </w:t>
       </w:r>
       <w:r>
         <w:rPr>
@@ -925,7 +829,7 @@
           <w:i w:val="0"/>
           <w:sz w:val="22"/>
         </w:rPr>
-        <w:t xml:space="preserve"> (</w:t>
+        <w:t xml:space="preserve">, a </w:t>
       </w:r>
       <w:r>
         <w:rPr>
@@ -933,6 +837,70 @@
           <w:i w:val="0"/>
           <w:sz w:val="22"/>
         </w:rPr>
+        <w:t>RAG</w:t>
+      </w:r>
+      <w:r>
+        <w:rPr>
+          <w:b w:val="0"/>
+          <w:i w:val="0"/>
+          <w:sz w:val="22"/>
+        </w:rPr>
+        <w:t xml:space="preserve"> system on </w:t>
+      </w:r>
+      <w:r>
+        <w:rPr>
+          <w:b/>
+          <w:i w:val="0"/>
+          <w:sz w:val="22"/>
+        </w:rPr>
+        <w:t>Llama 3.1 8B</w:t>
+      </w:r>
+      <w:r>
+        <w:rPr>
+          <w:b w:val="0"/>
+          <w:i w:val="0"/>
+          <w:sz w:val="22"/>
+        </w:rPr>
+        <w:t xml:space="preserve"> that achieved </w:t>
+      </w:r>
+      <w:r>
+        <w:rPr>
+          <w:b/>
+          <w:i w:val="0"/>
+          <w:sz w:val="22"/>
+        </w:rPr>
+        <w:t>0.81 protocol F1</w:t>
+      </w:r>
+      <w:r>
+        <w:rPr>
+          <w:b w:val="0"/>
+          <w:i w:val="0"/>
+          <w:sz w:val="22"/>
+        </w:rPr>
+        <w:t xml:space="preserve"> and a </w:t>
+      </w:r>
+      <w:r>
+        <w:rPr>
+          <w:b/>
+          <w:i w:val="0"/>
+          <w:sz w:val="22"/>
+        </w:rPr>
+        <w:t>3.0% hallucination rate</w:t>
+      </w:r>
+      <w:r>
+        <w:rPr>
+          <w:b w:val="0"/>
+          <w:i w:val="0"/>
+          <w:sz w:val="22"/>
+        </w:rPr>
+        <w:t xml:space="preserve">; published at </w:t>
+      </w:r>
+      <w:r>
+        <w:rPr>
+          <w:b/>
+          <w:i w:val="0"/>
+          <w:sz w:val="22"/>
+        </w:rPr>
         <w:t>IEEE PST 2026</w:t>
       </w:r>
       <w:r>
@@ -941,87 +909,7 @@
           <w:i w:val="0"/>
           <w:sz w:val="22"/>
         </w:rPr>
-        <w:t xml:space="preserve">), a multimodal </w:t>
-      </w:r>
-      <w:r>
-        <w:rPr>
-          <w:b/>
-          <w:i w:val="0"/>
-          <w:sz w:val="22"/>
-        </w:rPr>
-        <w:t>RAG</w:t>
-      </w:r>
-      <w:r>
-        <w:rPr>
-          <w:b w:val="0"/>
-          <w:i w:val="0"/>
-          <w:sz w:val="22"/>
-        </w:rPr>
-        <w:t xml:space="preserve"> system grounding </w:t>
-      </w:r>
-      <w:r>
-        <w:rPr>
-          <w:b/>
-          <w:i w:val="0"/>
-          <w:sz w:val="22"/>
-        </w:rPr>
-        <w:t>Llama 3.1 8B</w:t>
-      </w:r>
-      <w:r>
-        <w:rPr>
-          <w:b w:val="0"/>
-          <w:i w:val="0"/>
-          <w:sz w:val="22"/>
-        </w:rPr>
-        <w:t xml:space="preserve"> in emergency protocols, reaching </w:t>
-      </w:r>
-      <w:r>
-        <w:rPr>
-          <w:b/>
-          <w:i w:val="0"/>
-          <w:sz w:val="22"/>
-        </w:rPr>
-        <w:t>0.81 protocol F1</w:t>
-      </w:r>
-      <w:r>
-        <w:rPr>
-          <w:b w:val="0"/>
-          <w:i w:val="0"/>
-          <w:sz w:val="22"/>
-        </w:rPr>
-        <w:t xml:space="preserve">, a </w:t>
-      </w:r>
-      <w:r>
-        <w:rPr>
-          <w:b/>
-          <w:i w:val="0"/>
-          <w:sz w:val="22"/>
-        </w:rPr>
-        <w:t>3.0% hallucination rate</w:t>
-      </w:r>
-      <w:r>
-        <w:rPr>
-          <w:b w:val="0"/>
-          <w:i w:val="0"/>
-          <w:sz w:val="22"/>
-        </w:rPr>
-        <w:t xml:space="preserve">, and a </w:t>
-      </w:r>
-      <w:r>
-        <w:rPr>
-          <w:b/>
-          <w:i w:val="0"/>
-          <w:sz w:val="22"/>
-        </w:rPr>
-        <w:t>97.6% pass rate</w:t>
-      </w:r>
-      <w:r>
-        <w:rPr>
-          <w:b w:val="0"/>
-          <w:i w:val="0"/>
-          <w:sz w:val="22"/>
-        </w:rPr>
-        <w:t xml:space="preserve"> on local hardware.</w:t>
+        <w:t>.</w:t>
       </w:r>
     </w:p>
     <w:p>
@@ -1042,11 +930,19 @@
       </w:r>
       <w:r>
         <w:rPr>
+          <w:b w:val="0"/>
+          <w:i w:val="0"/>
+          <w:sz w:val="22"/>
+        </w:rPr>
+        <w:t xml:space="preserve">Facing unstructured, abbreviation-heavy call records, led the </w:t>
+      </w:r>
+      <w:r>
+        <w:rPr>
           <w:b/>
           <w:i w:val="0"/>
           <w:sz w:val="22"/>
         </w:rPr>
-        <w:t>Led the RAG knowledge base and data pipeline for both platforms</w:t>
+        <w:t>RAG knowledge base and data pipeline</w:t>
       </w:r>
       <w:r>
         <w:rPr>
@@ -1054,7 +950,7 @@
           <w:i w:val="0"/>
           <w:sz w:val="22"/>
         </w:rPr>
-        <w:t xml:space="preserve">: OCR parsing, abbreviation expansion, completeness checks, and segmentation of </w:t>
+        <w:t xml:space="preserve"> (OCR, cleaning, chunking) for </w:t>
       </w:r>
       <w:r>
         <w:rPr>
@@ -1111,7 +1007,7 @@
           <w:i w:val="0"/>
           <w:sz w:val="22"/>
         </w:rPr>
-        <w:t xml:space="preserve">Built the </w:t>
+        <w:t xml:space="preserve">To ground generation in verified protocols, built the </w:t>
       </w:r>
       <w:r>
         <w:rPr>
@@ -1135,7 +1031,7 @@
           <w:i w:val="0"/>
           <w:sz w:val="22"/>
         </w:rPr>
-        <w:t>all-mpnet-base-v2</w:t>
+        <w:t>Sentence Transformers</w:t>
       </w:r>
       <w:r>
         <w:rPr>
@@ -1143,7 +1039,7 @@
           <w:i w:val="0"/>
           <w:sz w:val="22"/>
         </w:rPr>
-        <w:t xml:space="preserve"> (768-dim) embeddings in a </w:t>
+        <w:t xml:space="preserve"> embeddings, </w:t>
       </w:r>
       <w:r>
         <w:rPr>
@@ -1151,7 +1047,7 @@
           <w:i w:val="0"/>
           <w:sz w:val="22"/>
         </w:rPr>
-        <w:t>ChromaDB HNSW cosine index</w:t>
+        <w:t>ChromaDB</w:t>
       </w:r>
       <w:r>
         <w:rPr>
@@ -1159,7 +1055,7 @@
           <w:i w:val="0"/>
           <w:sz w:val="22"/>
         </w:rPr>
-        <w:t xml:space="preserve">, attaching metadata (category, severity, tags, confidence) for </w:t>
+        <w:t xml:space="preserve">, and metadata-filtered </w:t>
       </w:r>
       <w:r>
         <w:rPr>
@@ -1167,7 +1063,7 @@
           <w:i w:val="0"/>
           <w:sz w:val="22"/>
         </w:rPr>
-        <w:t>filtered top-K retrieval</w:t>
+        <w:t>top-K retrieval</w:t>
       </w:r>
       <w:r>
         <w:rPr>
@@ -1175,7 +1071,7 @@
           <w:i w:val="0"/>
           <w:sz w:val="22"/>
         </w:rPr>
-        <w:t xml:space="preserve"> and a </w:t>
+        <w:t xml:space="preserve">, raising the pass rate from </w:t>
       </w:r>
       <w:r>
         <w:rPr>
@@ -1183,7 +1079,7 @@
           <w:i w:val="0"/>
           <w:sz w:val="22"/>
         </w:rPr>
-        <w:t>70% similarity relevance gate</w:t>
+        <w:t>49.7% to 97.6%</w:t>
       </w:r>
       <w:r>
         <w:rPr>
@@ -1216,7 +1112,7 @@
           <w:i w:val="0"/>
           <w:sz w:val="22"/>
         </w:rPr>
-        <w:t xml:space="preserve">Engineered </w:t>
+        <w:t xml:space="preserve">To support live training sessions, engineered </w:t>
       </w:r>
       <w:r>
         <w:rPr>
@@ -1232,7 +1128,7 @@
           <w:i w:val="0"/>
           <w:sz w:val="22"/>
         </w:rPr>
-        <w:t xml:space="preserve"> grounding </w:t>
+        <w:t xml:space="preserve"> for </w:t>
       </w:r>
       <w:r>
         <w:rPr>
@@ -1248,7 +1144,7 @@
           <w:i w:val="0"/>
           <w:sz w:val="22"/>
         </w:rPr>
-        <w:t xml:space="preserve"> in retrieved scenarios, tuning temperature, token budgets, and context windows for </w:t>
+        <w:t xml:space="preserve">, delivering responses in under </w:t>
       </w:r>
       <w:r>
         <w:rPr>
@@ -1256,7 +1152,7 @@
           <w:i w:val="0"/>
           <w:sz w:val="22"/>
         </w:rPr>
-        <w:t>960 ms</w:t>
+        <w:t>1 second</w:t>
       </w:r>
       <w:r>
         <w:rPr>
@@ -1264,7 +1160,7 @@
           <w:i w:val="0"/>
           <w:sz w:val="22"/>
         </w:rPr>
-        <w:t xml:space="preserve"> text and </w:t>
+        <w:t xml:space="preserve"> for text and </w:t>
       </w:r>
       <w:r>
         <w:rPr>
@@ -1272,7 +1168,7 @@
           <w:i w:val="0"/>
           <w:sz w:val="22"/>
         </w:rPr>
-        <w:t>1.3 s</w:t>
+        <w:t>1.3 seconds</w:t>
       </w:r>
       <w:r>
         <w:rPr>
@@ -1280,7 +1176,7 @@
           <w:i w:val="0"/>
           <w:sz w:val="22"/>
         </w:rPr>
-        <w:t xml:space="preserve"> voice latency.</w:t>
+        <w:t xml:space="preserve"> for voice.</w:t>
       </w:r>
     </w:p>
     <w:p>
@@ -1301,11 +1197,19 @@
       </w:r>
       <w:r>
         <w:rPr>
+          <w:b w:val="0"/>
+          <w:i w:val="0"/>
+          <w:sz w:val="22"/>
+        </w:rPr>
+        <w:t xml:space="preserve">To keep unsafe content away from trainees, led the </w:t>
+      </w:r>
+      <w:r>
+        <w:rPr>
           <w:b/>
           <w:i w:val="0"/>
           <w:sz w:val="22"/>
         </w:rPr>
-        <w:t>Led the validation layer for both platforms</w:t>
+        <w:t>validation layer</w:t>
       </w:r>
       <w:r>
         <w:rPr>
@@ -1313,7 +1217,7 @@
           <w:i w:val="0"/>
           <w:sz w:val="22"/>
         </w:rPr>
-        <w:t xml:space="preserve">: </w:t>
+        <w:t xml:space="preserve"> with </w:t>
       </w:r>
       <w:r>
         <w:rPr>
@@ -1321,7 +1225,7 @@
           <w:i w:val="0"/>
           <w:sz w:val="22"/>
         </w:rPr>
-        <w:t>RAG guardrails</w:t>
+        <w:t>ontology-based guardrails</w:t>
       </w:r>
       <w:r>
         <w:rPr>
@@ -1329,7 +1233,7 @@
           <w:i w:val="0"/>
           <w:sz w:val="22"/>
         </w:rPr>
-        <w:t xml:space="preserve"> with a NENA-based </w:t>
+        <w:t xml:space="preserve"> and </w:t>
       </w:r>
       <w:r>
         <w:rPr>
@@ -1337,7 +1241,7 @@
           <w:i w:val="0"/>
           <w:sz w:val="22"/>
         </w:rPr>
-        <w:t>ontology validator</w:t>
+        <w:t>NLI hallucination checks</w:t>
       </w:r>
       <w:r>
         <w:rPr>
@@ -1345,7 +1249,7 @@
           <w:i w:val="0"/>
           <w:sz w:val="22"/>
         </w:rPr>
-        <w:t xml:space="preserve">, </w:t>
+        <w:t xml:space="preserve"> against NENA protocols, lowering hallucinations from </w:t>
       </w:r>
       <w:r>
         <w:rPr>
@@ -1353,7 +1257,7 @@
           <w:i w:val="0"/>
           <w:sz w:val="22"/>
         </w:rPr>
-        <w:t>LLM</w:t>
+        <w:t>9.5% to 3.0%</w:t>
       </w:r>
       <w:r>
         <w:rPr>
@@ -1361,39 +1265,7 @@
           <w:i w:val="0"/>
           <w:sz w:val="22"/>
         </w:rPr>
-        <w:t xml:space="preserve"> and </w:t>
-      </w:r>
-      <w:r>
-        <w:rPr>
-          <w:b/>
-          <w:i w:val="0"/>
-          <w:sz w:val="22"/>
-        </w:rPr>
-        <w:t>NLI-based hallucination checks</w:t>
-      </w:r>
-      <w:r>
-        <w:rPr>
-          <w:b w:val="0"/>
-          <w:i w:val="0"/>
-          <w:sz w:val="22"/>
-        </w:rPr>
-        <w:t xml:space="preserve">, PASS/REVIEW/FAIL scoring, and an </w:t>
-      </w:r>
-      <w:r>
-        <w:rPr>
-          <w:b/>
-          <w:i w:val="0"/>
-          <w:sz w:val="22"/>
-        </w:rPr>
-        <w:t>85% similarity</w:t>
-      </w:r>
-      <w:r>
-        <w:rPr>
-          <w:b w:val="0"/>
-          <w:i w:val="0"/>
-          <w:sz w:val="22"/>
-        </w:rPr>
-        <w:t xml:space="preserve"> gate.</w:t>
+        <w:t>.</w:t>
       </w:r>
     </w:p>
     <w:p>
@@ -1418,7 +1290,7 @@
           <w:i w:val="0"/>
           <w:sz w:val="22"/>
         </w:rPr>
-        <w:t xml:space="preserve">Ran </w:t>
+        <w:t xml:space="preserve">To speed up literature search, built a </w:t>
       </w:r>
       <w:r>
         <w:rPr>
@@ -1426,7 +1298,7 @@
           <w:i w:val="0"/>
           <w:sz w:val="22"/>
         </w:rPr>
-        <w:t>RAG ablation studies</w:t>
+        <w:t>RAG research assistant</w:t>
       </w:r>
       <w:r>
         <w:rPr>
@@ -1434,7 +1306,7 @@
           <w:i w:val="0"/>
           <w:sz w:val="22"/>
         </w:rPr>
-        <w:t xml:space="preserve"> showing retrieval drives quality (</w:t>
+        <w:t xml:space="preserve"> with </w:t>
       </w:r>
       <w:r>
         <w:rPr>
@@ -1442,7 +1314,7 @@
           <w:i w:val="0"/>
           <w:sz w:val="22"/>
         </w:rPr>
-        <w:t>F1 0.81 vs. 0.59</w:t>
+        <w:t>LlamaIndex, pgvector,</w:t>
       </w:r>
       <w:r>
         <w:rPr>
@@ -1458,7 +1330,7 @@
           <w:i w:val="0"/>
           <w:sz w:val="22"/>
         </w:rPr>
-        <w:t>97.6% vs. 49.7%</w:t>
+        <w:t>FAISS</w:t>
       </w:r>
       <w:r>
         <w:rPr>
@@ -1466,7 +1338,7 @@
           <w:i w:val="0"/>
           <w:sz w:val="22"/>
         </w:rPr>
-        <w:t xml:space="preserve"> pass rate without it), while ontology validation acts as a safety guardrail that cuts hallucinations from </w:t>
+        <w:t xml:space="preserve">, raising </w:t>
       </w:r>
       <w:r>
         <w:rPr>
@@ -1474,7 +1346,7 @@
           <w:i w:val="0"/>
           <w:sz w:val="22"/>
         </w:rPr>
-        <w:t>9.5% to 3.0%</w:t>
+        <w:t>recall@10 from 61% to 88%</w:t>
       </w:r>
       <w:r>
         <w:rPr>
@@ -1482,7 +1354,39 @@
           <w:i w:val="0"/>
           <w:sz w:val="22"/>
         </w:rPr>
-        <w:t>.</w:t>
+        <w:t xml:space="preserve"> (RAGAS-evaluated) for </w:t>
+      </w:r>
+      <w:r>
+        <w:rPr>
+          <w:b/>
+          <w:i w:val="0"/>
+          <w:sz w:val="22"/>
+        </w:rPr>
+        <w:t>40+ researchers</w:t>
+      </w:r>
+      <w:r>
+        <w:rPr>
+          <w:b w:val="0"/>
+          <w:i w:val="0"/>
+          <w:sz w:val="22"/>
+        </w:rPr>
+        <w:t xml:space="preserve"> at </w:t>
+      </w:r>
+      <w:r>
+        <w:rPr>
+          <w:b/>
+          <w:i w:val="0"/>
+          <w:sz w:val="22"/>
+        </w:rPr>
+        <w:t>190 ms p95</w:t>
+      </w:r>
+      <w:r>
+        <w:rPr>
+          <w:b w:val="0"/>
+          <w:i w:val="0"/>
+          <w:sz w:val="22"/>
+        </w:rPr>
+        <w:t xml:space="preserve"> latency.</w:t>
       </w:r>
     </w:p>
     <w:p>
@@ -1507,7 +1411,7 @@
           <w:i w:val="0"/>
           <w:sz w:val="22"/>
         </w:rPr>
-        <w:t xml:space="preserve">Built a </w:t>
+        <w:t xml:space="preserve">To make model decisions explainable, applied </w:t>
       </w:r>
       <w:r>
         <w:rPr>
@@ -1515,7 +1419,7 @@
           <w:i w:val="0"/>
           <w:sz w:val="22"/>
         </w:rPr>
-        <w:t>RAG research assistant</w:t>
+        <w:t>SHAP</w:t>
       </w:r>
       <w:r>
         <w:rPr>
@@ -1523,7 +1427,7 @@
           <w:i w:val="0"/>
           <w:sz w:val="22"/>
         </w:rPr>
-        <w:t xml:space="preserve"> with </w:t>
+        <w:t xml:space="preserve"> to intent classification and behavioral </w:t>
       </w:r>
       <w:r>
         <w:rPr>
@@ -1531,7 +1435,7 @@
           <w:i w:val="0"/>
           <w:sz w:val="22"/>
         </w:rPr>
-        <w:t>LlamaIndex, pgvector,</w:t>
+        <w:t>anomaly detection</w:t>
       </w:r>
       <w:r>
         <w:rPr>
@@ -1539,7 +1443,7 @@
           <w:i w:val="0"/>
           <w:sz w:val="22"/>
         </w:rPr>
-        <w:t xml:space="preserve"> and </w:t>
+        <w:t xml:space="preserve"> models, tuning </w:t>
       </w:r>
       <w:r>
         <w:rPr>
@@ -1547,7 +1451,7 @@
           <w:i w:val="0"/>
           <w:sz w:val="22"/>
         </w:rPr>
-        <w:t>FAISS</w:t>
+        <w:t>LightGBM</w:t>
       </w:r>
       <w:r>
         <w:rPr>
@@ -1555,7 +1459,7 @@
           <w:i w:val="0"/>
           <w:sz w:val="22"/>
         </w:rPr>
-        <w:t xml:space="preserve">, raising </w:t>
+        <w:t xml:space="preserve"> alert thresholds to cut false positives by </w:t>
       </w:r>
       <w:r>
         <w:rPr>
@@ -1563,7 +1467,7 @@
           <w:i w:val="0"/>
           <w:sz w:val="22"/>
         </w:rPr>
-        <w:t>recall@10 from 61% to 88%</w:t>
+        <w:t>25%</w:t>
       </w:r>
       <w:r>
         <w:rPr>
@@ -1571,55 +1475,7 @@
           <w:i w:val="0"/>
           <w:sz w:val="22"/>
         </w:rPr>
-        <w:t xml:space="preserve"> (evaluated with </w:t>
-      </w:r>
-      <w:r>
-        <w:rPr>
-          <w:b/>
-          <w:i w:val="0"/>
-          <w:sz w:val="22"/>
-        </w:rPr>
-        <w:t>RAGAS</w:t>
-      </w:r>
-      <w:r>
-        <w:rPr>
-          <w:b w:val="0"/>
-          <w:i w:val="0"/>
-          <w:sz w:val="22"/>
-        </w:rPr>
-        <w:t xml:space="preserve">) and serving </w:t>
-      </w:r>
-      <w:r>
-        <w:rPr>
-          <w:b/>
-          <w:i w:val="0"/>
-          <w:sz w:val="22"/>
-        </w:rPr>
-        <w:t>40+ researchers</w:t>
-      </w:r>
-      <w:r>
-        <w:rPr>
-          <w:b w:val="0"/>
-          <w:i w:val="0"/>
-          <w:sz w:val="22"/>
-        </w:rPr>
-        <w:t xml:space="preserve"> at </w:t>
-      </w:r>
-      <w:r>
-        <w:rPr>
-          <w:b/>
-          <w:i w:val="0"/>
-          <w:sz w:val="22"/>
-        </w:rPr>
-        <w:t>190 ms p95</w:t>
-      </w:r>
-      <w:r>
-        <w:rPr>
-          <w:b w:val="0"/>
-          <w:i w:val="0"/>
-          <w:sz w:val="22"/>
-        </w:rPr>
-        <w:t xml:space="preserve"> latency.</w:t>
+        <w:t>.</w:t>
       </w:r>
     </w:p>
     <w:p>
@@ -1644,7 +1500,7 @@
           <w:i w:val="0"/>
           <w:sz w:val="22"/>
         </w:rPr>
-        <w:t xml:space="preserve">Built real-time </w:t>
+        <w:t xml:space="preserve">To run LLMs on limited hardware, fine-tuned </w:t>
       </w:r>
       <w:r>
         <w:rPr>
@@ -1652,7 +1508,7 @@
           <w:i w:val="0"/>
           <w:sz w:val="22"/>
         </w:rPr>
-        <w:t>trace-log analytics</w:t>
+        <w:t>Llama 3</w:t>
       </w:r>
       <w:r>
         <w:rPr>
@@ -1660,7 +1516,7 @@
           <w:i w:val="0"/>
           <w:sz w:val="22"/>
         </w:rPr>
-        <w:t xml:space="preserve"> (event streams, Task Completion Rate, Average Field Latency, goal-alignment scoring) feeding an instructor </w:t>
+        <w:t xml:space="preserve"> with </w:t>
       </w:r>
       <w:r>
         <w:rPr>
@@ -1668,7 +1524,7 @@
           <w:i w:val="0"/>
           <w:sz w:val="22"/>
         </w:rPr>
-        <w:t>performance dashboard</w:t>
+        <w:t>LoRA/PEFT</w:t>
       </w:r>
       <w:r>
         <w:rPr>
@@ -1676,7 +1532,55 @@
           <w:i w:val="0"/>
           <w:sz w:val="22"/>
         </w:rPr>
-        <w:t xml:space="preserve"> for adaptive feedback.</w:t>
+        <w:t xml:space="preserve"> and </w:t>
+      </w:r>
+      <w:r>
+        <w:rPr>
+          <w:b/>
+          <w:i w:val="0"/>
+          <w:sz w:val="22"/>
+        </w:rPr>
+        <w:t>quantization-aware training</w:t>
+      </w:r>
+      <w:r>
+        <w:rPr>
+          <w:b w:val="0"/>
+          <w:i w:val="0"/>
+          <w:sz w:val="22"/>
+        </w:rPr>
+        <w:t xml:space="preserve">, shrinking models by </w:t>
+      </w:r>
+      <w:r>
+        <w:rPr>
+          <w:b/>
+          <w:i w:val="0"/>
+          <w:sz w:val="22"/>
+        </w:rPr>
+        <w:t>40%</w:t>
+      </w:r>
+      <w:r>
+        <w:rPr>
+          <w:b w:val="0"/>
+          <w:i w:val="0"/>
+          <w:sz w:val="22"/>
+        </w:rPr>
+        <w:t xml:space="preserve"> while staying within </w:t>
+      </w:r>
+      <w:r>
+        <w:rPr>
+          <w:b/>
+          <w:i w:val="0"/>
+          <w:sz w:val="22"/>
+        </w:rPr>
+        <w:t>3%</w:t>
+      </w:r>
+      <w:r>
+        <w:rPr>
+          <w:b w:val="0"/>
+          <w:i w:val="0"/>
+          <w:sz w:val="22"/>
+        </w:rPr>
+        <w:t xml:space="preserve"> of full-precision accuracy.</w:t>
       </w:r>
     </w:p>
     <w:p>
@@ -1701,7 +1605,7 @@
           <w:i w:val="0"/>
           <w:sz w:val="22"/>
         </w:rPr>
-        <w:t xml:space="preserve">Applied </w:t>
+        <w:t xml:space="preserve">To move prototypes into production, set up </w:t>
       </w:r>
       <w:r>
         <w:rPr>
@@ -1709,7 +1613,7 @@
           <w:i w:val="0"/>
           <w:sz w:val="22"/>
         </w:rPr>
-        <w:t>graph-based analytics</w:t>
+        <w:t>MLflow</w:t>
       </w:r>
       <w:r>
         <w:rPr>
@@ -1717,7 +1621,7 @@
           <w:i w:val="0"/>
           <w:sz w:val="22"/>
         </w:rPr>
-        <w:t xml:space="preserve"> and </w:t>
+        <w:t xml:space="preserve"> tracking, </w:t>
       </w:r>
       <w:r>
         <w:rPr>
@@ -1725,7 +1629,7 @@
           <w:i w:val="0"/>
           <w:sz w:val="22"/>
         </w:rPr>
-        <w:t>ensemble models</w:t>
+        <w:t>FastAPI</w:t>
       </w:r>
       <w:r>
         <w:rPr>
@@ -1733,7 +1637,7 @@
           <w:i w:val="0"/>
           <w:sz w:val="22"/>
         </w:rPr>
-        <w:t xml:space="preserve"> to large-scale disaster datasets on the </w:t>
+        <w:t xml:space="preserve"> services, </w:t>
       </w:r>
       <w:r>
         <w:rPr>
@@ -1741,7 +1645,7 @@
           <w:i w:val="0"/>
           <w:sz w:val="22"/>
         </w:rPr>
-        <w:t>ORC Hopper HPC cluster</w:t>
+        <w:t>Docker</w:t>
       </w:r>
       <w:r>
         <w:rPr>
@@ -1749,7 +1653,7 @@
           <w:i w:val="0"/>
           <w:sz w:val="22"/>
         </w:rPr>
-        <w:t xml:space="preserve">, forecasting community coping trends with an </w:t>
+        <w:t xml:space="preserve">, and </w:t>
       </w:r>
       <w:r>
         <w:rPr>
@@ -1757,7 +1661,39 @@
           <w:i w:val="0"/>
           <w:sz w:val="22"/>
         </w:rPr>
-        <w:t>RMSE of 0.89</w:t>
+        <w:t>CI/CD</w:t>
+      </w:r>
+      <w:r>
+        <w:rPr>
+          <w:b w:val="0"/>
+          <w:i w:val="0"/>
+          <w:sz w:val="22"/>
+        </w:rPr>
+        <w:t xml:space="preserve">, cutting release cycles from </w:t>
+      </w:r>
+      <w:r>
+        <w:rPr>
+          <w:b/>
+          <w:i w:val="0"/>
+          <w:sz w:val="22"/>
+        </w:rPr>
+        <w:t>2 weeks to 5 days</w:t>
+      </w:r>
+      <w:r>
+        <w:rPr>
+          <w:b w:val="0"/>
+          <w:i w:val="0"/>
+          <w:sz w:val="22"/>
+        </w:rPr>
+        <w:t xml:space="preserve"> with </w:t>
+      </w:r>
+      <w:r>
+        <w:rPr>
+          <w:b/>
+          <w:i w:val="0"/>
+          <w:sz w:val="22"/>
+        </w:rPr>
+        <w:t>A/B testing</w:t>
       </w:r>
       <w:r>
         <w:rPr>
@@ -1790,7 +1726,7 @@
           <w:i w:val="0"/>
           <w:sz w:val="22"/>
         </w:rPr>
-        <w:t xml:space="preserve">Implemented </w:t>
+        <w:t xml:space="preserve">To study community coping during disasters, applied </w:t>
       </w:r>
       <w:r>
         <w:rPr>
@@ -1798,7 +1734,7 @@
           <w:i w:val="0"/>
           <w:sz w:val="22"/>
         </w:rPr>
-        <w:t>model explainability</w:t>
+        <w:t>graph analytics</w:t>
       </w:r>
       <w:r>
         <w:rPr>
@@ -1806,7 +1742,7 @@
           <w:i w:val="0"/>
           <w:sz w:val="22"/>
         </w:rPr>
-        <w:t xml:space="preserve"> using </w:t>
+        <w:t xml:space="preserve"> and </w:t>
       </w:r>
       <w:r>
         <w:rPr>
@@ -1814,7 +1750,7 @@
           <w:i w:val="0"/>
           <w:sz w:val="22"/>
         </w:rPr>
-        <w:t>SHAP</w:t>
+        <w:t>ensemble models</w:t>
       </w:r>
       <w:r>
         <w:rPr>
@@ -1822,7 +1758,7 @@
           <w:i w:val="0"/>
           <w:sz w:val="22"/>
         </w:rPr>
-        <w:t xml:space="preserve"> for </w:t>
+        <w:t xml:space="preserve"> on the </w:t>
       </w:r>
       <w:r>
         <w:rPr>
@@ -1830,7 +1766,7 @@
           <w:i w:val="0"/>
           <w:sz w:val="22"/>
         </w:rPr>
-        <w:t>intent classification</w:t>
+        <w:t>ORC Hopper HPC cluster</w:t>
       </w:r>
       <w:r>
         <w:rPr>
@@ -1838,7 +1774,7 @@
           <w:i w:val="0"/>
           <w:sz w:val="22"/>
         </w:rPr>
-        <w:t xml:space="preserve"> and </w:t>
+        <w:t xml:space="preserve">, forecasting trends with an </w:t>
       </w:r>
       <w:r>
         <w:rPr>
@@ -1846,7 +1782,7 @@
           <w:i w:val="0"/>
           <w:sz w:val="22"/>
         </w:rPr>
-        <w:t>behavioral anomaly detection</w:t>
+        <w:t>RMSE of 0.89</w:t>
       </w:r>
       <w:r>
         <w:rPr>
@@ -1854,39 +1790,42 @@
           <w:i w:val="0"/>
           <w:sz w:val="22"/>
         </w:rPr>
-        <w:t xml:space="preserve"> models, guiding threshold tuning and model governance; the </w:t>
-      </w:r>
+        <w:t>.</w:t>
+      </w:r>
+    </w:p>
+    <w:p>
+      <w:pPr>
+        <w:tabs>
+          <w:tab w:pos="11592" w:val="right"/>
+        </w:tabs>
+        <w:spacing w:before="120" w:after="40"/>
+      </w:pPr>
       <w:r>
         <w:rPr>
           <w:b/>
-          <w:i w:val="0"/>
-          <w:sz w:val="22"/>
-        </w:rPr>
-        <w:t>LightGBM</w:t>
-      </w:r>
-      <w:r>
-        <w:rPr>
-          <w:b w:val="0"/>
-          <w:i w:val="0"/>
-          <w:sz w:val="22"/>
-        </w:rPr>
-        <w:t xml:space="preserve"> anomaly detector reduced false positives by </w:t>
+          <w:sz w:val="24"/>
+        </w:rPr>
+        <w:t xml:space="preserve">Carelon Global Solutions (Elevance Health) </w:t>
       </w:r>
       <w:r>
         <w:rPr>
           <w:b/>
-          <w:i w:val="0"/>
-          <w:sz w:val="22"/>
-        </w:rPr>
-        <w:t>25%</w:t>
-      </w:r>
-      <w:r>
-        <w:rPr>
-          <w:b w:val="0"/>
-          <w:i w:val="0"/>
-          <w:sz w:val="22"/>
-        </w:rPr>
-        <w:t>.</w:t>
+        </w:rPr>
+        <w:t xml:space="preserve">| </w:t>
+      </w:r>
+      <w:r>
+        <w:rPr>
+          <w:b/>
+          <w:i/>
+        </w:rPr>
+        <w:t>Machine Learning Engineer</w:t>
+      </w:r>
+      <w:r>
+        <w:rPr>
+          <w:b/>
+        </w:rPr>
+        <w:tab/>
+        <w:t>Bengaluru, India | May 2022 - August 2023</w:t>
       </w:r>
     </w:p>
     <w:p>
@@ -1911,7 +1850,7 @@
           <w:i w:val="0"/>
           <w:sz w:val="22"/>
         </w:rPr>
-        <w:t xml:space="preserve">Fine-tuned </w:t>
+        <w:t xml:space="preserve">To automate clinical text review, built </w:t>
       </w:r>
       <w:r>
         <w:rPr>
@@ -1919,7 +1858,7 @@
           <w:i w:val="0"/>
           <w:sz w:val="22"/>
         </w:rPr>
-        <w:t>Llama 3</w:t>
+        <w:t>BERT/BioBERT</w:t>
       </w:r>
       <w:r>
         <w:rPr>
@@ -1927,7 +1866,7 @@
           <w:i w:val="0"/>
           <w:sz w:val="22"/>
         </w:rPr>
-        <w:t xml:space="preserve"> with </w:t>
+        <w:t xml:space="preserve"> entity-extraction models on unstructured medical notes, reaching </w:t>
       </w:r>
       <w:r>
         <w:rPr>
@@ -1935,7 +1874,7 @@
           <w:i w:val="0"/>
           <w:sz w:val="22"/>
         </w:rPr>
-        <w:t>LoRA/PEFT</w:t>
+        <w:t>80% accuracy</w:t>
       </w:r>
       <w:r>
         <w:rPr>
@@ -1943,7 +1882,7 @@
           <w:i w:val="0"/>
           <w:sz w:val="22"/>
         </w:rPr>
-        <w:t xml:space="preserve"> and </w:t>
+        <w:t xml:space="preserve"> and cutting processing time by </w:t>
       </w:r>
       <w:r>
         <w:rPr>
@@ -1951,7 +1890,7 @@
           <w:i w:val="0"/>
           <w:sz w:val="22"/>
         </w:rPr>
-        <w:t>QAT</w:t>
+        <w:t>55%</w:t>
       </w:r>
       <w:r>
         <w:rPr>
@@ -1959,39 +1898,7 @@
           <w:i w:val="0"/>
           <w:sz w:val="22"/>
         </w:rPr>
-        <w:t xml:space="preserve">, cutting model size by </w:t>
-      </w:r>
-      <w:r>
-        <w:rPr>
-          <w:b/>
-          <w:i w:val="0"/>
-          <w:sz w:val="22"/>
-        </w:rPr>
-        <w:t>40%</w:t>
-      </w:r>
-      <w:r>
-        <w:rPr>
-          <w:b w:val="0"/>
-          <w:i w:val="0"/>
-          <w:sz w:val="22"/>
-        </w:rPr>
-        <w:t xml:space="preserve"> within </w:t>
-      </w:r>
-      <w:r>
-        <w:rPr>
-          <w:b/>
-          <w:i w:val="0"/>
-          <w:sz w:val="22"/>
-        </w:rPr>
-        <w:t>3%</w:t>
-      </w:r>
-      <w:r>
-        <w:rPr>
-          <w:b w:val="0"/>
-          <w:i w:val="0"/>
-          <w:sz w:val="22"/>
-        </w:rPr>
-        <w:t xml:space="preserve"> of full-precision accuracy.</w:t>
+        <w:t>.</w:t>
       </w:r>
     </w:p>
     <w:p>
@@ -2016,7 +1923,7 @@
           <w:i w:val="0"/>
           <w:sz w:val="22"/>
         </w:rPr>
-        <w:t xml:space="preserve">Took models and RAG services from </w:t>
+        <w:t xml:space="preserve">To improve prediction quality, tuned </w:t>
       </w:r>
       <w:r>
         <w:rPr>
@@ -2024,7 +1931,7 @@
           <w:i w:val="0"/>
           <w:sz w:val="22"/>
         </w:rPr>
-        <w:t>proof of concept to production</w:t>
+        <w:t>Scikit-learn</w:t>
       </w:r>
       <w:r>
         <w:rPr>
@@ -2032,7 +1939,7 @@
           <w:i w:val="0"/>
           <w:sz w:val="22"/>
         </w:rPr>
-        <w:t xml:space="preserve"> with </w:t>
+        <w:t xml:space="preserve"> and </w:t>
       </w:r>
       <w:r>
         <w:rPr>
@@ -2040,7 +1947,7 @@
           <w:i w:val="0"/>
           <w:sz w:val="22"/>
         </w:rPr>
-        <w:t>MLflow, FastAPI, Docker,</w:t>
+        <w:t>XGBoost</w:t>
       </w:r>
       <w:r>
         <w:rPr>
@@ -2048,7 +1955,7 @@
           <w:i w:val="0"/>
           <w:sz w:val="22"/>
         </w:rPr>
-        <w:t xml:space="preserve"> and </w:t>
+        <w:t xml:space="preserve"> models through feature engineering and hyperparameter search, raising accuracy by </w:t>
       </w:r>
       <w:r>
         <w:rPr>
@@ -2056,7 +1963,7 @@
           <w:i w:val="0"/>
           <w:sz w:val="22"/>
         </w:rPr>
-        <w:t>CI/CD</w:t>
+        <w:t>8%</w:t>
       </w:r>
       <w:r>
         <w:rPr>
@@ -2064,7 +1971,7 @@
           <w:i w:val="0"/>
           <w:sz w:val="22"/>
         </w:rPr>
-        <w:t xml:space="preserve">, cutting release cycles from </w:t>
+        <w:t xml:space="preserve"> and cutting training time by </w:t>
       </w:r>
       <w:r>
         <w:rPr>
@@ -2072,7 +1979,7 @@
           <w:i w:val="0"/>
           <w:sz w:val="22"/>
         </w:rPr>
-        <w:t>2 weeks to 5 days</w:t>
+        <w:t>15%</w:t>
       </w:r>
       <w:r>
         <w:rPr>
@@ -2080,58 +1987,7 @@
           <w:i w:val="0"/>
           <w:sz w:val="22"/>
         </w:rPr>
-        <w:t xml:space="preserve"> with </w:t>
-      </w:r>
-      <w:r>
-        <w:rPr>
-          <w:b/>
-          <w:i w:val="0"/>
-          <w:sz w:val="22"/>
-        </w:rPr>
-        <w:t>A/B testing</w:t>
-      </w:r>
-      <w:r>
-        <w:rPr>
-          <w:b w:val="0"/>
-          <w:i w:val="0"/>
-          <w:sz w:val="22"/>
-        </w:rPr>
         <w:t>.</w:t>
-      </w:r>
-    </w:p>
-    <w:p>
-      <w:pPr>
-        <w:tabs>
-          <w:tab w:pos="11592" w:val="right"/>
-        </w:tabs>
-        <w:spacing w:before="120" w:after="40"/>
-      </w:pPr>
-      <w:r>
-        <w:rPr>
-          <w:b/>
-          <w:sz w:val="24"/>
-        </w:rPr>
-        <w:t xml:space="preserve">Carelon Global Solutions (Elevance Health) </w:t>
-      </w:r>
-      <w:r>
-        <w:rPr>
-          <w:b/>
-        </w:rPr>
-        <w:t xml:space="preserve">| </w:t>
-      </w:r>
-      <w:r>
-        <w:rPr>
-          <w:b/>
-          <w:i/>
-        </w:rPr>
-        <w:t>Machine Learning Engineer</w:t>
-      </w:r>
-      <w:r>
-        <w:rPr>
-          <w:b/>
-        </w:rPr>
-        <w:tab/>
-        <w:t>Bengaluru, India | May 2022 - August 2023</w:t>
       </w:r>
     </w:p>
     <w:p>
@@ -2156,7 +2012,7 @@
           <w:i w:val="0"/>
           <w:sz w:val="22"/>
         </w:rPr>
-        <w:t xml:space="preserve">Built NLP models using </w:t>
+        <w:t xml:space="preserve">To serve models reliably, containerized inference services with </w:t>
       </w:r>
       <w:r>
         <w:rPr>
@@ -2164,7 +2020,7 @@
           <w:i w:val="0"/>
           <w:sz w:val="22"/>
         </w:rPr>
-        <w:t>BERT</w:t>
+        <w:t>Docker, Kubernetes,</w:t>
       </w:r>
       <w:r>
         <w:rPr>
@@ -2180,7 +2036,7 @@
           <w:i w:val="0"/>
           <w:sz w:val="22"/>
         </w:rPr>
-        <w:t>BioBERT</w:t>
+        <w:t>Jenkins CI/CD</w:t>
       </w:r>
       <w:r>
         <w:rPr>
@@ -2188,7 +2044,7 @@
           <w:i w:val="0"/>
           <w:sz w:val="22"/>
         </w:rPr>
-        <w:t xml:space="preserve"> for clinical entity extraction from unstructured medical text, achieving </w:t>
+        <w:t xml:space="preserve">, improving uptime by </w:t>
       </w:r>
       <w:r>
         <w:rPr>
@@ -2196,7 +2052,7 @@
           <w:i w:val="0"/>
           <w:sz w:val="22"/>
         </w:rPr>
-        <w:t>80% accuracy</w:t>
+        <w:t>20%</w:t>
       </w:r>
       <w:r>
         <w:rPr>
@@ -2204,7 +2060,7 @@
           <w:i w:val="0"/>
           <w:sz w:val="22"/>
         </w:rPr>
-        <w:t xml:space="preserve"> and reducing processing time by </w:t>
+        <w:t xml:space="preserve"> and enabling real-time EHR integration via </w:t>
       </w:r>
       <w:r>
         <w:rPr>
@@ -2212,7 +2068,7 @@
           <w:i w:val="0"/>
           <w:sz w:val="22"/>
         </w:rPr>
-        <w:t>55%</w:t>
+        <w:t>REST APIs</w:t>
       </w:r>
       <w:r>
         <w:rPr>
@@ -2245,7 +2101,7 @@
           <w:i w:val="0"/>
           <w:sz w:val="22"/>
         </w:rPr>
-        <w:t xml:space="preserve">Improved </w:t>
+        <w:t xml:space="preserve">To speed up model training, built ingestion of </w:t>
       </w:r>
       <w:r>
         <w:rPr>
@@ -2253,7 +2109,7 @@
           <w:i w:val="0"/>
           <w:sz w:val="22"/>
         </w:rPr>
-        <w:t>Scikit-learn</w:t>
+        <w:t>400K+ XML/JSON healthcare records</w:t>
       </w:r>
       <w:r>
         <w:rPr>
@@ -2261,6 +2117,22 @@
           <w:i w:val="0"/>
           <w:sz w:val="22"/>
         </w:rPr>
+        <w:t xml:space="preserve"> into </w:t>
+      </w:r>
+      <w:r>
+        <w:rPr>
+          <w:b/>
+          <w:i w:val="0"/>
+          <w:sz w:val="22"/>
+        </w:rPr>
+        <w:t>Snowflake</w:t>
+      </w:r>
+      <w:r>
+        <w:rPr>
+          <w:b w:val="0"/>
+          <w:i w:val="0"/>
+          <w:sz w:val="22"/>
+        </w:rPr>
         <w:t xml:space="preserve"> and </w:t>
       </w:r>
       <w:r>
@@ -2269,7 +2141,7 @@
           <w:i w:val="0"/>
           <w:sz w:val="22"/>
         </w:rPr>
-        <w:t>XGBoost</w:t>
+        <w:t>Databricks</w:t>
       </w:r>
       <w:r>
         <w:rPr>
@@ -2277,7 +2149,7 @@
           <w:i w:val="0"/>
           <w:sz w:val="22"/>
         </w:rPr>
-        <w:t xml:space="preserve"> models through feature engineering and hyperparameter tuning, increasing accuracy by </w:t>
+        <w:t xml:space="preserve">, accelerating training by </w:t>
       </w:r>
       <w:r>
         <w:rPr>
@@ -2285,7 +2157,7 @@
           <w:i w:val="0"/>
           <w:sz w:val="22"/>
         </w:rPr>
-        <w:t>8%</w:t>
+        <w:t>60%</w:t>
       </w:r>
       <w:r>
         <w:rPr>
@@ -2293,7 +2165,7 @@
           <w:i w:val="0"/>
           <w:sz w:val="22"/>
         </w:rPr>
-        <w:t xml:space="preserve"> and cutting training time by </w:t>
+        <w:t xml:space="preserve"> and cutting preprocessing time by </w:t>
       </w:r>
       <w:r>
         <w:rPr>
@@ -2301,7 +2173,7 @@
           <w:i w:val="0"/>
           <w:sz w:val="22"/>
         </w:rPr>
-        <w:t>15%</w:t>
+        <w:t>70%</w:t>
       </w:r>
       <w:r>
         <w:rPr>
@@ -2334,7 +2206,7 @@
           <w:i w:val="0"/>
           <w:sz w:val="22"/>
         </w:rPr>
-        <w:t xml:space="preserve">Containerized ML inference services with </w:t>
+        <w:t xml:space="preserve">To fix inaccurate provider data feeding ML models, automated daily </w:t>
       </w:r>
       <w:r>
         <w:rPr>
@@ -2342,7 +2214,7 @@
           <w:i w:val="0"/>
           <w:sz w:val="22"/>
         </w:rPr>
-        <w:t>Docker, Kubernetes,</w:t>
+        <w:t>NPPES</w:t>
       </w:r>
       <w:r>
         <w:rPr>
@@ -2350,7 +2222,7 @@
           <w:i w:val="0"/>
           <w:sz w:val="22"/>
         </w:rPr>
-        <w:t xml:space="preserve"> and </w:t>
+        <w:t xml:space="preserve"> ingestion in </w:t>
       </w:r>
       <w:r>
         <w:rPr>
@@ -2358,7 +2230,7 @@
           <w:i w:val="0"/>
           <w:sz w:val="22"/>
         </w:rPr>
-        <w:t>Jenkins CI/CD</w:t>
+        <w:t>Python</w:t>
       </w:r>
       <w:r>
         <w:rPr>
@@ -2366,7 +2238,7 @@
           <w:i w:val="0"/>
           <w:sz w:val="22"/>
         </w:rPr>
-        <w:t xml:space="preserve">, improving system uptime by </w:t>
+        <w:t xml:space="preserve">, improving data accuracy by </w:t>
       </w:r>
       <w:r>
         <w:rPr>
@@ -2374,7 +2246,7 @@
           <w:i w:val="0"/>
           <w:sz w:val="22"/>
         </w:rPr>
-        <w:t>20%</w:t>
+        <w:t>74%</w:t>
       </w:r>
       <w:r>
         <w:rPr>
@@ -2382,7 +2254,7 @@
           <w:i w:val="0"/>
           <w:sz w:val="22"/>
         </w:rPr>
-        <w:t xml:space="preserve"> and enabling real-time EHR integration via </w:t>
+        <w:t xml:space="preserve"> and reducing processing overhead by </w:t>
       </w:r>
       <w:r>
         <w:rPr>
@@ -2390,7 +2262,7 @@
           <w:i w:val="0"/>
           <w:sz w:val="22"/>
         </w:rPr>
-        <w:t>REST APIs</w:t>
+        <w:t>60%</w:t>
       </w:r>
       <w:r>
         <w:rPr>
@@ -2423,7 +2295,7 @@
           <w:i w:val="0"/>
           <w:sz w:val="22"/>
         </w:rPr>
-        <w:t xml:space="preserve">Engineered ML-ready ingestion of </w:t>
+        <w:t xml:space="preserve">To support ML at scale, designed </w:t>
       </w:r>
       <w:r>
         <w:rPr>
@@ -2431,7 +2303,7 @@
           <w:i w:val="0"/>
           <w:sz w:val="22"/>
         </w:rPr>
-        <w:t>400K+ XML/JSON healthcare records</w:t>
+        <w:t>20+ ETL pipelines</w:t>
       </w:r>
       <w:r>
         <w:rPr>
@@ -2439,7 +2311,7 @@
           <w:i w:val="0"/>
           <w:sz w:val="22"/>
         </w:rPr>
-        <w:t xml:space="preserve"> into </w:t>
+        <w:t xml:space="preserve"> with </w:t>
       </w:r>
       <w:r>
         <w:rPr>
@@ -2447,7 +2319,7 @@
           <w:i w:val="0"/>
           <w:sz w:val="22"/>
         </w:rPr>
-        <w:t>Snowflake</w:t>
+        <w:t>Airflow, PySpark,</w:t>
       </w:r>
       <w:r>
         <w:rPr>
@@ -2463,7 +2335,7 @@
           <w:i w:val="0"/>
           <w:sz w:val="22"/>
         </w:rPr>
-        <w:t>Databricks</w:t>
+        <w:t>AWS (S3, Lambda, Glue)</w:t>
       </w:r>
       <w:r>
         <w:rPr>
@@ -2471,7 +2343,7 @@
           <w:i w:val="0"/>
           <w:sz w:val="22"/>
         </w:rPr>
-        <w:t xml:space="preserve">, accelerating model training by </w:t>
+        <w:t xml:space="preserve">, raising throughput by </w:t>
       </w:r>
       <w:r>
         <w:rPr>
@@ -2479,7 +2351,7 @@
           <w:i w:val="0"/>
           <w:sz w:val="22"/>
         </w:rPr>
-        <w:t>60%</w:t>
+        <w:t>70%</w:t>
       </w:r>
       <w:r>
         <w:rPr>
@@ -2487,7 +2359,7 @@
           <w:i w:val="0"/>
           <w:sz w:val="22"/>
         </w:rPr>
-        <w:t xml:space="preserve"> and reducing preprocessing time by </w:t>
+        <w:t xml:space="preserve"> and reaching </w:t>
       </w:r>
       <w:r>
         <w:rPr>
@@ -2495,7 +2367,7 @@
           <w:i w:val="0"/>
           <w:sz w:val="22"/>
         </w:rPr>
-        <w:t>70%</w:t>
+        <w:t>99.9% reliability</w:t>
       </w:r>
       <w:r>
         <w:rPr>
@@ -2503,7 +2375,58 @@
           <w:i w:val="0"/>
           <w:sz w:val="22"/>
         </w:rPr>
+        <w:t xml:space="preserve"> under </w:t>
+      </w:r>
+      <w:r>
+        <w:rPr>
+          <w:b/>
+          <w:i w:val="0"/>
+          <w:sz w:val="22"/>
+        </w:rPr>
+        <w:t>HIPAA</w:t>
+      </w:r>
+      <w:r>
+        <w:rPr>
+          <w:b w:val="0"/>
+          <w:i w:val="0"/>
+          <w:sz w:val="22"/>
+        </w:rPr>
         <w:t>.</w:t>
+      </w:r>
+    </w:p>
+    <w:p>
+      <w:pPr>
+        <w:tabs>
+          <w:tab w:pos="11592" w:val="right"/>
+        </w:tabs>
+        <w:spacing w:before="120" w:after="40"/>
+      </w:pPr>
+      <w:r>
+        <w:rPr>
+          <w:b/>
+          <w:sz w:val="24"/>
+        </w:rPr>
+        <w:t xml:space="preserve">Carelon Global Solutions (Elevance Health) </w:t>
+      </w:r>
+      <w:r>
+        <w:rPr>
+          <w:b/>
+        </w:rPr>
+        <w:t xml:space="preserve">| </w:t>
+      </w:r>
+      <w:r>
+        <w:rPr>
+          <w:b/>
+          <w:i/>
+        </w:rPr>
+        <w:t>Data Engineer</w:t>
+      </w:r>
+      <w:r>
+        <w:rPr>
+          <w:b/>
+        </w:rPr>
+        <w:tab/>
+        <w:t>Bengaluru, India | October 2020 - April 2022</w:t>
       </w:r>
     </w:p>
     <w:p>
@@ -2528,7 +2451,7 @@
           <w:i w:val="0"/>
           <w:sz w:val="22"/>
         </w:rPr>
-        <w:t xml:space="preserve">Built a daily </w:t>
+        <w:t xml:space="preserve">To reduce manual claims reconciliation, redesigned </w:t>
       </w:r>
       <w:r>
         <w:rPr>
@@ -2536,7 +2459,7 @@
           <w:i w:val="0"/>
           <w:sz w:val="22"/>
         </w:rPr>
-        <w:t>NPPES</w:t>
+        <w:t>claims-balancing ETL workflows</w:t>
       </w:r>
       <w:r>
         <w:rPr>
@@ -2544,7 +2467,7 @@
           <w:i w:val="0"/>
           <w:sz w:val="22"/>
         </w:rPr>
-        <w:t xml:space="preserve"> ingestion workflow that improved ML data accuracy by </w:t>
+        <w:t xml:space="preserve"> in </w:t>
       </w:r>
       <w:r>
         <w:rPr>
@@ -2552,7 +2475,7 @@
           <w:i w:val="0"/>
           <w:sz w:val="22"/>
         </w:rPr>
-        <w:t>74%</w:t>
+        <w:t>Python</w:t>
       </w:r>
       <w:r>
         <w:rPr>
@@ -2560,7 +2483,7 @@
           <w:i w:val="0"/>
           <w:sz w:val="22"/>
         </w:rPr>
-        <w:t xml:space="preserve"> and cut processing overhead by </w:t>
+        <w:t xml:space="preserve"> and </w:t>
       </w:r>
       <w:r>
         <w:rPr>
@@ -2568,87 +2491,23 @@
           <w:i w:val="0"/>
           <w:sz w:val="22"/>
         </w:rPr>
+        <w:t>SQL</w:t>
+      </w:r>
+      <w:r>
+        <w:rPr>
+          <w:b w:val="0"/>
+          <w:i w:val="0"/>
+          <w:sz w:val="22"/>
+        </w:rPr>
+        <w:t xml:space="preserve">, cutting operational overhead by </w:t>
+      </w:r>
+      <w:r>
+        <w:rPr>
+          <w:b/>
+          <w:i w:val="0"/>
+          <w:sz w:val="22"/>
+        </w:rPr>
         <w:t>60%</w:t>
-      </w:r>
-      <w:r>
-        <w:rPr>
-          <w:b w:val="0"/>
-          <w:i w:val="0"/>
-          <w:sz w:val="22"/>
-        </w:rPr>
-        <w:t xml:space="preserve">, and built </w:t>
-      </w:r>
-      <w:r>
-        <w:rPr>
-          <w:b/>
-          <w:i w:val="0"/>
-          <w:sz w:val="22"/>
-        </w:rPr>
-        <w:t>PySpark</w:t>
-      </w:r>
-      <w:r>
-        <w:rPr>
-          <w:b w:val="0"/>
-          <w:i w:val="0"/>
-          <w:sz w:val="22"/>
-        </w:rPr>
-        <w:t xml:space="preserve"> ETL on </w:t>
-      </w:r>
-      <w:r>
-        <w:rPr>
-          <w:b/>
-          <w:i w:val="0"/>
-          <w:sz w:val="22"/>
-        </w:rPr>
-        <w:t>AWS (Glue, SageMaker)</w:t>
-      </w:r>
-      <w:r>
-        <w:rPr>
-          <w:b w:val="0"/>
-          <w:i w:val="0"/>
-          <w:sz w:val="22"/>
-        </w:rPr>
-        <w:t xml:space="preserve"> with </w:t>
-      </w:r>
-      <w:r>
-        <w:rPr>
-          <w:b/>
-          <w:i w:val="0"/>
-          <w:sz w:val="22"/>
-        </w:rPr>
-        <w:t>Delta Lake</w:t>
-      </w:r>
-      <w:r>
-        <w:rPr>
-          <w:b w:val="0"/>
-          <w:i w:val="0"/>
-          <w:sz w:val="22"/>
-        </w:rPr>
-        <w:t xml:space="preserve">, improving data reliability by </w:t>
-      </w:r>
-      <w:r>
-        <w:rPr>
-          <w:b/>
-          <w:i w:val="0"/>
-          <w:sz w:val="22"/>
-        </w:rPr>
-        <w:t>30%</w:t>
-      </w:r>
-      <w:r>
-        <w:rPr>
-          <w:b w:val="0"/>
-          <w:i w:val="0"/>
-          <w:sz w:val="22"/>
-        </w:rPr>
-        <w:t xml:space="preserve"> under </w:t>
-      </w:r>
-      <w:r>
-        <w:rPr>
-          <w:b/>
-          <w:i w:val="0"/>
-          <w:sz w:val="22"/>
-        </w:rPr>
-        <w:t>HIPAA</w:t>
       </w:r>
       <w:r>
         <w:rPr>
@@ -2681,7 +2540,7 @@
           <w:i w:val="0"/>
           <w:sz w:val="22"/>
         </w:rPr>
-        <w:t xml:space="preserve">Designed </w:t>
+        <w:t xml:space="preserve">To eliminate costly invoice errors, automated </w:t>
       </w:r>
       <w:r>
         <w:rPr>
@@ -2689,7 +2548,7 @@
           <w:i w:val="0"/>
           <w:sz w:val="22"/>
         </w:rPr>
-        <w:t>20+ enterprise ETL pipelines</w:t>
+        <w:t>medical invoice processing</w:t>
       </w:r>
       <w:r>
         <w:rPr>
@@ -2697,7 +2556,7 @@
           <w:i w:val="0"/>
           <w:sz w:val="22"/>
         </w:rPr>
-        <w:t xml:space="preserve"> orchestrated with </w:t>
+        <w:t xml:space="preserve"> pipelines with rule-based classification, reducing manual errors by </w:t>
       </w:r>
       <w:r>
         <w:rPr>
@@ -2705,7 +2564,7 @@
           <w:i w:val="0"/>
           <w:sz w:val="22"/>
         </w:rPr>
-        <w:t>Apache Airflow</w:t>
+        <w:t>70%</w:t>
       </w:r>
       <w:r>
         <w:rPr>
@@ -2713,90 +2572,7 @@
           <w:i w:val="0"/>
           <w:sz w:val="22"/>
         </w:rPr>
-        <w:t xml:space="preserve"> and </w:t>
-      </w:r>
-      <w:r>
-        <w:rPr>
-          <w:b/>
-          <w:i w:val="0"/>
-          <w:sz w:val="22"/>
-        </w:rPr>
-        <w:t>AWS (S3, Lambda, Athena)</w:t>
-      </w:r>
-      <w:r>
-        <w:rPr>
-          <w:b w:val="0"/>
-          <w:i w:val="0"/>
-          <w:sz w:val="22"/>
-        </w:rPr>
-        <w:t xml:space="preserve">, boosting throughput by </w:t>
-      </w:r>
-      <w:r>
-        <w:rPr>
-          <w:b/>
-          <w:i w:val="0"/>
-          <w:sz w:val="22"/>
-        </w:rPr>
-        <w:t>70%</w:t>
-      </w:r>
-      <w:r>
-        <w:rPr>
-          <w:b w:val="0"/>
-          <w:i w:val="0"/>
-          <w:sz w:val="22"/>
-        </w:rPr>
-        <w:t xml:space="preserve"> and achieving </w:t>
-      </w:r>
-      <w:r>
-        <w:rPr>
-          <w:b/>
-          <w:i w:val="0"/>
-          <w:sz w:val="22"/>
-        </w:rPr>
-        <w:t>99.9% pipeline reliability</w:t>
-      </w:r>
-      <w:r>
-        <w:rPr>
-          <w:b w:val="0"/>
-          <w:i w:val="0"/>
-          <w:sz w:val="22"/>
-        </w:rPr>
-        <w:t xml:space="preserve"> with end-to-end lineage tracking.</w:t>
-      </w:r>
-    </w:p>
-    <w:p>
-      <w:pPr>
-        <w:tabs>
-          <w:tab w:pos="11592" w:val="right"/>
-        </w:tabs>
-        <w:spacing w:before="120" w:after="40"/>
-      </w:pPr>
-      <w:r>
-        <w:rPr>
-          <w:b/>
-          <w:sz w:val="24"/>
-        </w:rPr>
-        <w:t xml:space="preserve">Carelon Global Solutions (Elevance Health) </w:t>
-      </w:r>
-      <w:r>
-        <w:rPr>
-          <w:b/>
-        </w:rPr>
-        <w:t xml:space="preserve">| </w:t>
-      </w:r>
-      <w:r>
-        <w:rPr>
-          <w:b/>
-          <w:i/>
-        </w:rPr>
-        <w:t>Data Engineer</w:t>
-      </w:r>
-      <w:r>
-        <w:rPr>
-          <w:b/>
-        </w:rPr>
-        <w:tab/>
-        <w:t>Bengaluru, India | October 2020 - April 2022</w:t>
+        <w:t>.</w:t>
       </w:r>
     </w:p>
     <w:p>
@@ -2821,7 +2597,7 @@
           <w:i w:val="0"/>
           <w:sz w:val="22"/>
         </w:rPr>
-        <w:t xml:space="preserve">Aligned ETL pipelines with business KPIs on the </w:t>
+        <w:t xml:space="preserve">To give business teams faster insights, delivered self-service </w:t>
       </w:r>
       <w:r>
         <w:rPr>
@@ -2829,7 +2605,7 @@
           <w:i w:val="0"/>
           <w:sz w:val="22"/>
         </w:rPr>
-        <w:t>Seven Plus Locations</w:t>
+        <w:t>Tableau</w:t>
       </w:r>
       <w:r>
         <w:rPr>
@@ -2837,7 +2613,39 @@
           <w:i w:val="0"/>
           <w:sz w:val="22"/>
         </w:rPr>
-        <w:t xml:space="preserve"> project, improving claims data accuracy.</w:t>
+        <w:t xml:space="preserve"> and </w:t>
+      </w:r>
+      <w:r>
+        <w:rPr>
+          <w:b/>
+          <w:i w:val="0"/>
+          <w:sz w:val="22"/>
+        </w:rPr>
+        <w:t>Power BI</w:t>
+      </w:r>
+      <w:r>
+        <w:rPr>
+          <w:b w:val="0"/>
+          <w:i w:val="0"/>
+          <w:sz w:val="22"/>
+        </w:rPr>
+        <w:t xml:space="preserve"> reporting pipelines, cutting reporting latency by </w:t>
+      </w:r>
+      <w:r>
+        <w:rPr>
+          <w:b/>
+          <w:i w:val="0"/>
+          <w:sz w:val="22"/>
+        </w:rPr>
+        <w:t>40%</w:t>
+      </w:r>
+      <w:r>
+        <w:rPr>
+          <w:b w:val="0"/>
+          <w:i w:val="0"/>
+          <w:sz w:val="22"/>
+        </w:rPr>
+        <w:t>.</w:t>
       </w:r>
     </w:p>
     <w:p>
@@ -2862,7 +2670,7 @@
           <w:i w:val="0"/>
           <w:sz w:val="22"/>
         </w:rPr>
-        <w:t xml:space="preserve">Redesigned </w:t>
+        <w:t xml:space="preserve">To handle growing data volumes, migrated </w:t>
       </w:r>
       <w:r>
         <w:rPr>
@@ -2870,7 +2678,7 @@
           <w:i w:val="0"/>
           <w:sz w:val="22"/>
         </w:rPr>
-        <w:t>claims-balancing ETL workflows</w:t>
+        <w:t>Hive</w:t>
       </w:r>
       <w:r>
         <w:rPr>
@@ -2878,7 +2686,7 @@
           <w:i w:val="0"/>
           <w:sz w:val="22"/>
         </w:rPr>
-        <w:t xml:space="preserve"> and automated </w:t>
+        <w:t xml:space="preserve"> and </w:t>
       </w:r>
       <w:r>
         <w:rPr>
@@ -2886,7 +2694,7 @@
           <w:i w:val="0"/>
           <w:sz w:val="22"/>
         </w:rPr>
-        <w:t>medical invoice processing</w:t>
+        <w:t>Hadoop</w:t>
       </w:r>
       <w:r>
         <w:rPr>
@@ -2894,7 +2702,7 @@
           <w:i w:val="0"/>
           <w:sz w:val="22"/>
         </w:rPr>
-        <w:t xml:space="preserve"> pipelines, reducing operational overhead by </w:t>
+        <w:t xml:space="preserve"> workloads to </w:t>
       </w:r>
       <w:r>
         <w:rPr>
@@ -2902,7 +2710,7 @@
           <w:i w:val="0"/>
           <w:sz w:val="22"/>
         </w:rPr>
-        <w:t>60%</w:t>
+        <w:t>Apache Spark</w:t>
       </w:r>
       <w:r>
         <w:rPr>
@@ -2910,7 +2718,7 @@
           <w:i w:val="0"/>
           <w:sz w:val="22"/>
         </w:rPr>
-        <w:t xml:space="preserve"> and manual errors by </w:t>
+        <w:t xml:space="preserve"> and </w:t>
       </w:r>
       <w:r>
         <w:rPr>
@@ -2918,7 +2726,7 @@
           <w:i w:val="0"/>
           <w:sz w:val="22"/>
         </w:rPr>
-        <w:t>70%</w:t>
+        <w:t>Azure Data Services</w:t>
       </w:r>
       <w:r>
         <w:rPr>
@@ -2926,7 +2734,43 @@
           <w:i w:val="0"/>
           <w:sz w:val="22"/>
         </w:rPr>
-        <w:t>.</w:t>
+        <w:t>, improving processing speed and scalability.</w:t>
+      </w:r>
+    </w:p>
+    <w:p>
+      <w:pPr>
+        <w:spacing w:before="120" w:after="80"/>
+        <w:pBdr>
+          <w:bottom w:val="single" w:sz="6" w:space="1" w:color="808080"/>
+        </w:pBdr>
+      </w:pPr>
+      <w:r>
+        <w:rPr>
+          <w:b/>
+          <w:sz w:val="28"/>
+        </w:rPr>
+        <w:t>PROJECTS</w:t>
+      </w:r>
+    </w:p>
+    <w:p>
+      <w:pPr>
+        <w:spacing w:after="40"/>
+      </w:pPr>
+      <w:r>
+        <w:rPr>
+          <w:b/>
+          <w:i w:val="0"/>
+          <w:sz w:val="22"/>
+        </w:rPr>
+        <w:t>Agentic AI Ticket Automation System</w:t>
+      </w:r>
+      <w:r>
+        <w:rPr>
+          <w:b w:val="0"/>
+          <w:i w:val="0"/>
+          <w:sz w:val="22"/>
+        </w:rPr>
+        <w:t xml:space="preserve"> | SecureGPT, LLaMA, AWS SQS, JIRA</w:t>
       </w:r>
     </w:p>
     <w:p>
@@ -2951,7 +2795,7 @@
           <w:i w:val="0"/>
           <w:sz w:val="22"/>
         </w:rPr>
-        <w:t xml:space="preserve">Delivered self-service BI pipelines with </w:t>
+        <w:t xml:space="preserve">To cut security-ticket triage time, built an </w:t>
       </w:r>
       <w:r>
         <w:rPr>
@@ -2959,7 +2803,7 @@
           <w:i w:val="0"/>
           <w:sz w:val="22"/>
         </w:rPr>
-        <w:t>Tableau, Power BI,</w:t>
+        <w:t>agentic AI</w:t>
       </w:r>
       <w:r>
         <w:rPr>
@@ -2967,7 +2811,7 @@
           <w:i w:val="0"/>
           <w:sz w:val="22"/>
         </w:rPr>
-        <w:t xml:space="preserve"> and SQL-based models, reducing reporting latency by </w:t>
+        <w:t xml:space="preserve"> system with </w:t>
       </w:r>
       <w:r>
         <w:rPr>
@@ -2975,7 +2819,7 @@
           <w:i w:val="0"/>
           <w:sz w:val="22"/>
         </w:rPr>
-        <w:t>40%</w:t>
+        <w:t>SecureGPT</w:t>
       </w:r>
       <w:r>
         <w:rPr>
@@ -2983,7 +2827,102 @@
           <w:i w:val="0"/>
           <w:sz w:val="22"/>
         </w:rPr>
-        <w:t xml:space="preserve"> and enabling anomaly detection for healthcare analytics.</w:t>
+        <w:t xml:space="preserve"> and </w:t>
+      </w:r>
+      <w:r>
+        <w:rPr>
+          <w:b/>
+          <w:i w:val="0"/>
+          <w:sz w:val="22"/>
+        </w:rPr>
+        <w:t>LLaMA</w:t>
+      </w:r>
+      <w:r>
+        <w:rPr>
+          <w:b w:val="0"/>
+          <w:i w:val="0"/>
+          <w:sz w:val="22"/>
+        </w:rPr>
+        <w:t xml:space="preserve"> on </w:t>
+      </w:r>
+      <w:r>
+        <w:rPr>
+          <w:b/>
+          <w:i w:val="0"/>
+          <w:sz w:val="22"/>
+        </w:rPr>
+        <w:t>AWS SQS</w:t>
+      </w:r>
+      <w:r>
+        <w:rPr>
+          <w:b w:val="0"/>
+          <w:i w:val="0"/>
+          <w:sz w:val="22"/>
+        </w:rPr>
+        <w:t xml:space="preserve"> that classifies threats and auto-creates </w:t>
+      </w:r>
+      <w:r>
+        <w:rPr>
+          <w:b/>
+          <w:i w:val="0"/>
+          <w:sz w:val="22"/>
+        </w:rPr>
+        <w:t>JIRA</w:t>
+      </w:r>
+      <w:r>
+        <w:rPr>
+          <w:b w:val="0"/>
+          <w:i w:val="0"/>
+          <w:sz w:val="22"/>
+        </w:rPr>
+        <w:t xml:space="preserve"> tickets, reaching </w:t>
+      </w:r>
+      <w:r>
+        <w:rPr>
+          <w:b/>
+          <w:i w:val="0"/>
+          <w:sz w:val="22"/>
+        </w:rPr>
+        <w:t>93% accuracy</w:t>
+      </w:r>
+      <w:r>
+        <w:rPr>
+          <w:b w:val="0"/>
+          <w:i w:val="0"/>
+          <w:sz w:val="22"/>
+        </w:rPr>
+        <w:t xml:space="preserve"> and </w:t>
+      </w:r>
+      <w:r>
+        <w:rPr>
+          <w:b/>
+          <w:i w:val="0"/>
+          <w:sz w:val="22"/>
+        </w:rPr>
+        <w:t>70%</w:t>
+      </w:r>
+      <w:r>
+        <w:rPr>
+          <w:b w:val="0"/>
+          <w:i w:val="0"/>
+          <w:sz w:val="22"/>
+        </w:rPr>
+        <w:t xml:space="preserve"> faster triage.</w:t>
+      </w:r>
+    </w:p>
+    <w:p>
+      <w:pPr>
+        <w:spacing w:before="120" w:after="80"/>
+        <w:pBdr>
+          <w:bottom w:val="single" w:sz="6" w:space="1" w:color="808080"/>
+        </w:pBdr>
+      </w:pPr>
+      <w:r>
+        <w:rPr>
+          <w:b/>
+          <w:sz w:val="28"/>
+        </w:rPr>
+        <w:t>PUBLICATIONS</w:t>
       </w:r>
     </w:p>
     <w:p>
@@ -3008,7 +2947,7 @@
           <w:i w:val="0"/>
           <w:sz w:val="22"/>
         </w:rPr>
-        <w:t xml:space="preserve">Migrated large-scale processing workloads from </w:t>
+        <w:t xml:space="preserve">R. S. Nayaka, </w:t>
       </w:r>
       <w:r>
         <w:rPr>
@@ -3016,7 +2955,7 @@
           <w:i w:val="0"/>
           <w:sz w:val="22"/>
         </w:rPr>
-        <w:t>Hive</w:t>
+        <w:t>R. Somashekar</w:t>
       </w:r>
       <w:r>
         <w:rPr>
@@ -3024,31 +2963,15 @@
           <w:i w:val="0"/>
           <w:sz w:val="22"/>
         </w:rPr>
-        <w:t xml:space="preserve"> to </w:t>
-      </w:r>
-      <w:r>
-        <w:rPr>
-          <w:b/>
-          <w:i w:val="0"/>
-          <w:sz w:val="22"/>
-        </w:rPr>
-        <w:t>Apache Spark/PySpark</w:t>
+        <w:t xml:space="preserve">, K. B. Laskey, L. Wells II, H. Purohit. "SHIELD: A Framework for Online Conversational AI System for Self-Regulated Learning at Emergency Communications Centers." </w:t>
       </w:r>
       <w:r>
         <w:rPr>
           <w:b w:val="0"/>
-          <w:i w:val="0"/>
-          <w:sz w:val="22"/>
-        </w:rPr>
-        <w:t xml:space="preserve">, and moved </w:t>
-      </w:r>
-      <w:r>
-        <w:rPr>
-          <w:b/>
-          <w:i w:val="0"/>
-          <w:sz w:val="22"/>
-        </w:rPr>
-        <w:t>Sqoop/Hadoop</w:t>
+          <w:i/>
+          <w:sz w:val="22"/>
+        </w:rPr>
+        <w:t>ACM WSDM '26</w:t>
       </w:r>
       <w:r>
         <w:rPr>
@@ -3056,23 +2979,7 @@
           <w:i w:val="0"/>
           <w:sz w:val="22"/>
         </w:rPr>
-        <w:t xml:space="preserve"> ingestion to </w:t>
-      </w:r>
-      <w:r>
-        <w:rPr>
-          <w:b/>
-          <w:i w:val="0"/>
-          <w:sz w:val="22"/>
-        </w:rPr>
-        <w:t>Azure Data Services</w:t>
-      </w:r>
-      <w:r>
-        <w:rPr>
-          <w:b w:val="0"/>
-          <w:i w:val="0"/>
-          <w:sz w:val="22"/>
-        </w:rPr>
-        <w:t>, improving performance, scalability, and pipeline efficiency.</w:t>
+        <w:t>. doi:10.1145/3773966.3779411</w:t>
       </w:r>
     </w:p>
     <w:p>
@@ -3097,7 +3004,7 @@
           <w:i w:val="0"/>
           <w:sz w:val="22"/>
         </w:rPr>
-        <w:t xml:space="preserve">Developed </w:t>
+        <w:t xml:space="preserve">R. S. Nayaka, </w:t>
       </w:r>
       <w:r>
         <w:rPr>
@@ -3105,7 +3012,7 @@
           <w:i w:val="0"/>
           <w:sz w:val="22"/>
         </w:rPr>
-        <w:t>RESTful microservices</w:t>
+        <w:t>R. Somashekar</w:t>
       </w:r>
       <w:r>
         <w:rPr>
@@ -3113,373 +3020,7 @@
           <w:i w:val="0"/>
           <w:sz w:val="22"/>
         </w:rPr>
-        <w:t xml:space="preserve"> with </w:t>
-      </w:r>
-      <w:r>
-        <w:rPr>
-          <w:b/>
-          <w:i w:val="0"/>
-          <w:sz w:val="22"/>
-        </w:rPr>
-        <w:t>OAuth 2.0</w:t>
-      </w:r>
-      <w:r>
-        <w:rPr>
-          <w:b w:val="0"/>
-          <w:i w:val="0"/>
-          <w:sz w:val="22"/>
-        </w:rPr>
-        <w:t xml:space="preserve"> and API versioning, and designed </w:t>
-      </w:r>
-      <w:r>
-        <w:rPr>
-          <w:b/>
-          <w:i w:val="0"/>
-          <w:sz w:val="22"/>
-        </w:rPr>
-        <w:t>MongoDB</w:t>
-      </w:r>
-      <w:r>
-        <w:rPr>
-          <w:b w:val="0"/>
-          <w:i w:val="0"/>
-          <w:sz w:val="22"/>
-        </w:rPr>
-        <w:t xml:space="preserve"> data models with </w:t>
-      </w:r>
-      <w:r>
-        <w:rPr>
-          <w:b/>
-          <w:i w:val="0"/>
-          <w:sz w:val="22"/>
-        </w:rPr>
-        <w:t>Python/Java</w:t>
-      </w:r>
-      <w:r>
-        <w:rPr>
-          <w:b w:val="0"/>
-          <w:i w:val="0"/>
-          <w:sz w:val="22"/>
-        </w:rPr>
-        <w:t xml:space="preserve"> validation scripts (UDFs) to improve data quality and consistency.</w:t>
-      </w:r>
-    </w:p>
-    <w:p>
-      <w:pPr>
-        <w:spacing w:before="120" w:after="80"/>
-        <w:pBdr>
-          <w:bottom w:val="single" w:sz="6" w:space="1" w:color="808080"/>
-        </w:pBdr>
-      </w:pPr>
-      <w:r>
-        <w:rPr>
-          <w:b/>
-          <w:sz w:val="28"/>
-        </w:rPr>
-        <w:t>PROJECTS</w:t>
-      </w:r>
-    </w:p>
-    <w:p>
-      <w:pPr>
-        <w:spacing w:after="40"/>
-      </w:pPr>
-      <w:r>
-        <w:rPr>
-          <w:b/>
-          <w:i w:val="0"/>
-          <w:sz w:val="22"/>
-        </w:rPr>
-        <w:t>Agentic AI-Based Ticket Automation System</w:t>
-      </w:r>
-      <w:r>
-        <w:rPr>
-          <w:b w:val="0"/>
-          <w:i w:val="0"/>
-          <w:sz w:val="22"/>
-        </w:rPr>
-        <w:t xml:space="preserve"> | SecureGPT, LLaMA, AWS SQS, JIRA, NIST-CSF</w:t>
-      </w:r>
-    </w:p>
-    <w:p>
-      <w:pPr>
-        <w:tabs>
-          <w:tab w:pos="475" w:val="left"/>
-        </w:tabs>
-        <w:spacing w:after="20"/>
-        <w:ind w:left="475" w:hanging="331"/>
-        <w:jc w:val="both"/>
-      </w:pPr>
-      <w:r>
-        <w:rPr>
-          <w:sz w:val="22"/>
-        </w:rPr>
-        <w:t>•</w:t>
-        <w:tab/>
-      </w:r>
-      <w:r>
-        <w:rPr>
-          <w:b w:val="0"/>
-          <w:i w:val="0"/>
-          <w:sz w:val="22"/>
-        </w:rPr>
-        <w:t xml:space="preserve">Built an </w:t>
-      </w:r>
-      <w:r>
-        <w:rPr>
-          <w:b/>
-          <w:i w:val="0"/>
-          <w:sz w:val="22"/>
-        </w:rPr>
-        <w:t>agentic AI</w:t>
-      </w:r>
-      <w:r>
-        <w:rPr>
-          <w:b w:val="0"/>
-          <w:i w:val="0"/>
-          <w:sz w:val="22"/>
-        </w:rPr>
-        <w:t xml:space="preserve"> pipeline with </w:t>
-      </w:r>
-      <w:r>
-        <w:rPr>
-          <w:b/>
-          <w:i w:val="0"/>
-          <w:sz w:val="22"/>
-        </w:rPr>
-        <w:t>SecureGPT</w:t>
-      </w:r>
-      <w:r>
-        <w:rPr>
-          <w:b w:val="0"/>
-          <w:i w:val="0"/>
-          <w:sz w:val="22"/>
-        </w:rPr>
-        <w:t xml:space="preserve"> and </w:t>
-      </w:r>
-      <w:r>
-        <w:rPr>
-          <w:b/>
-          <w:i w:val="0"/>
-          <w:sz w:val="22"/>
-        </w:rPr>
-        <w:t>LLaMA</w:t>
-      </w:r>
-      <w:r>
-        <w:rPr>
-          <w:b w:val="0"/>
-          <w:i w:val="0"/>
-          <w:sz w:val="22"/>
-        </w:rPr>
-        <w:t xml:space="preserve"> on </w:t>
-      </w:r>
-      <w:r>
-        <w:rPr>
-          <w:b/>
-          <w:i w:val="0"/>
-          <w:sz w:val="22"/>
-        </w:rPr>
-        <w:t>AWS SQS</w:t>
-      </w:r>
-      <w:r>
-        <w:rPr>
-          <w:b w:val="0"/>
-          <w:i w:val="0"/>
-          <w:sz w:val="22"/>
-        </w:rPr>
-        <w:t xml:space="preserve"> event queues that monitors cybersecurity threats and auto-generates </w:t>
-      </w:r>
-      <w:r>
-        <w:rPr>
-          <w:b/>
-          <w:i w:val="0"/>
-          <w:sz w:val="22"/>
-        </w:rPr>
-        <w:t>JIRA</w:t>
-      </w:r>
-      <w:r>
-        <w:rPr>
-          <w:b w:val="0"/>
-          <w:i w:val="0"/>
-          <w:sz w:val="22"/>
-        </w:rPr>
-        <w:t xml:space="preserve"> tickets under </w:t>
-      </w:r>
-      <w:r>
-        <w:rPr>
-          <w:b/>
-          <w:i w:val="0"/>
-          <w:sz w:val="22"/>
-        </w:rPr>
-        <w:t>NIST-CSF</w:t>
-      </w:r>
-      <w:r>
-        <w:rPr>
-          <w:b w:val="0"/>
-          <w:i w:val="0"/>
-          <w:sz w:val="22"/>
-        </w:rPr>
-        <w:t xml:space="preserve">, reaching </w:t>
-      </w:r>
-      <w:r>
-        <w:rPr>
-          <w:b/>
-          <w:i w:val="0"/>
-          <w:sz w:val="22"/>
-        </w:rPr>
-        <w:t>93% automation accuracy</w:t>
-      </w:r>
-      <w:r>
-        <w:rPr>
-          <w:b w:val="0"/>
-          <w:i w:val="0"/>
-          <w:sz w:val="22"/>
-        </w:rPr>
-        <w:t xml:space="preserve"> and cutting triage time by </w:t>
-      </w:r>
-      <w:r>
-        <w:rPr>
-          <w:b/>
-          <w:i w:val="0"/>
-          <w:sz w:val="22"/>
-        </w:rPr>
-        <w:t>70%</w:t>
-      </w:r>
-      <w:r>
-        <w:rPr>
-          <w:b w:val="0"/>
-          <w:i w:val="0"/>
-          <w:sz w:val="22"/>
-        </w:rPr>
-        <w:t>.</w:t>
-      </w:r>
-    </w:p>
-    <w:p>
-      <w:pPr>
-        <w:tabs>
-          <w:tab w:pos="475" w:val="left"/>
-        </w:tabs>
-        <w:spacing w:after="20"/>
-        <w:ind w:left="475" w:hanging="331"/>
-        <w:jc w:val="both"/>
-      </w:pPr>
-      <w:r>
-        <w:rPr>
-          <w:sz w:val="22"/>
-        </w:rPr>
-        <w:t>•</w:t>
-        <w:tab/>
-      </w:r>
-      <w:r>
-        <w:rPr>
-          <w:b w:val="0"/>
-          <w:i w:val="0"/>
-          <w:sz w:val="22"/>
-        </w:rPr>
-        <w:t xml:space="preserve">Used </w:t>
-      </w:r>
-      <w:r>
-        <w:rPr>
-          <w:b/>
-          <w:i w:val="0"/>
-          <w:sz w:val="22"/>
-        </w:rPr>
-        <w:t>LLM prompt engineering</w:t>
-      </w:r>
-      <w:r>
-        <w:rPr>
-          <w:b w:val="0"/>
-          <w:i w:val="0"/>
-          <w:sz w:val="22"/>
-        </w:rPr>
-        <w:t xml:space="preserve"> to classify and rank events, improving scalability by </w:t>
-      </w:r>
-      <w:r>
-        <w:rPr>
-          <w:b/>
-          <w:i w:val="0"/>
-          <w:sz w:val="22"/>
-        </w:rPr>
-        <w:t>50%</w:t>
-      </w:r>
-      <w:r>
-        <w:rPr>
-          <w:b w:val="0"/>
-          <w:i w:val="0"/>
-          <w:sz w:val="22"/>
-        </w:rPr>
-        <w:t xml:space="preserve"> and cutting operational risk by </w:t>
-      </w:r>
-      <w:r>
-        <w:rPr>
-          <w:b/>
-          <w:i w:val="0"/>
-          <w:sz w:val="22"/>
-        </w:rPr>
-        <w:t>40%</w:t>
-      </w:r>
-      <w:r>
-        <w:rPr>
-          <w:b w:val="0"/>
-          <w:i w:val="0"/>
-          <w:sz w:val="22"/>
-        </w:rPr>
-        <w:t>.</w:t>
-      </w:r>
-    </w:p>
-    <w:p>
-      <w:pPr>
-        <w:spacing w:before="120" w:after="80"/>
-        <w:pBdr>
-          <w:bottom w:val="single" w:sz="6" w:space="1" w:color="808080"/>
-        </w:pBdr>
-      </w:pPr>
-      <w:r>
-        <w:rPr>
-          <w:b/>
-          <w:sz w:val="28"/>
-        </w:rPr>
-        <w:t>PUBLICATIONS</w:t>
-      </w:r>
-    </w:p>
-    <w:p>
-      <w:pPr>
-        <w:tabs>
-          <w:tab w:pos="475" w:val="left"/>
-        </w:tabs>
-        <w:spacing w:after="20"/>
-        <w:ind w:left="475" w:hanging="331"/>
-        <w:jc w:val="both"/>
-      </w:pPr>
-      <w:r>
-        <w:rPr>
-          <w:sz w:val="22"/>
-        </w:rPr>
-        <w:t>•</w:t>
-        <w:tab/>
-      </w:r>
-      <w:r>
-        <w:rPr>
-          <w:b w:val="0"/>
-          <w:i w:val="0"/>
-          <w:sz w:val="22"/>
-        </w:rPr>
-        <w:t xml:space="preserve">R. S. Nayaka, </w:t>
-      </w:r>
-      <w:r>
-        <w:rPr>
-          <w:b/>
-          <w:i w:val="0"/>
-          <w:sz w:val="22"/>
-        </w:rPr>
-        <w:t>R. Somashekar</w:t>
-      </w:r>
-      <w:r>
-        <w:rPr>
-          <w:b w:val="0"/>
-          <w:i w:val="0"/>
-          <w:sz w:val="22"/>
-        </w:rPr>
-        <w:t xml:space="preserve">, K. B. Laskey, L. Wells II, H. Purohit. "SHIELD: A Framework for Online Conversational AI System for Self-Regulated Learning at Emergency Communications Centers." </w:t>
+        <w:t xml:space="preserve">, H. Purohit. "MATE-911: Multimodal AI-powered Training Environment for Next-Generation 911 Dispatcher Preparedness." </w:t>
       </w:r>
       <w:r>
         <w:rPr>
@@ -3487,7 +3028,7 @@
           <w:i/>
           <w:sz w:val="22"/>
         </w:rPr>
-        <w:t>ACM WSDM '26</w:t>
+        <w:t>IEEE PST 2026</w:t>
       </w:r>
       <w:r>
         <w:rPr>
@@ -3495,64 +3036,7 @@
           <w:i w:val="0"/>
           <w:sz w:val="22"/>
         </w:rPr>
-        <w:t>. doi:10.1145/3773966.3779411</w:t>
-      </w:r>
-    </w:p>
-    <w:p>
-      <w:pPr>
-        <w:tabs>
-          <w:tab w:pos="475" w:val="left"/>
-        </w:tabs>
-        <w:spacing w:after="20"/>
-        <w:ind w:left="475" w:hanging="331"/>
-        <w:jc w:val="both"/>
-      </w:pPr>
-      <w:r>
-        <w:rPr>
-          <w:sz w:val="22"/>
-        </w:rPr>
-        <w:t>•</w:t>
-        <w:tab/>
-      </w:r>
-      <w:r>
-        <w:rPr>
-          <w:b w:val="0"/>
-          <w:i w:val="0"/>
-          <w:sz w:val="22"/>
-        </w:rPr>
-        <w:t xml:space="preserve">R. S. Nayaka, </w:t>
-      </w:r>
-      <w:r>
-        <w:rPr>
-          <w:b/>
-          <w:i w:val="0"/>
-          <w:sz w:val="22"/>
-        </w:rPr>
-        <w:t>R. Somashekar</w:t>
-      </w:r>
-      <w:r>
-        <w:rPr>
-          <w:b w:val="0"/>
-          <w:i w:val="0"/>
-          <w:sz w:val="22"/>
-        </w:rPr>
-        <w:t xml:space="preserve">, and H. Purohit. "MATE-911: Multimodal AI-powered Training Environment for Next-Generation 911 Dispatcher Preparedness." In </w:t>
-      </w:r>
-      <w:r>
-        <w:rPr>
-          <w:b w:val="0"/>
-          <w:i/>
-          <w:sz w:val="22"/>
-        </w:rPr>
-        <w:t>IEEE PST Conference</w:t>
-      </w:r>
-      <w:r>
-        <w:rPr>
-          <w:b w:val="0"/>
-          <w:i w:val="0"/>
-          <w:sz w:val="22"/>
-        </w:rPr>
-        <w:t>, 2026.</w:t>
+        <w:t>.</w:t>
       </w:r>
     </w:p>
     <w:sectPr>

</xml_diff>

<commit_message>
Add LangChain, Azure OpenAI and Pinecone RAG experience from Resume 2
Co-Authored-By: Claude Opus 5.5 <noreply@anthropic.com>
Claude-Session: https://claude.ai/code/session_013uu8YLK93nR2ygpNvDWsMr
</commit_message>
<xml_diff>
--- a/resume/Ritesh_Somashekar_AI_ML_Engineer_GMU_Carelon.docx
+++ b/resume/Ritesh_Somashekar_AI_ML_Engineer_GMU_Carelon.docx
@@ -301,7 +301,7 @@
           <w:i w:val="0"/>
           <w:sz w:val="22"/>
         </w:rPr>
-        <w:t>Python, Llama 3, LlamaIndex, ChromaDB, PyTorch,</w:t>
+        <w:t>Python, LangChain, LlamaIndex, Llama 3, ChromaDB, PyTorch,</w:t>
       </w:r>
       <w:r>
         <w:rPr>
@@ -475,7 +475,7 @@
           <w:i w:val="0"/>
           <w:sz w:val="22"/>
         </w:rPr>
-        <w:t xml:space="preserve"> Large Language Models (LLMs), Retrieval-Augmented Generation (RAG), LlamaIndex, Prompt Engineering, Embeddings, Vector Databases (ChromaDB, pgvector, FAISS), Llama 3, Ollama, Agentic AI, LoRA/PEFT</w:t>
+        <w:t xml:space="preserve"> LLMs, Retrieval-Augmented Generation (RAG), LangChain, LlamaIndex, Prompt Engineering, Embeddings, Vector Databases (ChromaDB, Pinecone, pgvector, FAISS), GPT-4, Azure OpenAI, Llama 3, Ollama, Agentic AI, LoRA/PEFT</w:t>
       </w:r>
     </w:p>
     <w:p>
@@ -1411,7 +1411,7 @@
           <w:i w:val="0"/>
           <w:sz w:val="22"/>
         </w:rPr>
-        <w:t xml:space="preserve">To make model decisions explainable, applied </w:t>
+        <w:t xml:space="preserve">To improve answer accuracy across LLM providers, built </w:t>
       </w:r>
       <w:r>
         <w:rPr>
@@ -1419,7 +1419,7 @@
           <w:i w:val="0"/>
           <w:sz w:val="22"/>
         </w:rPr>
-        <w:t>SHAP</w:t>
+        <w:t>LangChain</w:t>
       </w:r>
       <w:r>
         <w:rPr>
@@ -1427,7 +1427,7 @@
           <w:i w:val="0"/>
           <w:sz w:val="22"/>
         </w:rPr>
-        <w:t xml:space="preserve"> to intent classification and behavioral </w:t>
+        <w:t xml:space="preserve"> RAG pipelines with </w:t>
       </w:r>
       <w:r>
         <w:rPr>
@@ -1435,7 +1435,7 @@
           <w:i w:val="0"/>
           <w:sz w:val="22"/>
         </w:rPr>
-        <w:t>anomaly detection</w:t>
+        <w:t>FAISS</w:t>
       </w:r>
       <w:r>
         <w:rPr>
@@ -1443,7 +1443,7 @@
           <w:i w:val="0"/>
           <w:sz w:val="22"/>
         </w:rPr>
-        <w:t xml:space="preserve"> models, tuning </w:t>
+        <w:t xml:space="preserve"> grounding </w:t>
       </w:r>
       <w:r>
         <w:rPr>
@@ -1451,7 +1451,7 @@
           <w:i w:val="0"/>
           <w:sz w:val="22"/>
         </w:rPr>
-        <w:t>LightGBM</w:t>
+        <w:t>GPT-4, Claude,</w:t>
       </w:r>
       <w:r>
         <w:rPr>
@@ -1459,7 +1459,7 @@
           <w:i w:val="0"/>
           <w:sz w:val="22"/>
         </w:rPr>
-        <w:t xml:space="preserve"> alert thresholds to cut false positives by </w:t>
+        <w:t xml:space="preserve"> and </w:t>
       </w:r>
       <w:r>
         <w:rPr>
@@ -1467,7 +1467,39 @@
           <w:i w:val="0"/>
           <w:sz w:val="22"/>
         </w:rPr>
-        <w:t>25%</w:t>
+        <w:t>Gemini</w:t>
+      </w:r>
+      <w:r>
+        <w:rPr>
+          <w:b w:val="0"/>
+          <w:i w:val="0"/>
+          <w:sz w:val="22"/>
+        </w:rPr>
+        <w:t xml:space="preserve"> in verified sources, raising accuracy by </w:t>
+      </w:r>
+      <w:r>
+        <w:rPr>
+          <w:b/>
+          <w:i w:val="0"/>
+          <w:sz w:val="22"/>
+        </w:rPr>
+        <w:t>16%</w:t>
+      </w:r>
+      <w:r>
+        <w:rPr>
+          <w:b w:val="0"/>
+          <w:i w:val="0"/>
+          <w:sz w:val="22"/>
+        </w:rPr>
+        <w:t xml:space="preserve"> and cutting hallucinations by </w:t>
+      </w:r>
+      <w:r>
+        <w:rPr>
+          <w:b/>
+          <w:i w:val="0"/>
+          <w:sz w:val="22"/>
+        </w:rPr>
+        <w:t>19%</w:t>
       </w:r>
       <w:r>
         <w:rPr>
@@ -1500,7 +1532,7 @@
           <w:i w:val="0"/>
           <w:sz w:val="22"/>
         </w:rPr>
-        <w:t xml:space="preserve">To run LLMs on limited hardware, fine-tuned </w:t>
+        <w:t xml:space="preserve">To make model decisions explainable, applied </w:t>
       </w:r>
       <w:r>
         <w:rPr>
@@ -1508,7 +1540,7 @@
           <w:i w:val="0"/>
           <w:sz w:val="22"/>
         </w:rPr>
-        <w:t>Llama 3</w:t>
+        <w:t>SHAP</w:t>
       </w:r>
       <w:r>
         <w:rPr>
@@ -1516,7 +1548,7 @@
           <w:i w:val="0"/>
           <w:sz w:val="22"/>
         </w:rPr>
-        <w:t xml:space="preserve"> with </w:t>
+        <w:t xml:space="preserve"> to intent classification and behavioral </w:t>
       </w:r>
       <w:r>
         <w:rPr>
@@ -1524,7 +1556,7 @@
           <w:i w:val="0"/>
           <w:sz w:val="22"/>
         </w:rPr>
-        <w:t>LoRA/PEFT</w:t>
+        <w:t>anomaly detection</w:t>
       </w:r>
       <w:r>
         <w:rPr>
@@ -1532,7 +1564,7 @@
           <w:i w:val="0"/>
           <w:sz w:val="22"/>
         </w:rPr>
-        <w:t xml:space="preserve"> and </w:t>
+        <w:t xml:space="preserve"> models, tuning </w:t>
       </w:r>
       <w:r>
         <w:rPr>
@@ -1540,7 +1572,7 @@
           <w:i w:val="0"/>
           <w:sz w:val="22"/>
         </w:rPr>
-        <w:t>quantization-aware training</w:t>
+        <w:t>LightGBM</w:t>
       </w:r>
       <w:r>
         <w:rPr>
@@ -1548,7 +1580,7 @@
           <w:i w:val="0"/>
           <w:sz w:val="22"/>
         </w:rPr>
-        <w:t xml:space="preserve">, shrinking models by </w:t>
+        <w:t xml:space="preserve"> alert thresholds to cut false positives by </w:t>
       </w:r>
       <w:r>
         <w:rPr>
@@ -1556,7 +1588,7 @@
           <w:i w:val="0"/>
           <w:sz w:val="22"/>
         </w:rPr>
-        <w:t>40%</w:t>
+        <w:t>25%</w:t>
       </w:r>
       <w:r>
         <w:rPr>
@@ -1564,23 +1596,7 @@
           <w:i w:val="0"/>
           <w:sz w:val="22"/>
         </w:rPr>
-        <w:t xml:space="preserve"> while staying within </w:t>
-      </w:r>
-      <w:r>
-        <w:rPr>
-          <w:b/>
-          <w:i w:val="0"/>
-          <w:sz w:val="22"/>
-        </w:rPr>
-        <w:t>3%</w:t>
-      </w:r>
-      <w:r>
-        <w:rPr>
-          <w:b w:val="0"/>
-          <w:i w:val="0"/>
-          <w:sz w:val="22"/>
-        </w:rPr>
-        <w:t xml:space="preserve"> of full-precision accuracy.</w:t>
+        <w:t>.</w:t>
       </w:r>
     </w:p>
     <w:p>
@@ -1605,7 +1621,7 @@
           <w:i w:val="0"/>
           <w:sz w:val="22"/>
         </w:rPr>
-        <w:t xml:space="preserve">To move prototypes into production, set up </w:t>
+        <w:t xml:space="preserve">To run LLMs on limited hardware, fine-tuned </w:t>
       </w:r>
       <w:r>
         <w:rPr>
@@ -1613,7 +1629,7 @@
           <w:i w:val="0"/>
           <w:sz w:val="22"/>
         </w:rPr>
-        <w:t>MLflow</w:t>
+        <w:t>Llama 3</w:t>
       </w:r>
       <w:r>
         <w:rPr>
@@ -1621,7 +1637,7 @@
           <w:i w:val="0"/>
           <w:sz w:val="22"/>
         </w:rPr>
-        <w:t xml:space="preserve"> tracking, </w:t>
+        <w:t xml:space="preserve"> with </w:t>
       </w:r>
       <w:r>
         <w:rPr>
@@ -1629,7 +1645,7 @@
           <w:i w:val="0"/>
           <w:sz w:val="22"/>
         </w:rPr>
-        <w:t>FastAPI</w:t>
+        <w:t>LoRA/PEFT</w:t>
       </w:r>
       <w:r>
         <w:rPr>
@@ -1637,7 +1653,7 @@
           <w:i w:val="0"/>
           <w:sz w:val="22"/>
         </w:rPr>
-        <w:t xml:space="preserve"> services, </w:t>
+        <w:t xml:space="preserve"> and </w:t>
       </w:r>
       <w:r>
         <w:rPr>
@@ -1645,7 +1661,7 @@
           <w:i w:val="0"/>
           <w:sz w:val="22"/>
         </w:rPr>
-        <w:t>Docker</w:t>
+        <w:t>quantization-aware training</w:t>
       </w:r>
       <w:r>
         <w:rPr>
@@ -1653,7 +1669,7 @@
           <w:i w:val="0"/>
           <w:sz w:val="22"/>
         </w:rPr>
-        <w:t xml:space="preserve">, and </w:t>
+        <w:t xml:space="preserve">, shrinking models by </w:t>
       </w:r>
       <w:r>
         <w:rPr>
@@ -1661,7 +1677,7 @@
           <w:i w:val="0"/>
           <w:sz w:val="22"/>
         </w:rPr>
-        <w:t>CI/CD</w:t>
+        <w:t>40%</w:t>
       </w:r>
       <w:r>
         <w:rPr>
@@ -1669,7 +1685,7 @@
           <w:i w:val="0"/>
           <w:sz w:val="22"/>
         </w:rPr>
-        <w:t xml:space="preserve">, cutting release cycles from </w:t>
+        <w:t xml:space="preserve"> while staying within </w:t>
       </w:r>
       <w:r>
         <w:rPr>
@@ -1677,7 +1693,7 @@
           <w:i w:val="0"/>
           <w:sz w:val="22"/>
         </w:rPr>
-        <w:t>2 weeks to 5 days</w:t>
+        <w:t>3%</w:t>
       </w:r>
       <w:r>
         <w:rPr>
@@ -1685,23 +1701,7 @@
           <w:i w:val="0"/>
           <w:sz w:val="22"/>
         </w:rPr>
-        <w:t xml:space="preserve"> with </w:t>
-      </w:r>
-      <w:r>
-        <w:rPr>
-          <w:b/>
-          <w:i w:val="0"/>
-          <w:sz w:val="22"/>
-        </w:rPr>
-        <w:t>A/B testing</w:t>
-      </w:r>
-      <w:r>
-        <w:rPr>
-          <w:b w:val="0"/>
-          <w:i w:val="0"/>
-          <w:sz w:val="22"/>
-        </w:rPr>
-        <w:t>.</w:t>
+        <w:t xml:space="preserve"> of full-precision accuracy.</w:t>
       </w:r>
     </w:p>
     <w:p>
@@ -1726,7 +1726,7 @@
           <w:i w:val="0"/>
           <w:sz w:val="22"/>
         </w:rPr>
-        <w:t xml:space="preserve">To study community coping during disasters, applied </w:t>
+        <w:t xml:space="preserve">To move prototypes into production, set up </w:t>
       </w:r>
       <w:r>
         <w:rPr>
@@ -1734,7 +1734,7 @@
           <w:i w:val="0"/>
           <w:sz w:val="22"/>
         </w:rPr>
-        <w:t>graph analytics</w:t>
+        <w:t>MLflow</w:t>
       </w:r>
       <w:r>
         <w:rPr>
@@ -1742,7 +1742,7 @@
           <w:i w:val="0"/>
           <w:sz w:val="22"/>
         </w:rPr>
-        <w:t xml:space="preserve"> and </w:t>
+        <w:t xml:space="preserve"> tracking, </w:t>
       </w:r>
       <w:r>
         <w:rPr>
@@ -1750,7 +1750,7 @@
           <w:i w:val="0"/>
           <w:sz w:val="22"/>
         </w:rPr>
-        <w:t>ensemble models</w:t>
+        <w:t>FastAPI</w:t>
       </w:r>
       <w:r>
         <w:rPr>
@@ -1758,7 +1758,7 @@
           <w:i w:val="0"/>
           <w:sz w:val="22"/>
         </w:rPr>
-        <w:t xml:space="preserve"> on the </w:t>
+        <w:t xml:space="preserve"> services, </w:t>
       </w:r>
       <w:r>
         <w:rPr>
@@ -1766,7 +1766,7 @@
           <w:i w:val="0"/>
           <w:sz w:val="22"/>
         </w:rPr>
-        <w:t>ORC Hopper HPC cluster</w:t>
+        <w:t>Docker</w:t>
       </w:r>
       <w:r>
         <w:rPr>
@@ -1774,7 +1774,7 @@
           <w:i w:val="0"/>
           <w:sz w:val="22"/>
         </w:rPr>
-        <w:t xml:space="preserve">, forecasting trends with an </w:t>
+        <w:t xml:space="preserve">, and </w:t>
       </w:r>
       <w:r>
         <w:rPr>
@@ -1782,7 +1782,7 @@
           <w:i w:val="0"/>
           <w:sz w:val="22"/>
         </w:rPr>
-        <w:t>RMSE of 0.89</w:t>
+        <w:t>CI/CD</w:t>
       </w:r>
       <w:r>
         <w:rPr>
@@ -1790,42 +1790,39 @@
           <w:i w:val="0"/>
           <w:sz w:val="22"/>
         </w:rPr>
+        <w:t xml:space="preserve">, cutting release cycles from </w:t>
+      </w:r>
+      <w:r>
+        <w:rPr>
+          <w:b/>
+          <w:i w:val="0"/>
+          <w:sz w:val="22"/>
+        </w:rPr>
+        <w:t>2 weeks to 5 days</w:t>
+      </w:r>
+      <w:r>
+        <w:rPr>
+          <w:b w:val="0"/>
+          <w:i w:val="0"/>
+          <w:sz w:val="22"/>
+        </w:rPr>
+        <w:t xml:space="preserve"> with </w:t>
+      </w:r>
+      <w:r>
+        <w:rPr>
+          <w:b/>
+          <w:i w:val="0"/>
+          <w:sz w:val="22"/>
+        </w:rPr>
+        <w:t>A/B testing</w:t>
+      </w:r>
+      <w:r>
+        <w:rPr>
+          <w:b w:val="0"/>
+          <w:i w:val="0"/>
+          <w:sz w:val="22"/>
+        </w:rPr>
         <w:t>.</w:t>
-      </w:r>
-    </w:p>
-    <w:p>
-      <w:pPr>
-        <w:tabs>
-          <w:tab w:pos="11592" w:val="right"/>
-        </w:tabs>
-        <w:spacing w:before="120" w:after="40"/>
-      </w:pPr>
-      <w:r>
-        <w:rPr>
-          <w:b/>
-          <w:sz w:val="24"/>
-        </w:rPr>
-        <w:t xml:space="preserve">Carelon Global Solutions (Elevance Health) </w:t>
-      </w:r>
-      <w:r>
-        <w:rPr>
-          <w:b/>
-        </w:rPr>
-        <w:t xml:space="preserve">| </w:t>
-      </w:r>
-      <w:r>
-        <w:rPr>
-          <w:b/>
-          <w:i/>
-        </w:rPr>
-        <w:t>Machine Learning Engineer</w:t>
-      </w:r>
-      <w:r>
-        <w:rPr>
-          <w:b/>
-        </w:rPr>
-        <w:tab/>
-        <w:t>Bengaluru, India | May 2022 - August 2023</w:t>
       </w:r>
     </w:p>
     <w:p>
@@ -1850,6 +1847,130 @@
           <w:i w:val="0"/>
           <w:sz w:val="22"/>
         </w:rPr>
+        <w:t xml:space="preserve">To study community coping during disasters, applied </w:t>
+      </w:r>
+      <w:r>
+        <w:rPr>
+          <w:b/>
+          <w:i w:val="0"/>
+          <w:sz w:val="22"/>
+        </w:rPr>
+        <w:t>graph analytics</w:t>
+      </w:r>
+      <w:r>
+        <w:rPr>
+          <w:b w:val="0"/>
+          <w:i w:val="0"/>
+          <w:sz w:val="22"/>
+        </w:rPr>
+        <w:t xml:space="preserve"> and </w:t>
+      </w:r>
+      <w:r>
+        <w:rPr>
+          <w:b/>
+          <w:i w:val="0"/>
+          <w:sz w:val="22"/>
+        </w:rPr>
+        <w:t>ensemble models</w:t>
+      </w:r>
+      <w:r>
+        <w:rPr>
+          <w:b w:val="0"/>
+          <w:i w:val="0"/>
+          <w:sz w:val="22"/>
+        </w:rPr>
+        <w:t xml:space="preserve"> on the </w:t>
+      </w:r>
+      <w:r>
+        <w:rPr>
+          <w:b/>
+          <w:i w:val="0"/>
+          <w:sz w:val="22"/>
+        </w:rPr>
+        <w:t>ORC Hopper HPC cluster</w:t>
+      </w:r>
+      <w:r>
+        <w:rPr>
+          <w:b w:val="0"/>
+          <w:i w:val="0"/>
+          <w:sz w:val="22"/>
+        </w:rPr>
+        <w:t xml:space="preserve">, forecasting trends with an </w:t>
+      </w:r>
+      <w:r>
+        <w:rPr>
+          <w:b/>
+          <w:i w:val="0"/>
+          <w:sz w:val="22"/>
+        </w:rPr>
+        <w:t>RMSE of 0.89</w:t>
+      </w:r>
+      <w:r>
+        <w:rPr>
+          <w:b w:val="0"/>
+          <w:i w:val="0"/>
+          <w:sz w:val="22"/>
+        </w:rPr>
+        <w:t>.</w:t>
+      </w:r>
+    </w:p>
+    <w:p>
+      <w:pPr>
+        <w:tabs>
+          <w:tab w:pos="11592" w:val="right"/>
+        </w:tabs>
+        <w:spacing w:before="120" w:after="40"/>
+      </w:pPr>
+      <w:r>
+        <w:rPr>
+          <w:b/>
+          <w:sz w:val="24"/>
+        </w:rPr>
+        <w:t xml:space="preserve">Carelon Global Solutions (Elevance Health) </w:t>
+      </w:r>
+      <w:r>
+        <w:rPr>
+          <w:b/>
+        </w:rPr>
+        <w:t xml:space="preserve">| </w:t>
+      </w:r>
+      <w:r>
+        <w:rPr>
+          <w:b/>
+          <w:i/>
+        </w:rPr>
+        <w:t>Machine Learning Engineer</w:t>
+      </w:r>
+      <w:r>
+        <w:rPr>
+          <w:b/>
+        </w:rPr>
+        <w:tab/>
+        <w:t>Bengaluru, India | May 2022 - August 2023</w:t>
+      </w:r>
+    </w:p>
+    <w:p>
+      <w:pPr>
+        <w:tabs>
+          <w:tab w:pos="475" w:val="left"/>
+        </w:tabs>
+        <w:spacing w:after="20"/>
+        <w:ind w:left="475" w:hanging="331"/>
+        <w:jc w:val="both"/>
+      </w:pPr>
+      <w:r>
+        <w:rPr>
+          <w:sz w:val="22"/>
+        </w:rPr>
+        <w:t>•</w:t>
+        <w:tab/>
+      </w:r>
+      <w:r>
+        <w:rPr>
+          <w:b w:val="0"/>
+          <w:i w:val="0"/>
+          <w:sz w:val="22"/>
+        </w:rPr>
         <w:t xml:space="preserve">To automate clinical text review, built </w:t>
       </w:r>
       <w:r>
@@ -1891,6 +2012,143 @@
           <w:sz w:val="22"/>
         </w:rPr>
         <w:t>55%</w:t>
+      </w:r>
+      <w:r>
+        <w:rPr>
+          <w:b w:val="0"/>
+          <w:i w:val="0"/>
+          <w:sz w:val="22"/>
+        </w:rPr>
+        <w:t>.</w:t>
+      </w:r>
+    </w:p>
+    <w:p>
+      <w:pPr>
+        <w:tabs>
+          <w:tab w:pos="475" w:val="left"/>
+        </w:tabs>
+        <w:spacing w:after="20"/>
+        <w:ind w:left="475" w:hanging="331"/>
+        <w:jc w:val="both"/>
+      </w:pPr>
+      <w:r>
+        <w:rPr>
+          <w:sz w:val="22"/>
+        </w:rPr>
+        <w:t>•</w:t>
+        <w:tab/>
+      </w:r>
+      <w:r>
+        <w:rPr>
+          <w:b w:val="0"/>
+          <w:i w:val="0"/>
+          <w:sz w:val="22"/>
+        </w:rPr>
+        <w:t xml:space="preserve">To speed up member support, built a </w:t>
+      </w:r>
+      <w:r>
+        <w:rPr>
+          <w:b/>
+          <w:i w:val="0"/>
+          <w:sz w:val="22"/>
+        </w:rPr>
+        <w:t>Generative AI</w:t>
+      </w:r>
+      <w:r>
+        <w:rPr>
+          <w:b w:val="0"/>
+          <w:i w:val="0"/>
+          <w:sz w:val="22"/>
+        </w:rPr>
+        <w:t xml:space="preserve"> assistant with </w:t>
+      </w:r>
+      <w:r>
+        <w:rPr>
+          <w:b/>
+          <w:i w:val="0"/>
+          <w:sz w:val="22"/>
+        </w:rPr>
+        <w:t>Azure OpenAI</w:t>
+      </w:r>
+      <w:r>
+        <w:rPr>
+          <w:b w:val="0"/>
+          <w:i w:val="0"/>
+          <w:sz w:val="22"/>
+        </w:rPr>
+        <w:t xml:space="preserve">, </w:t>
+      </w:r>
+      <w:r>
+        <w:rPr>
+          <w:b/>
+          <w:i w:val="0"/>
+          <w:sz w:val="22"/>
+        </w:rPr>
+        <w:t>LangChain</w:t>
+      </w:r>
+      <w:r>
+        <w:rPr>
+          <w:b w:val="0"/>
+          <w:i w:val="0"/>
+          <w:sz w:val="22"/>
+        </w:rPr>
+        <w:t xml:space="preserve">, and </w:t>
+      </w:r>
+      <w:r>
+        <w:rPr>
+          <w:b/>
+          <w:i w:val="0"/>
+          <w:sz w:val="22"/>
+        </w:rPr>
+        <w:t>Pinecone</w:t>
+      </w:r>
+      <w:r>
+        <w:rPr>
+          <w:b w:val="0"/>
+          <w:i w:val="0"/>
+          <w:sz w:val="22"/>
+        </w:rPr>
+        <w:t xml:space="preserve"> RAG for </w:t>
+      </w:r>
+      <w:r>
+        <w:rPr>
+          <w:b/>
+          <w:i w:val="0"/>
+          <w:sz w:val="22"/>
+        </w:rPr>
+        <w:t>15K+ daily queries</w:t>
+      </w:r>
+      <w:r>
+        <w:rPr>
+          <w:b w:val="0"/>
+          <w:i w:val="0"/>
+          <w:sz w:val="22"/>
+        </w:rPr>
+        <w:t xml:space="preserve">, cutting resolution time by </w:t>
+      </w:r>
+      <w:r>
+        <w:rPr>
+          <w:b/>
+          <w:i w:val="0"/>
+          <w:sz w:val="22"/>
+        </w:rPr>
+        <w:t>38%</w:t>
+      </w:r>
+      <w:r>
+        <w:rPr>
+          <w:b w:val="0"/>
+          <w:i w:val="0"/>
+          <w:sz w:val="22"/>
+        </w:rPr>
+        <w:t xml:space="preserve"> and raising ticket deflection by </w:t>
+      </w:r>
+      <w:r>
+        <w:rPr>
+          <w:b/>
+          <w:i w:val="0"/>
+          <w:sz w:val="22"/>
+        </w:rPr>
+        <w:t>25%</w:t>
       </w:r>
       <w:r>
         <w:rPr>

</xml_diff>

<commit_message>
Add model monitoring/drift detection and semantic search keywords
Co-Authored-By: Claude Opus 5.5 <noreply@anthropic.com>
Claude-Session: https://claude.ai/code/session_013uu8YLK93nR2ygpNvDWsMr
</commit_message>
<xml_diff>
--- a/resume/Ritesh_Somashekar_AI_ML_Engineer_GMU_Carelon.docx
+++ b/resume/Ritesh_Somashekar_AI_ML_Engineer_GMU_Carelon.docx
@@ -536,7 +536,7 @@
           <w:i w:val="0"/>
           <w:sz w:val="22"/>
         </w:rPr>
-        <w:t>MLOps:</w:t>
+        <w:t>MLOps &amp; LLMOps:</w:t>
       </w:r>
       <w:r>
         <w:rPr>
@@ -544,7 +544,7 @@
           <w:i w:val="0"/>
           <w:sz w:val="22"/>
         </w:rPr>
-        <w:t xml:space="preserve"> MLflow, Docker, Kubernetes, FastAPI, CI/CD (Jenkins), Git, DVC</w:t>
+        <w:t xml:space="preserve"> MLflow, Model Monitoring, Drift Detection, Docker, Kubernetes, FastAPI, CI/CD (Jenkins), Git, DVC</w:t>
       </w:r>
     </w:p>
     <w:p>
@@ -1007,7 +1007,7 @@
           <w:i w:val="0"/>
           <w:sz w:val="22"/>
         </w:rPr>
-        <w:t xml:space="preserve">To ground generation in verified protocols, built the </w:t>
+        <w:t xml:space="preserve">To ground generation in verified protocols, built a </w:t>
       </w:r>
       <w:r>
         <w:rPr>
@@ -1015,7 +1015,7 @@
           <w:i w:val="0"/>
           <w:sz w:val="22"/>
         </w:rPr>
-        <w:t>retrieval layer</w:t>
+        <w:t>semantic search</w:t>
       </w:r>
       <w:r>
         <w:rPr>
@@ -1023,7 +1023,7 @@
           <w:i w:val="0"/>
           <w:sz w:val="22"/>
         </w:rPr>
-        <w:t xml:space="preserve"> with </w:t>
+        <w:t xml:space="preserve"> retrieval layer with </w:t>
       </w:r>
       <w:r>
         <w:rPr>
@@ -1039,7 +1039,7 @@
           <w:i w:val="0"/>
           <w:sz w:val="22"/>
         </w:rPr>
-        <w:t xml:space="preserve"> embeddings, </w:t>
+        <w:t xml:space="preserve">, </w:t>
       </w:r>
       <w:r>
         <w:rPr>
@@ -2327,6 +2327,111 @@
           <w:sz w:val="22"/>
         </w:rPr>
         <w:t>REST APIs</w:t>
+      </w:r>
+      <w:r>
+        <w:rPr>
+          <w:b w:val="0"/>
+          <w:i w:val="0"/>
+          <w:sz w:val="22"/>
+        </w:rPr>
+        <w:t>.</w:t>
+      </w:r>
+    </w:p>
+    <w:p>
+      <w:pPr>
+        <w:tabs>
+          <w:tab w:pos="475" w:val="left"/>
+        </w:tabs>
+        <w:spacing w:after="20"/>
+        <w:ind w:left="475" w:hanging="331"/>
+        <w:jc w:val="both"/>
+      </w:pPr>
+      <w:r>
+        <w:rPr>
+          <w:sz w:val="22"/>
+        </w:rPr>
+        <w:t>•</w:t>
+        <w:tab/>
+      </w:r>
+      <w:r>
+        <w:rPr>
+          <w:b w:val="0"/>
+          <w:i w:val="0"/>
+          <w:sz w:val="22"/>
+        </w:rPr>
+        <w:t xml:space="preserve">To keep production models accurate over time, set up </w:t>
+      </w:r>
+      <w:r>
+        <w:rPr>
+          <w:b/>
+          <w:i w:val="0"/>
+          <w:sz w:val="22"/>
+        </w:rPr>
+        <w:t>model monitoring</w:t>
+      </w:r>
+      <w:r>
+        <w:rPr>
+          <w:b w:val="0"/>
+          <w:i w:val="0"/>
+          <w:sz w:val="22"/>
+        </w:rPr>
+        <w:t xml:space="preserve">, </w:t>
+      </w:r>
+      <w:r>
+        <w:rPr>
+          <w:b/>
+          <w:i w:val="0"/>
+          <w:sz w:val="22"/>
+        </w:rPr>
+        <w:t>drift detection</w:t>
+      </w:r>
+      <w:r>
+        <w:rPr>
+          <w:b w:val="0"/>
+          <w:i w:val="0"/>
+          <w:sz w:val="22"/>
+        </w:rPr>
+        <w:t xml:space="preserve">, and automated retraining pipelines, sustaining </w:t>
+      </w:r>
+      <w:r>
+        <w:rPr>
+          <w:b/>
+          <w:i w:val="0"/>
+          <w:sz w:val="22"/>
+        </w:rPr>
+        <w:t>95%+ accuracy</w:t>
+      </w:r>
+      <w:r>
+        <w:rPr>
+          <w:b w:val="0"/>
+          <w:i w:val="0"/>
+          <w:sz w:val="22"/>
+        </w:rPr>
+        <w:t xml:space="preserve"> for </w:t>
+      </w:r>
+      <w:r>
+        <w:rPr>
+          <w:b/>
+          <w:i w:val="0"/>
+          <w:sz w:val="22"/>
+        </w:rPr>
+        <w:t>12 months</w:t>
+      </w:r>
+      <w:r>
+        <w:rPr>
+          <w:b w:val="0"/>
+          <w:i w:val="0"/>
+          <w:sz w:val="22"/>
+        </w:rPr>
+        <w:t xml:space="preserve"> across </w:t>
+      </w:r>
+      <w:r>
+        <w:rPr>
+          <w:b/>
+          <w:i w:val="0"/>
+          <w:sz w:val="22"/>
+        </w:rPr>
+        <w:t>200+ end users</w:t>
       </w:r>
       <w:r>
         <w:rPr>

</xml_diff>